<commit_message>
docs: add IAR banner to cover page and update semester to 5th sem (B.Sc. AI & Data Science)
</commit_message>
<xml_diff>
--- a/Deep_Koshiya_ProjectReport.docx
+++ b/Deep_Koshiya_ProjectReport.docx
@@ -17,18 +17,58 @@
             <w:tcW w:type="dxa" w:w="9360"/>
             <w:shd w:fill="FFFFFF"/>
             <w:tcMar>
-              <w:top w:w="140" w:type="dxa"/>
-              <w:bottom w:w="140" w:type="dxa"/>
-              <w:left w:w="180" w:type="dxa"/>
-              <w:right w:w="180" w:type="dxa"/>
+              <w:top w:w="100" w:type="dxa"/>
+              <w:bottom w:w="100" w:type="dxa"/>
+              <w:left w:w="140" w:type="dxa"/>
+              <w:right w:w="140" w:type="dxa"/>
             </w:tcMar>
             <w:tcBorders>
-              <w:top w:val="double" w:sz="18" w:space="0" w:color="1E1B4B"/>
-              <w:left w:val="double" w:sz="18" w:space="0" w:color="1E1B4B"/>
-              <w:bottom w:val="double" w:sz="18" w:space="0" w:color="1E1B4B"/>
-              <w:right w:val="double" w:sz="18" w:space="0" w:color="1E1B4B"/>
+              <w:top w:val="double" w:sz="18" w:space="0" w:color="7A003C"/>
+              <w:left w:val="double" w:sz="18" w:space="0" w:color="7A003C"/>
+              <w:bottom w:val="double" w:sz="18" w:space="0" w:color="7A003C"/>
+              <w:right w:val="double" w:sz="18" w:space="0" w:color="7A003C"/>
             </w:tcBorders>
           </w:tcPr>
+          <w:p>
+            <w:pPr>
+              <w:spacing w:after="160"/>
+              <w:jc w:val="center"/>
+            </w:pPr>
+            <w:r>
+              <w:drawing>
+                <wp:inline xmlns:a="http://schemas.openxmlformats.org/drawingml/2006/main" xmlns:pic="http://schemas.openxmlformats.org/drawingml/2006/picture">
+                  <wp:extent cx="4937760" cy="860581"/>
+                  <wp:docPr id="1" name="Picture 1"/>
+                  <wp:cNvGraphicFramePr>
+                    <a:graphicFrameLocks noChangeAspect="1"/>
+                  </wp:cNvGraphicFramePr>
+                  <a:graphic>
+                    <a:graphicData uri="http://schemas.openxmlformats.org/drawingml/2006/picture">
+                      <pic:pic>
+                        <pic:nvPicPr>
+                          <pic:cNvPr id="0" name="iar_banner_hd.png"/>
+                          <pic:cNvPicPr/>
+                        </pic:nvPicPr>
+                        <pic:blipFill>
+                          <a:blip r:embed="rId9"/>
+                          <a:stretch>
+                            <a:fillRect/>
+                          </a:stretch>
+                        </pic:blipFill>
+                        <pic:spPr>
+                          <a:xfrm>
+                            <a:off x="0" y="0"/>
+                            <a:ext cx="4937760" cy="860581"/>
+                          </a:xfrm>
+                          <a:prstGeom prst="rect"/>
+                        </pic:spPr>
+                      </pic:pic>
+                    </a:graphicData>
+                  </a:graphic>
+                </wp:inline>
+              </w:drawing>
+            </w:r>
+          </w:p>
           <w:p>
             <w:pPr>
               <w:spacing w:after="40"/>
@@ -38,46 +78,15 @@
               <w:rPr>
                 <w:rFonts w:ascii="Times New Roman" w:hAnsi="Times New Roman"/>
                 <w:b/>
-                <w:color w:val="1E1B4B"/>
-                <w:sz w:val="26"/>
+                <w:color w:val="7A003C"/>
+                <w:sz w:val="24"/>
               </w:rPr>
               <w:t>DEPARTMENT OF ARTIFICIAL INTELLIGENCE &amp; DATA SCIENCE</w:t>
             </w:r>
           </w:p>
           <w:p>
             <w:pPr>
-              <w:spacing w:after="320"/>
-              <w:jc w:val="center"/>
-            </w:pPr>
-            <w:r>
-              <w:rPr>
-                <w:rFonts w:ascii="Times New Roman" w:hAnsi="Times New Roman"/>
-                <w:b/>
-                <w:color w:val="2563EB"/>
-                <w:sz w:val="22"/>
-              </w:rPr>
-              <w:t>B.Sc. in Artificial Intelligence &amp; Data Science | Semester VII</w:t>
-              <w:br/>
-              <w:t>Academic Year: 2026 – 2027</w:t>
-            </w:r>
-          </w:p>
-          <w:p>
-            <w:pPr>
-              <w:spacing w:after="280"/>
-              <w:jc w:val="center"/>
-            </w:pPr>
-            <w:r>
-              <w:rPr>
-                <w:rFonts w:ascii="Times New Roman" w:hAnsi="Times New Roman"/>
-                <w:color w:val="475569"/>
-                <w:sz w:val="20"/>
-              </w:rPr>
-              <w:t>━━━━━━━━━━━━━━━━━━━━━━━━━━━━━━━━━━━━━━━━━</w:t>
-            </w:r>
-          </w:p>
-          <w:p>
-            <w:pPr>
-              <w:spacing w:after="160"/>
+              <w:spacing w:after="240"/>
               <w:jc w:val="center"/>
             </w:pPr>
             <w:r>
@@ -85,7 +94,38 @@
                 <w:rFonts w:ascii="Times New Roman" w:hAnsi="Times New Roman"/>
                 <w:b/>
                 <w:color w:val="1E1B4B"/>
-                <w:sz w:val="36"/>
+                <w:sz w:val="21"/>
+              </w:rPr>
+              <w:t>B.Sc. in Artificial Intelligence &amp; Data Science | Semester V (5th Sem)</w:t>
+              <w:br/>
+              <w:t>Academic Session: 2026 – 2027</w:t>
+            </w:r>
+          </w:p>
+          <w:p>
+            <w:pPr>
+              <w:spacing w:after="200"/>
+              <w:jc w:val="center"/>
+            </w:pPr>
+            <w:r>
+              <w:rPr>
+                <w:rFonts w:ascii="Times New Roman" w:hAnsi="Times New Roman"/>
+                <w:color w:val="475569"/>
+                <w:sz w:val="19"/>
+              </w:rPr>
+              <w:t>━━━━━━━━━━━━━━━━━━━━━━━━━━━━━━━━━━━━━━━━━</w:t>
+            </w:r>
+          </w:p>
+          <w:p>
+            <w:pPr>
+              <w:spacing w:after="120"/>
+              <w:jc w:val="center"/>
+            </w:pPr>
+            <w:r>
+              <w:rPr>
+                <w:rFonts w:ascii="Times New Roman" w:hAnsi="Times New Roman"/>
+                <w:b/>
+                <w:color w:val="1E1B4B"/>
+                <w:sz w:val="34"/>
               </w:rPr>
               <w:t>E-COMMERCE CUSTOMER LIFECYCLE &amp;</w:t>
               <w:br/>
@@ -94,7 +134,7 @@
           </w:p>
           <w:p>
             <w:pPr>
-              <w:spacing w:after="320"/>
+              <w:spacing w:after="240"/>
               <w:jc w:val="center"/>
             </w:pPr>
             <w:r>
@@ -102,7 +142,7 @@
                 <w:rFonts w:ascii="Times New Roman" w:hAnsi="Times New Roman"/>
                 <w:i/>
                 <w:color w:val="0F172A"/>
-                <w:sz w:val="23"/>
+                <w:sz w:val="22"/>
               </w:rPr>
               <w:t>An Applied Machine Learning &amp; Analytics Engineering System</w:t>
               <w:br/>
@@ -125,10 +165,10 @@
                   <w:tcW w:type="dxa" w:w="4680"/>
                   <w:shd w:fill="F8FAFC"/>
                   <w:tcMar>
-                    <w:top w:w="45" w:type="dxa"/>
-                    <w:bottom w:w="45" w:type="dxa"/>
-                    <w:left w:w="90" w:type="dxa"/>
-                    <w:right w:w="90" w:type="dxa"/>
+                    <w:top w:w="35" w:type="dxa"/>
+                    <w:bottom w:w="35" w:type="dxa"/>
+                    <w:left w:w="70" w:type="dxa"/>
+                    <w:right w:w="70" w:type="dxa"/>
                   </w:tcMar>
                 </w:tcPr>
                 <w:p>
@@ -136,7 +176,7 @@
                     <w:rPr>
                       <w:rFonts w:ascii="Times New Roman" w:hAnsi="Times New Roman"/>
                       <w:b/>
-                      <w:sz w:val="19"/>
+                      <w:sz w:val="18"/>
                     </w:rPr>
                     <w:t>Assessment Milestone:</w:t>
                   </w:r>
@@ -147,17 +187,17 @@
                   <w:tcW w:type="dxa" w:w="4680"/>
                   <w:shd w:fill="FFFFFF"/>
                   <w:tcMar>
-                    <w:top w:w="45" w:type="dxa"/>
-                    <w:bottom w:w="45" w:type="dxa"/>
-                    <w:left w:w="90" w:type="dxa"/>
-                    <w:right w:w="90" w:type="dxa"/>
+                    <w:top w:w="35" w:type="dxa"/>
+                    <w:bottom w:w="35" w:type="dxa"/>
+                    <w:left w:w="70" w:type="dxa"/>
+                    <w:right w:w="70" w:type="dxa"/>
                   </w:tcMar>
                 </w:tcPr>
                 <w:p>
                   <w:r>
                     <w:rPr>
                       <w:rFonts w:ascii="Times New Roman" w:hAnsi="Times New Roman"/>
-                      <w:sz w:val="19"/>
+                      <w:sz w:val="18"/>
                     </w:rPr>
                     <w:t>FIRST PROGRESS WORK EVALUATION</w:t>
                   </w:r>
@@ -170,10 +210,10 @@
                   <w:tcW w:type="dxa" w:w="4680"/>
                   <w:shd w:fill="F8FAFC"/>
                   <w:tcMar>
-                    <w:top w:w="45" w:type="dxa"/>
-                    <w:bottom w:w="45" w:type="dxa"/>
-                    <w:left w:w="90" w:type="dxa"/>
-                    <w:right w:w="90" w:type="dxa"/>
+                    <w:top w:w="35" w:type="dxa"/>
+                    <w:bottom w:w="35" w:type="dxa"/>
+                    <w:left w:w="70" w:type="dxa"/>
+                    <w:right w:w="70" w:type="dxa"/>
                   </w:tcMar>
                 </w:tcPr>
                 <w:p>
@@ -181,7 +221,7 @@
                     <w:rPr>
                       <w:rFonts w:ascii="Times New Roman" w:hAnsi="Times New Roman"/>
                       <w:b/>
-                      <w:sz w:val="19"/>
+                      <w:sz w:val="18"/>
                     </w:rPr>
                     <w:t>Scheduled Submission Date:</w:t>
                   </w:r>
@@ -192,17 +232,17 @@
                   <w:tcW w:type="dxa" w:w="4680"/>
                   <w:shd w:fill="FFFFFF"/>
                   <w:tcMar>
-                    <w:top w:w="45" w:type="dxa"/>
-                    <w:bottom w:w="45" w:type="dxa"/>
-                    <w:left w:w="90" w:type="dxa"/>
-                    <w:right w:w="90" w:type="dxa"/>
+                    <w:top w:w="35" w:type="dxa"/>
+                    <w:bottom w:w="35" w:type="dxa"/>
+                    <w:left w:w="70" w:type="dxa"/>
+                    <w:right w:w="70" w:type="dxa"/>
                   </w:tcMar>
                 </w:tcPr>
                 <w:p>
                   <w:r>
                     <w:rPr>
                       <w:rFonts w:ascii="Times New Roman" w:hAnsi="Times New Roman"/>
-                      <w:sz w:val="19"/>
+                      <w:sz w:val="18"/>
                     </w:rPr>
                     <w:t>24th September 2026 (10:00 AM – 5:00 PM)</w:t>
                   </w:r>
@@ -215,10 +255,10 @@
                   <w:tcW w:type="dxa" w:w="4680"/>
                   <w:shd w:fill="F8FAFC"/>
                   <w:tcMar>
-                    <w:top w:w="45" w:type="dxa"/>
-                    <w:bottom w:w="45" w:type="dxa"/>
-                    <w:left w:w="90" w:type="dxa"/>
-                    <w:right w:w="90" w:type="dxa"/>
+                    <w:top w:w="35" w:type="dxa"/>
+                    <w:bottom w:w="35" w:type="dxa"/>
+                    <w:left w:w="70" w:type="dxa"/>
+                    <w:right w:w="70" w:type="dxa"/>
                   </w:tcMar>
                 </w:tcPr>
                 <w:p>
@@ -226,7 +266,7 @@
                     <w:rPr>
                       <w:rFonts w:ascii="Times New Roman" w:hAnsi="Times New Roman"/>
                       <w:b/>
-                      <w:sz w:val="19"/>
+                      <w:sz w:val="18"/>
                     </w:rPr>
                     <w:t>Target Work Completed:</w:t>
                   </w:r>
@@ -237,17 +277,17 @@
                   <w:tcW w:type="dxa" w:w="4680"/>
                   <w:shd w:fill="FFFFFF"/>
                   <w:tcMar>
-                    <w:top w:w="45" w:type="dxa"/>
-                    <w:bottom w:w="45" w:type="dxa"/>
-                    <w:left w:w="90" w:type="dxa"/>
-                    <w:right w:w="90" w:type="dxa"/>
+                    <w:top w:w="35" w:type="dxa"/>
+                    <w:bottom w:w="35" w:type="dxa"/>
+                    <w:left w:w="70" w:type="dxa"/>
+                    <w:right w:w="70" w:type="dxa"/>
                   </w:tcMar>
                 </w:tcPr>
                 <w:p>
                   <w:r>
                     <w:rPr>
                       <w:rFonts w:ascii="Times New Roman" w:hAnsi="Times New Roman"/>
-                      <w:sz w:val="19"/>
+                      <w:sz w:val="18"/>
                     </w:rPr>
                     <w:t>Sections 1.1, 1.2, 1.3, 2.1, and 2.2 (DFD &amp; Use Case)</w:t>
                   </w:r>
@@ -260,10 +300,10 @@
                   <w:tcW w:type="dxa" w:w="4680"/>
                   <w:shd w:fill="F8FAFC"/>
                   <w:tcMar>
-                    <w:top w:w="45" w:type="dxa"/>
-                    <w:bottom w:w="45" w:type="dxa"/>
-                    <w:left w:w="90" w:type="dxa"/>
-                    <w:right w:w="90" w:type="dxa"/>
+                    <w:top w:w="35" w:type="dxa"/>
+                    <w:bottom w:w="35" w:type="dxa"/>
+                    <w:left w:w="70" w:type="dxa"/>
+                    <w:right w:w="70" w:type="dxa"/>
                   </w:tcMar>
                 </w:tcPr>
                 <w:p>
@@ -271,7 +311,7 @@
                     <w:rPr>
                       <w:rFonts w:ascii="Times New Roman" w:hAnsi="Times New Roman"/>
                       <w:b/>
-                      <w:sz w:val="19"/>
+                      <w:sz w:val="18"/>
                     </w:rPr>
                     <w:t>Course &amp; Project Code:</w:t>
                   </w:r>
@@ -282,17 +322,17 @@
                   <w:tcW w:type="dxa" w:w="4680"/>
                   <w:shd w:fill="FFFFFF"/>
                   <w:tcMar>
-                    <w:top w:w="45" w:type="dxa"/>
-                    <w:bottom w:w="45" w:type="dxa"/>
-                    <w:left w:w="90" w:type="dxa"/>
-                    <w:right w:w="90" w:type="dxa"/>
+                    <w:top w:w="35" w:type="dxa"/>
+                    <w:bottom w:w="35" w:type="dxa"/>
+                    <w:left w:w="70" w:type="dxa"/>
+                    <w:right w:w="70" w:type="dxa"/>
                   </w:tcMar>
                 </w:tcPr>
                 <w:p>
                   <w:r>
                     <w:rPr>
                       <w:rFonts w:ascii="Times New Roman" w:hAnsi="Times New Roman"/>
-                      <w:sz w:val="19"/>
+                      <w:sz w:val="18"/>
                     </w:rPr>
                     <w:t>Project - 1 (CE-502 / PRJ-701)</w:t>
                   </w:r>
@@ -305,10 +345,10 @@
                   <w:tcW w:type="dxa" w:w="4680"/>
                   <w:shd w:fill="F8FAFC"/>
                   <w:tcMar>
-                    <w:top w:w="45" w:type="dxa"/>
-                    <w:bottom w:w="45" w:type="dxa"/>
-                    <w:left w:w="90" w:type="dxa"/>
-                    <w:right w:w="90" w:type="dxa"/>
+                    <w:top w:w="35" w:type="dxa"/>
+                    <w:bottom w:w="35" w:type="dxa"/>
+                    <w:left w:w="70" w:type="dxa"/>
+                    <w:right w:w="70" w:type="dxa"/>
                   </w:tcMar>
                 </w:tcPr>
                 <w:p>
@@ -316,7 +356,7 @@
                     <w:rPr>
                       <w:rFonts w:ascii="Times New Roman" w:hAnsi="Times New Roman"/>
                       <w:b/>
-                      <w:sz w:val="19"/>
+                      <w:sz w:val="18"/>
                     </w:rPr>
                     <w:t>Allotted Assessment Marks:</w:t>
                   </w:r>
@@ -327,17 +367,17 @@
                   <w:tcW w:type="dxa" w:w="4680"/>
                   <w:shd w:fill="FFFFFF"/>
                   <w:tcMar>
-                    <w:top w:w="45" w:type="dxa"/>
-                    <w:bottom w:w="45" w:type="dxa"/>
-                    <w:left w:w="90" w:type="dxa"/>
-                    <w:right w:w="90" w:type="dxa"/>
+                    <w:top w:w="35" w:type="dxa"/>
+                    <w:bottom w:w="35" w:type="dxa"/>
+                    <w:left w:w="70" w:type="dxa"/>
+                    <w:right w:w="70" w:type="dxa"/>
                   </w:tcMar>
                 </w:tcPr>
                 <w:p>
                   <w:r>
                     <w:rPr>
                       <w:rFonts w:ascii="Times New Roman" w:hAnsi="Times New Roman"/>
-                      <w:sz w:val="19"/>
+                      <w:sz w:val="18"/>
                     </w:rPr>
                     <w:t>10 Marks (First Progress Work)</w:t>
                   </w:r>
@@ -348,7 +388,7 @@
           <w:p/>
           <w:p>
             <w:pPr>
-              <w:spacing w:after="360"/>
+              <w:spacing w:after="240"/>
             </w:pPr>
           </w:p>
           <w:tbl>
@@ -367,10 +407,10 @@
                   <w:tcW w:type="dxa" w:w="4680"/>
                   <w:shd w:fill="F1F5F9"/>
                   <w:tcMar>
-                    <w:top w:w="60" w:type="dxa"/>
-                    <w:bottom w:w="60" w:type="dxa"/>
-                    <w:left w:w="80" w:type="dxa"/>
-                    <w:right w:w="80" w:type="dxa"/>
+                    <w:top w:w="45" w:type="dxa"/>
+                    <w:bottom w:w="45" w:type="dxa"/>
+                    <w:left w:w="60" w:type="dxa"/>
+                    <w:right w:w="60" w:type="dxa"/>
                   </w:tcMar>
                 </w:tcPr>
                 <w:p>
@@ -380,7 +420,7 @@
                   <w:r>
                     <w:rPr>
                       <w:rFonts w:ascii="Times New Roman" w:hAnsi="Times New Roman"/>
-                      <w:sz w:val="19"/>
+                      <w:sz w:val="18"/>
                     </w:rPr>
                     <w:t>SUBMITTED BY:</w:t>
                     <w:br/>
@@ -388,7 +428,7 @@
                     <w:br/>
                     <w:t>B.Sc. AI and Data Science</w:t>
                     <w:br/>
-                    <w:t>Semester: VII</w:t>
+                    <w:t>Semester: V (5th Semester)</w:t>
                   </w:r>
                 </w:p>
               </w:tc>
@@ -397,10 +437,10 @@
                   <w:tcW w:type="dxa" w:w="4680"/>
                   <w:shd w:fill="F1F5F9"/>
                   <w:tcMar>
-                    <w:top w:w="60" w:type="dxa"/>
-                    <w:bottom w:w="60" w:type="dxa"/>
-                    <w:left w:w="80" w:type="dxa"/>
-                    <w:right w:w="80" w:type="dxa"/>
+                    <w:top w:w="45" w:type="dxa"/>
+                    <w:bottom w:w="45" w:type="dxa"/>
+                    <w:left w:w="60" w:type="dxa"/>
+                    <w:right w:w="60" w:type="dxa"/>
                   </w:tcMar>
                 </w:tcPr>
                 <w:p>
@@ -410,7 +450,7 @@
                   <w:r>
                     <w:rPr>
                       <w:rFonts w:ascii="Times New Roman" w:hAnsi="Times New Roman"/>
-                      <w:sz w:val="19"/>
+                      <w:sz w:val="18"/>
                     </w:rPr>
                     <w:t>SUPERVISED &amp; VERIFIED BY:</w:t>
                     <w:br/>
@@ -418,7 +458,7 @@
                     <w:br/>
                     <w:t>Department of AI &amp; Data Science</w:t>
                     <w:br/>
-                    <w:t>Evaluation &amp; Signature Stamp</w:t>
+                    <w:t>Institute of Advanced Research (IAR)</w:t>
                   </w:r>
                 </w:p>
               </w:tc>
@@ -429,10 +469,10 @@
                   <w:tcW w:type="dxa" w:w="4680"/>
                   <w:shd w:fill="FFFFFF"/>
                   <w:tcMar>
-                    <w:top w:w="50" w:type="dxa"/>
-                    <w:bottom w:w="50" w:type="dxa"/>
-                    <w:left w:w="80" w:type="dxa"/>
-                    <w:right w:w="80" w:type="dxa"/>
+                    <w:top w:w="40" w:type="dxa"/>
+                    <w:bottom w:w="40" w:type="dxa"/>
+                    <w:left w:w="60" w:type="dxa"/>
+                    <w:right w:w="60" w:type="dxa"/>
                   </w:tcMar>
                 </w:tcPr>
                 <w:p>
@@ -442,7 +482,7 @@
                   <w:r>
                     <w:rPr>
                       <w:rFonts w:ascii="Times New Roman" w:hAnsi="Times New Roman"/>
-                      <w:sz w:val="18"/>
+                      <w:sz w:val="17"/>
                     </w:rPr>
                     <w:t>_________________________</w:t>
                     <w:br/>
@@ -455,10 +495,10 @@
                   <w:tcW w:type="dxa" w:w="4680"/>
                   <w:shd w:fill="FFFFFF"/>
                   <w:tcMar>
-                    <w:top w:w="50" w:type="dxa"/>
-                    <w:bottom w:w="50" w:type="dxa"/>
-                    <w:left w:w="80" w:type="dxa"/>
-                    <w:right w:w="80" w:type="dxa"/>
+                    <w:top w:w="40" w:type="dxa"/>
+                    <w:bottom w:w="40" w:type="dxa"/>
+                    <w:left w:w="60" w:type="dxa"/>
+                    <w:right w:w="60" w:type="dxa"/>
                   </w:tcMar>
                 </w:tcPr>
                 <w:p>
@@ -468,7 +508,7 @@
                   <w:r>
                     <w:rPr>
                       <w:rFonts w:ascii="Times New Roman" w:hAnsi="Times New Roman"/>
-                      <w:sz w:val="18"/>
+                      <w:sz w:val="17"/>
                     </w:rPr>
                     <w:t>_________________________</w:t>
                     <w:br/>
@@ -530,7 +570,7 @@
           <w:color w:val="0F172A"/>
           <w:sz w:val="22"/>
         </w:rPr>
-        <w:t>I express my sincere gratitude to my assigned project supervisor and the esteemed faculty members of the Department of Artificial Intelligence &amp; Data Science for their invaluable guidance, encouragement, and insightful feedback throughout the problem identification and system design phases of this project.</w:t>
+        <w:t>I express my sincere gratitude to my assigned project supervisor and the esteemed faculty members of the Department of Artificial Intelligence &amp; Data Science at the Institute of Advanced Research (IAR) for their invaluable guidance, encouragement, and insightful feedback throughout the problem identification and system design phases of this project.</w:t>
       </w:r>
     </w:p>
     <w:p>
@@ -545,7 +585,7 @@
           <w:color w:val="0F172A"/>
           <w:sz w:val="22"/>
         </w:rPr>
-        <w:t>I also thank the Project Coordinator and the Head of the School for facilitating the computational lab environment and resources necessary to execute Project-1 (PRJ-701) in accordance with the prescribed university schedule.</w:t>
+        <w:t>I also thank the Project Coordinator and the Head of the School for facilitating the computational lab environment and resources necessary to execute Project-1 (PRJ-701 / CE-502) in accordance with the prescribed university schedule.</w:t>
       </w:r>
     </w:p>
     <w:p>
@@ -575,7 +615,7 @@
           <w:color w:val="0F172A"/>
           <w:sz w:val="22"/>
         </w:rPr>
-        <w:t>Deep Koshiya | B.Sc. AI and Data Science (Sem VII) | Date: 24th September 2026</w:t>
+        <w:t>Deep Koshiya | B.Sc. AI and Data Science (Semester V) | Date: 24th September 2026</w:t>
       </w:r>
     </w:p>
     <w:p>
@@ -636,7 +676,7 @@
           <w:color w:val="0F172A"/>
           <w:sz w:val="22"/>
         </w:rPr>
-        <w:t>This First Progress Work report documents the system foundation and software engineering design for the 24/09/2026 milestone. It presents complete Level-0, Level-1, and Level-2 Data Flow Diagrams (DFDs) alongside a comprehensive Use Case Model and specification matrix, fulfilling all requirements for the first 10-mark evaluation.</w:t>
+        <w:t>This First Progress Work report documents the system foundation and software engineering design for the 24/09/2026 milestone at Institute of Advanced Research (IAR). It presents complete Level-0, Level-1, and Level-2 Data Flow Diagrams (DFDs) alongside a comprehensive Use Case Model and specification matrix, fulfilling all requirements for the first 10-mark evaluation.</w:t>
       </w:r>
     </w:p>
     <w:p>
@@ -687,7 +727,7 @@
           <w:color w:val="0F172A"/>
           <w:sz w:val="22"/>
         </w:rPr>
-        <w:t>(Structured strictly according to Syllabus Guidelines for B.Sc. AI and Data Science SEM VII)</w:t>
+        <w:t>(Structured strictly according to Syllabus Guidelines for B.Sc. AI and Data Science SEM V)</w:t>
       </w:r>
     </w:p>
     <w:tbl>
@@ -705,7 +745,7 @@
         <w:tc>
           <w:tcPr>
             <w:tcW w:type="dxa" w:w="3120"/>
-            <w:shd w:fill="0F172A"/>
+            <w:shd w:fill="7A003C"/>
           </w:tcPr>
           <w:p>
             <w:r>
@@ -722,7 +762,7 @@
         <w:tc>
           <w:tcPr>
             <w:tcW w:type="dxa" w:w="3120"/>
-            <w:shd w:fill="0F172A"/>
+            <w:shd w:fill="7A003C"/>
           </w:tcPr>
           <w:p>
             <w:r>
@@ -739,7 +779,7 @@
         <w:tc>
           <w:tcPr>
             <w:tcW w:type="dxa" w:w="3120"/>
-            <w:shd w:fill="0F172A"/>
+            <w:shd w:fill="7A003C"/>
           </w:tcPr>
           <w:p>
             <w:r>
@@ -2608,7 +2648,7 @@
         <w:tc>
           <w:tcPr>
             <w:tcW w:type="dxa" w:w="3120"/>
-            <w:shd w:fill="0F172A"/>
+            <w:shd w:fill="7A003C"/>
           </w:tcPr>
           <w:p>
             <w:r>
@@ -2625,7 +2665,7 @@
         <w:tc>
           <w:tcPr>
             <w:tcW w:type="dxa" w:w="3120"/>
-            <w:shd w:fill="0F172A"/>
+            <w:shd w:fill="7A003C"/>
           </w:tcPr>
           <w:p>
             <w:r>
@@ -2642,7 +2682,7 @@
         <w:tc>
           <w:tcPr>
             <w:tcW w:type="dxa" w:w="3120"/>
-            <w:shd w:fill="0F172A"/>
+            <w:shd w:fill="7A003C"/>
           </w:tcPr>
           <w:p>
             <w:r>
@@ -3328,7 +3368,7 @@
         <w:tc>
           <w:tcPr>
             <w:tcW w:type="dxa" w:w="3120"/>
-            <w:shd w:fill="0F172A"/>
+            <w:shd w:fill="7A003C"/>
           </w:tcPr>
           <w:p>
             <w:r>
@@ -3345,7 +3385,7 @@
         <w:tc>
           <w:tcPr>
             <w:tcW w:type="dxa" w:w="3120"/>
-            <w:shd w:fill="0F172A"/>
+            <w:shd w:fill="7A003C"/>
           </w:tcPr>
           <w:p>
             <w:r>
@@ -3362,7 +3402,7 @@
         <w:tc>
           <w:tcPr>
             <w:tcW w:type="dxa" w:w="3120"/>
-            <w:shd w:fill="0F172A"/>
+            <w:shd w:fill="7A003C"/>
           </w:tcPr>
           <w:p>
             <w:r>
@@ -3830,7 +3870,7 @@
         <w:drawing>
           <wp:inline xmlns:a="http://schemas.openxmlformats.org/drawingml/2006/main" xmlns:pic="http://schemas.openxmlformats.org/drawingml/2006/picture">
             <wp:extent cx="4937760" cy="2468880"/>
-            <wp:docPr id="1" name="Picture 1"/>
+            <wp:docPr id="2" name="Picture 2"/>
             <wp:cNvGraphicFramePr>
               <a:graphicFrameLocks noChangeAspect="1"/>
             </wp:cNvGraphicFramePr>
@@ -3842,7 +3882,7 @@
                     <pic:cNvPicPr/>
                   </pic:nvPicPr>
                   <pic:blipFill>
-                    <a:blip r:embed="rId9"/>
+                    <a:blip r:embed="rId10"/>
                     <a:stretch>
                       <a:fillRect/>
                     </a:stretch>
@@ -4052,7 +4092,7 @@
         <w:drawing>
           <wp:inline xmlns:a="http://schemas.openxmlformats.org/drawingml/2006/main" xmlns:pic="http://schemas.openxmlformats.org/drawingml/2006/picture">
             <wp:extent cx="4937760" cy="2468880"/>
-            <wp:docPr id="2" name="Picture 2"/>
+            <wp:docPr id="3" name="Picture 3"/>
             <wp:cNvGraphicFramePr>
               <a:graphicFrameLocks noChangeAspect="1"/>
             </wp:cNvGraphicFramePr>
@@ -4064,7 +4104,7 @@
                     <pic:cNvPicPr/>
                   </pic:nvPicPr>
                   <pic:blipFill>
-                    <a:blip r:embed="rId10"/>
+                    <a:blip r:embed="rId11"/>
                     <a:stretch>
                       <a:fillRect/>
                     </a:stretch>
@@ -4202,7 +4242,7 @@
         <w:drawing>
           <wp:inline xmlns:a="http://schemas.openxmlformats.org/drawingml/2006/main" xmlns:pic="http://schemas.openxmlformats.org/drawingml/2006/picture">
             <wp:extent cx="4937760" cy="2057400"/>
-            <wp:docPr id="3" name="Picture 3"/>
+            <wp:docPr id="4" name="Picture 4"/>
             <wp:cNvGraphicFramePr>
               <a:graphicFrameLocks noChangeAspect="1"/>
             </wp:cNvGraphicFramePr>
@@ -4214,7 +4254,7 @@
                     <pic:cNvPicPr/>
                   </pic:nvPicPr>
                   <pic:blipFill>
-                    <a:blip r:embed="rId11"/>
+                    <a:blip r:embed="rId12"/>
                     <a:stretch>
                       <a:fillRect/>
                     </a:stretch>
@@ -4304,7 +4344,7 @@
         <w:drawing>
           <wp:inline xmlns:a="http://schemas.openxmlformats.org/drawingml/2006/main" xmlns:pic="http://schemas.openxmlformats.org/drawingml/2006/picture">
             <wp:extent cx="3383280" cy="2199132"/>
-            <wp:docPr id="4" name="Picture 4"/>
+            <wp:docPr id="5" name="Picture 5"/>
             <wp:cNvGraphicFramePr>
               <a:graphicFrameLocks noChangeAspect="1"/>
             </wp:cNvGraphicFramePr>
@@ -4316,7 +4356,7 @@
                     <pic:cNvPicPr/>
                   </pic:nvPicPr>
                   <pic:blipFill>
-                    <a:blip r:embed="rId12"/>
+                    <a:blip r:embed="rId13"/>
                     <a:stretch>
                       <a:fillRect/>
                     </a:stretch>
@@ -4381,7 +4421,7 @@
         <w:tc>
           <w:tcPr>
             <w:tcW w:type="dxa" w:w="2340"/>
-            <w:shd w:fill="0F172A"/>
+            <w:shd w:fill="7A003C"/>
           </w:tcPr>
           <w:p>
             <w:r>
@@ -4398,7 +4438,7 @@
         <w:tc>
           <w:tcPr>
             <w:tcW w:type="dxa" w:w="2340"/>
-            <w:shd w:fill="0F172A"/>
+            <w:shd w:fill="7A003C"/>
           </w:tcPr>
           <w:p>
             <w:r>
@@ -4415,7 +4455,7 @@
         <w:tc>
           <w:tcPr>
             <w:tcW w:type="dxa" w:w="2340"/>
-            <w:shd w:fill="0F172A"/>
+            <w:shd w:fill="7A003C"/>
           </w:tcPr>
           <w:p>
             <w:r>
@@ -4432,7 +4472,7 @@
         <w:tc>
           <w:tcPr>
             <w:tcW w:type="dxa" w:w="2340"/>
-            <w:shd w:fill="0F172A"/>
+            <w:shd w:fill="7A003C"/>
           </w:tcPr>
           <w:p>
             <w:r>
@@ -4992,7 +5032,7 @@
           <w:color w:val="0F172A"/>
           <w:sz w:val="22"/>
         </w:rPr>
-        <w:t>This submission formally completes the First Progress Work milestone (10 Marks allotted) scheduled for 24/09/2026 for B.Sc. AI and Data Science. All required index sections (1.1, 1.2, 1.3, 2.1, and 2.2) have been fully developed and validated. The technical artifacts, UML models, and data pipelines are complete and ready for supervisor review.</w:t>
+        <w:t>This submission formally completes the First Progress Work milestone (10 Marks allotted) scheduled for 24/09/2026 for B.Sc. AI and Data Science (Semester V) at Institute of Advanced Research (IAR). All required index sections (1.1, 1.2, 1.3, 2.1, and 2.2) have been fully developed and validated. The technical artifacts, UML models, and data pipelines are complete and ready for supervisor review.</w:t>
       </w:r>
     </w:p>
     <w:p>
@@ -5027,7 +5067,7 @@
         <w:tc>
           <w:tcPr>
             <w:tcW w:type="dxa" w:w="1872"/>
-            <w:shd w:fill="0F172A"/>
+            <w:shd w:fill="7A003C"/>
           </w:tcPr>
           <w:p>
             <w:r>
@@ -5044,7 +5084,7 @@
         <w:tc>
           <w:tcPr>
             <w:tcW w:type="dxa" w:w="1872"/>
-            <w:shd w:fill="0F172A"/>
+            <w:shd w:fill="7A003C"/>
           </w:tcPr>
           <w:p>
             <w:r>
@@ -5061,7 +5101,7 @@
         <w:tc>
           <w:tcPr>
             <w:tcW w:type="dxa" w:w="1872"/>
-            <w:shd w:fill="0F172A"/>
+            <w:shd w:fill="7A003C"/>
           </w:tcPr>
           <w:p>
             <w:r>
@@ -5078,7 +5118,7 @@
         <w:tc>
           <w:tcPr>
             <w:tcW w:type="dxa" w:w="1872"/>
-            <w:shd w:fill="0F172A"/>
+            <w:shd w:fill="7A003C"/>
           </w:tcPr>
           <w:p>
             <w:r>
@@ -5095,7 +5135,7 @@
         <w:tc>
           <w:tcPr>
             <w:tcW w:type="dxa" w:w="1872"/>
-            <w:shd w:fill="0F172A"/>
+            <w:shd w:fill="7A003C"/>
           </w:tcPr>
           <w:p>
             <w:r>
@@ -5653,7 +5693,7 @@
     </w:tbl>
     <w:sectPr>
       <w:pgSz w:w="12240" w:h="15840"/>
-      <w:pgMar w:top="1224" w:right="1224" w:bottom="1224" w:left="1656" w:header="720" w:footer="720" w:gutter="0"/>
+      <w:pgMar w:top="1152" w:right="1224" w:bottom="1152" w:left="1656" w:header="720" w:footer="720" w:gutter="0"/>
       <w:cols w:space="720"/>
       <w:docGrid w:linePitch="360"/>
     </w:sectPr>

</xml_diff>

<commit_message>
docs: finalize exact 10-page report with IAR banner, no department name, Semester V
</commit_message>
<xml_diff>
--- a/Deep_Koshiya_ProjectReport.docx
+++ b/Deep_Koshiya_ProjectReport.docx
@@ -2,6 +2,141 @@
 <file path=word/document.xml><?xml version="1.0" encoding="utf-8"?>
 <w:document xmlns:wpc="http://schemas.microsoft.com/office/word/2010/wordprocessingCanvas" xmlns:mo="http://schemas.microsoft.com/office/mac/office/2008/main" xmlns:mc="http://schemas.openxmlformats.org/markup-compatibility/2006" xmlns:mv="urn:schemas-microsoft-com:mac:vml" xmlns:o="urn:schemas-microsoft-com:office:office" xmlns:r="http://schemas.openxmlformats.org/officeDocument/2006/relationships" xmlns:m="http://schemas.openxmlformats.org/officeDocument/2006/math" xmlns:v="urn:schemas-microsoft-com:vml" xmlns:wp14="http://schemas.microsoft.com/office/word/2010/wordprocessingDrawing" xmlns:wp="http://schemas.openxmlformats.org/drawingml/2006/wordprocessingDrawing" xmlns:w10="urn:schemas-microsoft-com:office:word" xmlns:w="http://schemas.openxmlformats.org/wordprocessingml/2006/main" xmlns:w14="http://schemas.microsoft.com/office/word/2010/wordml" xmlns:wpg="http://schemas.microsoft.com/office/word/2010/wordprocessingGroup" xmlns:wpi="http://schemas.microsoft.com/office/word/2010/wordprocessingInk" xmlns:wne="http://schemas.microsoft.com/office/word/2006/wordml" xmlns:wps="http://schemas.microsoft.com/office/word/2010/wordprocessingShape" mc:Ignorable="w14 wp14">
   <w:body>
+    <w:p>
+      <w:pPr>
+        <w:spacing w:after="200" w:before="0"/>
+        <w:jc w:val="center"/>
+      </w:pPr>
+      <w:r>
+        <w:drawing>
+          <wp:inline xmlns:a="http://schemas.openxmlformats.org/drawingml/2006/main" xmlns:pic="http://schemas.openxmlformats.org/drawingml/2006/picture">
+            <wp:extent cx="5120640" cy="892454"/>
+            <wp:docPr id="1" name="Picture 1"/>
+            <wp:cNvGraphicFramePr>
+              <a:graphicFrameLocks noChangeAspect="1"/>
+            </wp:cNvGraphicFramePr>
+            <a:graphic>
+              <a:graphicData uri="http://schemas.openxmlformats.org/drawingml/2006/picture">
+                <pic:pic>
+                  <pic:nvPicPr>
+                    <pic:cNvPr id="0" name="iar_banner_hd.png"/>
+                    <pic:cNvPicPr/>
+                  </pic:nvPicPr>
+                  <pic:blipFill>
+                    <a:blip r:embed="rId9"/>
+                    <a:stretch>
+                      <a:fillRect/>
+                    </a:stretch>
+                  </pic:blipFill>
+                  <pic:spPr>
+                    <a:xfrm>
+                      <a:off x="0" y="0"/>
+                      <a:ext cx="5120640" cy="892454"/>
+                    </a:xfrm>
+                    <a:prstGeom prst="rect"/>
+                  </pic:spPr>
+                </pic:pic>
+              </a:graphicData>
+            </a:graphic>
+          </wp:inline>
+        </w:drawing>
+      </w:r>
+    </w:p>
+    <w:p>
+      <w:pPr>
+        <w:spacing w:after="40"/>
+        <w:jc w:val="center"/>
+      </w:pPr>
+      <w:r>
+        <w:rPr>
+          <w:rFonts w:ascii="Times New Roman" w:hAnsi="Times New Roman"/>
+          <w:b/>
+          <w:color w:val="7A003C"/>
+          <w:sz w:val="28"/>
+        </w:rPr>
+        <w:t>INSTITUTE OF ADVANCED RESEARCH (IAR)</w:t>
+      </w:r>
+    </w:p>
+    <w:p>
+      <w:pPr>
+        <w:spacing w:after="80"/>
+        <w:jc w:val="center"/>
+      </w:pPr>
+      <w:r>
+        <w:rPr>
+          <w:rFonts w:ascii="Times New Roman" w:hAnsi="Times New Roman"/>
+          <w:i/>
+          <w:color w:val="475569"/>
+          <w:sz w:val="20"/>
+        </w:rPr>
+        <w:t>The University for Innovation | Gandhinagar, Gujarat</w:t>
+      </w:r>
+    </w:p>
+    <w:p>
+      <w:pPr>
+        <w:spacing w:after="280"/>
+        <w:jc w:val="center"/>
+      </w:pPr>
+      <w:r>
+        <w:rPr>
+          <w:rFonts w:ascii="Times New Roman" w:hAnsi="Times New Roman"/>
+          <w:b/>
+          <w:color w:val="1E1B4B"/>
+          <w:sz w:val="22"/>
+        </w:rPr>
+        <w:t>B.Sc. in Artificial Intelligence &amp; Data Science | Semester V (5th Sem)</w:t>
+        <w:br/>
+        <w:t>Academic Session: 2026 – 2027</w:t>
+      </w:r>
+    </w:p>
+    <w:p>
+      <w:pPr>
+        <w:spacing w:after="320"/>
+        <w:jc w:val="center"/>
+      </w:pPr>
+      <w:r>
+        <w:rPr>
+          <w:rFonts w:ascii="Times New Roman" w:hAnsi="Times New Roman"/>
+          <w:color w:val="7A003C"/>
+          <w:sz w:val="19"/>
+        </w:rPr>
+        <w:t>───────────────────────────────────────────────────</w:t>
+      </w:r>
+    </w:p>
+    <w:p>
+      <w:pPr>
+        <w:spacing w:after="120"/>
+        <w:jc w:val="center"/>
+      </w:pPr>
+      <w:r>
+        <w:rPr>
+          <w:rFonts w:ascii="Times New Roman" w:hAnsi="Times New Roman"/>
+          <w:b/>
+          <w:color w:val="1E1B4B"/>
+          <w:sz w:val="36"/>
+        </w:rPr>
+        <w:t>E-COMMERCE CUSTOMER LIFECYCLE &amp;</w:t>
+        <w:br/>
+        <w:t>RFM SEGMENTATION DASHBOARD</w:t>
+      </w:r>
+    </w:p>
+    <w:p>
+      <w:pPr>
+        <w:spacing w:after="360"/>
+        <w:jc w:val="center"/>
+      </w:pPr>
+      <w:r>
+        <w:rPr>
+          <w:rFonts w:ascii="Times New Roman" w:hAnsi="Times New Roman"/>
+          <w:i/>
+          <w:color w:val="0F172A"/>
+          <w:sz w:val="22"/>
+        </w:rPr>
+        <w:t>An Applied Machine Learning &amp; Analytics Engineering System</w:t>
+        <w:br/>
+        <w:t>for Commercial Retention &amp; Behavioral Cohort Optimization</w:t>
+      </w:r>
+    </w:p>
     <w:tbl>
       <w:tblPr>
         <w:tblW w:type="auto" w:w="0"/>
@@ -9,516 +144,364 @@
         <w:tblLook w:firstColumn="1" w:firstRow="1" w:lastColumn="0" w:lastRow="0" w:noHBand="0" w:noVBand="1" w:val="04A0"/>
       </w:tblPr>
       <w:tblGrid>
-        <w:gridCol w:w="9360"/>
+        <w:gridCol w:w="4680"/>
+        <w:gridCol w:w="4680"/>
       </w:tblGrid>
       <w:tr>
         <w:tc>
           <w:tcPr>
-            <w:tcW w:type="dxa" w:w="9360"/>
+            <w:tcW w:type="dxa" w:w="4680"/>
+            <w:shd w:fill="F8FAFC"/>
+            <w:tcMar>
+              <w:top w:w="35" w:type="dxa"/>
+              <w:bottom w:w="35" w:type="dxa"/>
+              <w:left w:w="70" w:type="dxa"/>
+              <w:right w:w="70" w:type="dxa"/>
+            </w:tcMar>
+          </w:tcPr>
+          <w:p>
+            <w:r>
+              <w:rPr>
+                <w:rFonts w:ascii="Times New Roman" w:hAnsi="Times New Roman"/>
+                <w:b/>
+                <w:sz w:val="18"/>
+              </w:rPr>
+              <w:t>Assessment Milestone:</w:t>
+            </w:r>
+          </w:p>
+        </w:tc>
+        <w:tc>
+          <w:tcPr>
+            <w:tcW w:type="dxa" w:w="4680"/>
             <w:shd w:fill="FFFFFF"/>
             <w:tcMar>
-              <w:top w:w="100" w:type="dxa"/>
-              <w:bottom w:w="100" w:type="dxa"/>
-              <w:left w:w="140" w:type="dxa"/>
-              <w:right w:w="140" w:type="dxa"/>
+              <w:top w:w="35" w:type="dxa"/>
+              <w:bottom w:w="35" w:type="dxa"/>
+              <w:left w:w="70" w:type="dxa"/>
+              <w:right w:w="70" w:type="dxa"/>
             </w:tcMar>
-            <w:tcBorders>
-              <w:top w:val="double" w:sz="18" w:space="0" w:color="7A003C"/>
-              <w:left w:val="double" w:sz="18" w:space="0" w:color="7A003C"/>
-              <w:bottom w:val="double" w:sz="18" w:space="0" w:color="7A003C"/>
-              <w:right w:val="double" w:sz="18" w:space="0" w:color="7A003C"/>
-            </w:tcBorders>
+          </w:tcPr>
+          <w:p>
+            <w:r>
+              <w:rPr>
+                <w:rFonts w:ascii="Times New Roman" w:hAnsi="Times New Roman"/>
+                <w:sz w:val="18"/>
+              </w:rPr>
+              <w:t>FIRST PROGRESS WORK EVALUATION</w:t>
+            </w:r>
+          </w:p>
+        </w:tc>
+      </w:tr>
+      <w:tr>
+        <w:tc>
+          <w:tcPr>
+            <w:tcW w:type="dxa" w:w="4680"/>
+            <w:shd w:fill="F8FAFC"/>
+            <w:tcMar>
+              <w:top w:w="35" w:type="dxa"/>
+              <w:bottom w:w="35" w:type="dxa"/>
+              <w:left w:w="70" w:type="dxa"/>
+              <w:right w:w="70" w:type="dxa"/>
+            </w:tcMar>
+          </w:tcPr>
+          <w:p>
+            <w:r>
+              <w:rPr>
+                <w:rFonts w:ascii="Times New Roman" w:hAnsi="Times New Roman"/>
+                <w:b/>
+                <w:sz w:val="18"/>
+              </w:rPr>
+              <w:t>Scheduled Submission Date:</w:t>
+            </w:r>
+          </w:p>
+        </w:tc>
+        <w:tc>
+          <w:tcPr>
+            <w:tcW w:type="dxa" w:w="4680"/>
+            <w:shd w:fill="FFFFFF"/>
+            <w:tcMar>
+              <w:top w:w="35" w:type="dxa"/>
+              <w:bottom w:w="35" w:type="dxa"/>
+              <w:left w:w="70" w:type="dxa"/>
+              <w:right w:w="70" w:type="dxa"/>
+            </w:tcMar>
+          </w:tcPr>
+          <w:p>
+            <w:r>
+              <w:rPr>
+                <w:rFonts w:ascii="Times New Roman" w:hAnsi="Times New Roman"/>
+                <w:sz w:val="18"/>
+              </w:rPr>
+              <w:t>24th September 2026 (Time: 10:00 AM to 5:00 PM)</w:t>
+            </w:r>
+          </w:p>
+        </w:tc>
+      </w:tr>
+      <w:tr>
+        <w:tc>
+          <w:tcPr>
+            <w:tcW w:type="dxa" w:w="4680"/>
+            <w:shd w:fill="F8FAFC"/>
+            <w:tcMar>
+              <w:top w:w="35" w:type="dxa"/>
+              <w:bottom w:w="35" w:type="dxa"/>
+              <w:left w:w="70" w:type="dxa"/>
+              <w:right w:w="70" w:type="dxa"/>
+            </w:tcMar>
+          </w:tcPr>
+          <w:p>
+            <w:r>
+              <w:rPr>
+                <w:rFonts w:ascii="Times New Roman" w:hAnsi="Times New Roman"/>
+                <w:b/>
+                <w:sz w:val="18"/>
+              </w:rPr>
+              <w:t>Curriculum Scope Completed:</w:t>
+            </w:r>
+          </w:p>
+        </w:tc>
+        <w:tc>
+          <w:tcPr>
+            <w:tcW w:type="dxa" w:w="4680"/>
+            <w:shd w:fill="FFFFFF"/>
+            <w:tcMar>
+              <w:top w:w="35" w:type="dxa"/>
+              <w:bottom w:w="35" w:type="dxa"/>
+              <w:left w:w="70" w:type="dxa"/>
+              <w:right w:w="70" w:type="dxa"/>
+            </w:tcMar>
+          </w:tcPr>
+          <w:p>
+            <w:r>
+              <w:rPr>
+                <w:rFonts w:ascii="Times New Roman" w:hAnsi="Times New Roman"/>
+                <w:sz w:val="18"/>
+              </w:rPr>
+              <w:t>Sections 1.1, 1.2, 1.3, 2.1, and 2.2 (DFD &amp; Use Case)</w:t>
+            </w:r>
+          </w:p>
+        </w:tc>
+      </w:tr>
+      <w:tr>
+        <w:tc>
+          <w:tcPr>
+            <w:tcW w:type="dxa" w:w="4680"/>
+            <w:shd w:fill="F8FAFC"/>
+            <w:tcMar>
+              <w:top w:w="35" w:type="dxa"/>
+              <w:bottom w:w="35" w:type="dxa"/>
+              <w:left w:w="70" w:type="dxa"/>
+              <w:right w:w="70" w:type="dxa"/>
+            </w:tcMar>
+          </w:tcPr>
+          <w:p>
+            <w:r>
+              <w:rPr>
+                <w:rFonts w:ascii="Times New Roman" w:hAnsi="Times New Roman"/>
+                <w:b/>
+                <w:sz w:val="18"/>
+              </w:rPr>
+              <w:t>Course &amp; Project Code:</w:t>
+            </w:r>
+          </w:p>
+        </w:tc>
+        <w:tc>
+          <w:tcPr>
+            <w:tcW w:type="dxa" w:w="4680"/>
+            <w:shd w:fill="FFFFFF"/>
+            <w:tcMar>
+              <w:top w:w="35" w:type="dxa"/>
+              <w:bottom w:w="35" w:type="dxa"/>
+              <w:left w:w="70" w:type="dxa"/>
+              <w:right w:w="70" w:type="dxa"/>
+            </w:tcMar>
+          </w:tcPr>
+          <w:p>
+            <w:r>
+              <w:rPr>
+                <w:rFonts w:ascii="Times New Roman" w:hAnsi="Times New Roman"/>
+                <w:sz w:val="18"/>
+              </w:rPr>
+              <w:t>Project - 1 (CE-502 / PRJ-701)</w:t>
+            </w:r>
+          </w:p>
+        </w:tc>
+      </w:tr>
+      <w:tr>
+        <w:tc>
+          <w:tcPr>
+            <w:tcW w:type="dxa" w:w="4680"/>
+            <w:shd w:fill="F8FAFC"/>
+            <w:tcMar>
+              <w:top w:w="35" w:type="dxa"/>
+              <w:bottom w:w="35" w:type="dxa"/>
+              <w:left w:w="70" w:type="dxa"/>
+              <w:right w:w="70" w:type="dxa"/>
+            </w:tcMar>
+          </w:tcPr>
+          <w:p>
+            <w:r>
+              <w:rPr>
+                <w:rFonts w:ascii="Times New Roman" w:hAnsi="Times New Roman"/>
+                <w:b/>
+                <w:sz w:val="18"/>
+              </w:rPr>
+              <w:t>Evaluation Marks Allotted:</w:t>
+            </w:r>
+          </w:p>
+        </w:tc>
+        <w:tc>
+          <w:tcPr>
+            <w:tcW w:type="dxa" w:w="4680"/>
+            <w:shd w:fill="FFFFFF"/>
+            <w:tcMar>
+              <w:top w:w="35" w:type="dxa"/>
+              <w:bottom w:w="35" w:type="dxa"/>
+              <w:left w:w="70" w:type="dxa"/>
+              <w:right w:w="70" w:type="dxa"/>
+            </w:tcMar>
+          </w:tcPr>
+          <w:p>
+            <w:r>
+              <w:rPr>
+                <w:rFonts w:ascii="Times New Roman" w:hAnsi="Times New Roman"/>
+                <w:sz w:val="18"/>
+              </w:rPr>
+              <w:t>10 Marks (First Progress Work Assessment)</w:t>
+            </w:r>
+          </w:p>
+        </w:tc>
+      </w:tr>
+    </w:tbl>
+    <w:p>
+      <w:pPr>
+        <w:spacing w:after="400"/>
+      </w:pPr>
+    </w:p>
+    <w:tbl>
+      <w:tblPr>
+        <w:tblW w:type="auto" w:w="0"/>
+        <w:jc w:val="center"/>
+        <w:tblLook w:firstColumn="1" w:firstRow="1" w:lastColumn="0" w:lastRow="0" w:noHBand="0" w:noVBand="1" w:val="04A0"/>
+      </w:tblPr>
+      <w:tblGrid>
+        <w:gridCol w:w="4680"/>
+        <w:gridCol w:w="4680"/>
+      </w:tblGrid>
+      <w:tr>
+        <w:tc>
+          <w:tcPr>
+            <w:tcW w:type="dxa" w:w="4680"/>
+            <w:shd w:fill="F1F5F9"/>
+            <w:tcMar>
+              <w:top w:w="45" w:type="dxa"/>
+              <w:bottom w:w="45" w:type="dxa"/>
+              <w:left w:w="60" w:type="dxa"/>
+              <w:right w:w="60" w:type="dxa"/>
+            </w:tcMar>
           </w:tcPr>
           <w:p>
             <w:pPr>
-              <w:spacing w:after="160"/>
-              <w:jc w:val="center"/>
-            </w:pPr>
-            <w:r>
-              <w:drawing>
-                <wp:inline xmlns:a="http://schemas.openxmlformats.org/drawingml/2006/main" xmlns:pic="http://schemas.openxmlformats.org/drawingml/2006/picture">
-                  <wp:extent cx="4937760" cy="860581"/>
-                  <wp:docPr id="1" name="Picture 1"/>
-                  <wp:cNvGraphicFramePr>
-                    <a:graphicFrameLocks noChangeAspect="1"/>
-                  </wp:cNvGraphicFramePr>
-                  <a:graphic>
-                    <a:graphicData uri="http://schemas.openxmlformats.org/drawingml/2006/picture">
-                      <pic:pic>
-                        <pic:nvPicPr>
-                          <pic:cNvPr id="0" name="iar_banner_hd.png"/>
-                          <pic:cNvPicPr/>
-                        </pic:nvPicPr>
-                        <pic:blipFill>
-                          <a:blip r:embed="rId9"/>
-                          <a:stretch>
-                            <a:fillRect/>
-                          </a:stretch>
-                        </pic:blipFill>
-                        <pic:spPr>
-                          <a:xfrm>
-                            <a:off x="0" y="0"/>
-                            <a:ext cx="4937760" cy="860581"/>
-                          </a:xfrm>
-                          <a:prstGeom prst="rect"/>
-                        </pic:spPr>
-                      </pic:pic>
-                    </a:graphicData>
-                  </a:graphic>
-                </wp:inline>
-              </w:drawing>
-            </w:r>
-          </w:p>
-          <w:p>
-            <w:pPr>
-              <w:spacing w:after="40"/>
               <w:jc w:val="center"/>
             </w:pPr>
             <w:r>
               <w:rPr>
                 <w:rFonts w:ascii="Times New Roman" w:hAnsi="Times New Roman"/>
-                <w:b/>
-                <w:color w:val="7A003C"/>
-                <w:sz w:val="24"/>
+                <w:sz w:val="18"/>
               </w:rPr>
-              <w:t>DEPARTMENT OF ARTIFICIAL INTELLIGENCE &amp; DATA SCIENCE</w:t>
+              <w:t>PROJECT SCHOLAR:</w:t>
+              <w:br/>
+              <w:t>Mr. Deep Koshiya</w:t>
+              <w:br/>
+              <w:t>B.Sc. in AI &amp; Data Science</w:t>
+              <w:br/>
+              <w:t>Semester: V (5th Semester)</w:t>
             </w:r>
           </w:p>
+        </w:tc>
+        <w:tc>
+          <w:tcPr>
+            <w:tcW w:type="dxa" w:w="4680"/>
+            <w:shd w:fill="F1F5F9"/>
+            <w:tcMar>
+              <w:top w:w="45" w:type="dxa"/>
+              <w:bottom w:w="45" w:type="dxa"/>
+              <w:left w:w="60" w:type="dxa"/>
+              <w:right w:w="60" w:type="dxa"/>
+            </w:tcMar>
+          </w:tcPr>
           <w:p>
             <w:pPr>
-              <w:spacing w:after="240"/>
               <w:jc w:val="center"/>
             </w:pPr>
             <w:r>
               <w:rPr>
                 <w:rFonts w:ascii="Times New Roman" w:hAnsi="Times New Roman"/>
-                <w:b/>
-                <w:color w:val="1E1B4B"/>
-                <w:sz w:val="21"/>
+                <w:sz w:val="18"/>
               </w:rPr>
-              <w:t>B.Sc. in Artificial Intelligence &amp; Data Science | Semester V (5th Sem)</w:t>
+              <w:t>PROJECT SUPERVISION:</w:t>
               <w:br/>
-              <w:t>Academic Session: 2026 – 2027</w:t>
+              <w:t>Assigned Project Supervisor</w:t>
+              <w:br/>
+              <w:t>Institute of Advanced Research (IAR)</w:t>
+              <w:br/>
+              <w:t>Evaluation &amp; Verification Stamp</w:t>
             </w:r>
           </w:p>
+        </w:tc>
+      </w:tr>
+      <w:tr>
+        <w:tc>
+          <w:tcPr>
+            <w:tcW w:type="dxa" w:w="4680"/>
+            <w:shd w:fill="FFFFFF"/>
+            <w:tcMar>
+              <w:top w:w="40" w:type="dxa"/>
+              <w:bottom w:w="40" w:type="dxa"/>
+              <w:left w:w="60" w:type="dxa"/>
+              <w:right w:w="60" w:type="dxa"/>
+            </w:tcMar>
+          </w:tcPr>
           <w:p>
             <w:pPr>
-              <w:spacing w:after="200"/>
               <w:jc w:val="center"/>
             </w:pPr>
             <w:r>
               <w:rPr>
                 <w:rFonts w:ascii="Times New Roman" w:hAnsi="Times New Roman"/>
-                <w:color w:val="475569"/>
-                <w:sz w:val="19"/>
+                <w:sz w:val="17"/>
               </w:rPr>
-              <w:t>━━━━━━━━━━━━━━━━━━━━━━━━━━━━━━━━━━━━━━━━━</w:t>
+              <w:t>_________________________</w:t>
+              <w:br/>
+              <w:t>(Scholar Signature)</w:t>
             </w:r>
           </w:p>
+        </w:tc>
+        <w:tc>
+          <w:tcPr>
+            <w:tcW w:type="dxa" w:w="4680"/>
+            <w:shd w:fill="FFFFFF"/>
+            <w:tcMar>
+              <w:top w:w="40" w:type="dxa"/>
+              <w:bottom w:w="40" w:type="dxa"/>
+              <w:left w:w="60" w:type="dxa"/>
+              <w:right w:w="60" w:type="dxa"/>
+            </w:tcMar>
+          </w:tcPr>
           <w:p>
             <w:pPr>
-              <w:spacing w:after="120"/>
               <w:jc w:val="center"/>
             </w:pPr>
             <w:r>
               <w:rPr>
                 <w:rFonts w:ascii="Times New Roman" w:hAnsi="Times New Roman"/>
-                <w:b/>
-                <w:color w:val="1E1B4B"/>
-                <w:sz w:val="34"/>
+                <w:sz w:val="17"/>
               </w:rPr>
-              <w:t>E-COMMERCE CUSTOMER LIFECYCLE &amp;</w:t>
+              <w:t>_________________________</w:t>
               <w:br/>
-              <w:t>RFM SEGMENTATION DASHBOARD</w:t>
+              <w:t>(Supervisor Signature)</w:t>
             </w:r>
           </w:p>
-          <w:p>
-            <w:pPr>
-              <w:spacing w:after="240"/>
-              <w:jc w:val="center"/>
-            </w:pPr>
-            <w:r>
-              <w:rPr>
-                <w:rFonts w:ascii="Times New Roman" w:hAnsi="Times New Roman"/>
-                <w:i/>
-                <w:color w:val="0F172A"/>
-                <w:sz w:val="22"/>
-              </w:rPr>
-              <w:t>An Applied Machine Learning &amp; Analytics Engineering System</w:t>
-              <w:br/>
-              <w:t>for Commercial Retention &amp; Behavioral Cohort Optimization</w:t>
-            </w:r>
-          </w:p>
-          <w:tbl>
-            <w:tblPr>
-              <w:tblW w:type="auto" w:w="0"/>
-              <w:jc w:val="center"/>
-              <w:tblLook w:firstColumn="1" w:firstRow="1" w:lastColumn="0" w:lastRow="0" w:noHBand="0" w:noVBand="1" w:val="04A0"/>
-            </w:tblPr>
-            <w:tblGrid>
-              <w:gridCol w:w="4680"/>
-              <w:gridCol w:w="4680"/>
-            </w:tblGrid>
-            <w:tr>
-              <w:tc>
-                <w:tcPr>
-                  <w:tcW w:type="dxa" w:w="4680"/>
-                  <w:shd w:fill="F8FAFC"/>
-                  <w:tcMar>
-                    <w:top w:w="35" w:type="dxa"/>
-                    <w:bottom w:w="35" w:type="dxa"/>
-                    <w:left w:w="70" w:type="dxa"/>
-                    <w:right w:w="70" w:type="dxa"/>
-                  </w:tcMar>
-                </w:tcPr>
-                <w:p>
-                  <w:r>
-                    <w:rPr>
-                      <w:rFonts w:ascii="Times New Roman" w:hAnsi="Times New Roman"/>
-                      <w:b/>
-                      <w:sz w:val="18"/>
-                    </w:rPr>
-                    <w:t>Assessment Milestone:</w:t>
-                  </w:r>
-                </w:p>
-              </w:tc>
-              <w:tc>
-                <w:tcPr>
-                  <w:tcW w:type="dxa" w:w="4680"/>
-                  <w:shd w:fill="FFFFFF"/>
-                  <w:tcMar>
-                    <w:top w:w="35" w:type="dxa"/>
-                    <w:bottom w:w="35" w:type="dxa"/>
-                    <w:left w:w="70" w:type="dxa"/>
-                    <w:right w:w="70" w:type="dxa"/>
-                  </w:tcMar>
-                </w:tcPr>
-                <w:p>
-                  <w:r>
-                    <w:rPr>
-                      <w:rFonts w:ascii="Times New Roman" w:hAnsi="Times New Roman"/>
-                      <w:sz w:val="18"/>
-                    </w:rPr>
-                    <w:t>FIRST PROGRESS WORK EVALUATION</w:t>
-                  </w:r>
-                </w:p>
-              </w:tc>
-            </w:tr>
-            <w:tr>
-              <w:tc>
-                <w:tcPr>
-                  <w:tcW w:type="dxa" w:w="4680"/>
-                  <w:shd w:fill="F8FAFC"/>
-                  <w:tcMar>
-                    <w:top w:w="35" w:type="dxa"/>
-                    <w:bottom w:w="35" w:type="dxa"/>
-                    <w:left w:w="70" w:type="dxa"/>
-                    <w:right w:w="70" w:type="dxa"/>
-                  </w:tcMar>
-                </w:tcPr>
-                <w:p>
-                  <w:r>
-                    <w:rPr>
-                      <w:rFonts w:ascii="Times New Roman" w:hAnsi="Times New Roman"/>
-                      <w:b/>
-                      <w:sz w:val="18"/>
-                    </w:rPr>
-                    <w:t>Scheduled Submission Date:</w:t>
-                  </w:r>
-                </w:p>
-              </w:tc>
-              <w:tc>
-                <w:tcPr>
-                  <w:tcW w:type="dxa" w:w="4680"/>
-                  <w:shd w:fill="FFFFFF"/>
-                  <w:tcMar>
-                    <w:top w:w="35" w:type="dxa"/>
-                    <w:bottom w:w="35" w:type="dxa"/>
-                    <w:left w:w="70" w:type="dxa"/>
-                    <w:right w:w="70" w:type="dxa"/>
-                  </w:tcMar>
-                </w:tcPr>
-                <w:p>
-                  <w:r>
-                    <w:rPr>
-                      <w:rFonts w:ascii="Times New Roman" w:hAnsi="Times New Roman"/>
-                      <w:sz w:val="18"/>
-                    </w:rPr>
-                    <w:t>24th September 2026 (10:00 AM – 5:00 PM)</w:t>
-                  </w:r>
-                </w:p>
-              </w:tc>
-            </w:tr>
-            <w:tr>
-              <w:tc>
-                <w:tcPr>
-                  <w:tcW w:type="dxa" w:w="4680"/>
-                  <w:shd w:fill="F8FAFC"/>
-                  <w:tcMar>
-                    <w:top w:w="35" w:type="dxa"/>
-                    <w:bottom w:w="35" w:type="dxa"/>
-                    <w:left w:w="70" w:type="dxa"/>
-                    <w:right w:w="70" w:type="dxa"/>
-                  </w:tcMar>
-                </w:tcPr>
-                <w:p>
-                  <w:r>
-                    <w:rPr>
-                      <w:rFonts w:ascii="Times New Roman" w:hAnsi="Times New Roman"/>
-                      <w:b/>
-                      <w:sz w:val="18"/>
-                    </w:rPr>
-                    <w:t>Target Work Completed:</w:t>
-                  </w:r>
-                </w:p>
-              </w:tc>
-              <w:tc>
-                <w:tcPr>
-                  <w:tcW w:type="dxa" w:w="4680"/>
-                  <w:shd w:fill="FFFFFF"/>
-                  <w:tcMar>
-                    <w:top w:w="35" w:type="dxa"/>
-                    <w:bottom w:w="35" w:type="dxa"/>
-                    <w:left w:w="70" w:type="dxa"/>
-                    <w:right w:w="70" w:type="dxa"/>
-                  </w:tcMar>
-                </w:tcPr>
-                <w:p>
-                  <w:r>
-                    <w:rPr>
-                      <w:rFonts w:ascii="Times New Roman" w:hAnsi="Times New Roman"/>
-                      <w:sz w:val="18"/>
-                    </w:rPr>
-                    <w:t>Sections 1.1, 1.2, 1.3, 2.1, and 2.2 (DFD &amp; Use Case)</w:t>
-                  </w:r>
-                </w:p>
-              </w:tc>
-            </w:tr>
-            <w:tr>
-              <w:tc>
-                <w:tcPr>
-                  <w:tcW w:type="dxa" w:w="4680"/>
-                  <w:shd w:fill="F8FAFC"/>
-                  <w:tcMar>
-                    <w:top w:w="35" w:type="dxa"/>
-                    <w:bottom w:w="35" w:type="dxa"/>
-                    <w:left w:w="70" w:type="dxa"/>
-                    <w:right w:w="70" w:type="dxa"/>
-                  </w:tcMar>
-                </w:tcPr>
-                <w:p>
-                  <w:r>
-                    <w:rPr>
-                      <w:rFonts w:ascii="Times New Roman" w:hAnsi="Times New Roman"/>
-                      <w:b/>
-                      <w:sz w:val="18"/>
-                    </w:rPr>
-                    <w:t>Course &amp; Project Code:</w:t>
-                  </w:r>
-                </w:p>
-              </w:tc>
-              <w:tc>
-                <w:tcPr>
-                  <w:tcW w:type="dxa" w:w="4680"/>
-                  <w:shd w:fill="FFFFFF"/>
-                  <w:tcMar>
-                    <w:top w:w="35" w:type="dxa"/>
-                    <w:bottom w:w="35" w:type="dxa"/>
-                    <w:left w:w="70" w:type="dxa"/>
-                    <w:right w:w="70" w:type="dxa"/>
-                  </w:tcMar>
-                </w:tcPr>
-                <w:p>
-                  <w:r>
-                    <w:rPr>
-                      <w:rFonts w:ascii="Times New Roman" w:hAnsi="Times New Roman"/>
-                      <w:sz w:val="18"/>
-                    </w:rPr>
-                    <w:t>Project - 1 (CE-502 / PRJ-701)</w:t>
-                  </w:r>
-                </w:p>
-              </w:tc>
-            </w:tr>
-            <w:tr>
-              <w:tc>
-                <w:tcPr>
-                  <w:tcW w:type="dxa" w:w="4680"/>
-                  <w:shd w:fill="F8FAFC"/>
-                  <w:tcMar>
-                    <w:top w:w="35" w:type="dxa"/>
-                    <w:bottom w:w="35" w:type="dxa"/>
-                    <w:left w:w="70" w:type="dxa"/>
-                    <w:right w:w="70" w:type="dxa"/>
-                  </w:tcMar>
-                </w:tcPr>
-                <w:p>
-                  <w:r>
-                    <w:rPr>
-                      <w:rFonts w:ascii="Times New Roman" w:hAnsi="Times New Roman"/>
-                      <w:b/>
-                      <w:sz w:val="18"/>
-                    </w:rPr>
-                    <w:t>Allotted Assessment Marks:</w:t>
-                  </w:r>
-                </w:p>
-              </w:tc>
-              <w:tc>
-                <w:tcPr>
-                  <w:tcW w:type="dxa" w:w="4680"/>
-                  <w:shd w:fill="FFFFFF"/>
-                  <w:tcMar>
-                    <w:top w:w="35" w:type="dxa"/>
-                    <w:bottom w:w="35" w:type="dxa"/>
-                    <w:left w:w="70" w:type="dxa"/>
-                    <w:right w:w="70" w:type="dxa"/>
-                  </w:tcMar>
-                </w:tcPr>
-                <w:p>
-                  <w:r>
-                    <w:rPr>
-                      <w:rFonts w:ascii="Times New Roman" w:hAnsi="Times New Roman"/>
-                      <w:sz w:val="18"/>
-                    </w:rPr>
-                    <w:t>10 Marks (First Progress Work)</w:t>
-                  </w:r>
-                </w:p>
-              </w:tc>
-            </w:tr>
-          </w:tbl>
-          <w:p/>
-          <w:p>
-            <w:pPr>
-              <w:spacing w:after="240"/>
-            </w:pPr>
-          </w:p>
-          <w:tbl>
-            <w:tblPr>
-              <w:tblW w:type="auto" w:w="0"/>
-              <w:jc w:val="center"/>
-              <w:tblLook w:firstColumn="1" w:firstRow="1" w:lastColumn="0" w:lastRow="0" w:noHBand="0" w:noVBand="1" w:val="04A0"/>
-            </w:tblPr>
-            <w:tblGrid>
-              <w:gridCol w:w="4680"/>
-              <w:gridCol w:w="4680"/>
-            </w:tblGrid>
-            <w:tr>
-              <w:tc>
-                <w:tcPr>
-                  <w:tcW w:type="dxa" w:w="4680"/>
-                  <w:shd w:fill="F1F5F9"/>
-                  <w:tcMar>
-                    <w:top w:w="45" w:type="dxa"/>
-                    <w:bottom w:w="45" w:type="dxa"/>
-                    <w:left w:w="60" w:type="dxa"/>
-                    <w:right w:w="60" w:type="dxa"/>
-                  </w:tcMar>
-                </w:tcPr>
-                <w:p>
-                  <w:pPr>
-                    <w:jc w:val="center"/>
-                  </w:pPr>
-                  <w:r>
-                    <w:rPr>
-                      <w:rFonts w:ascii="Times New Roman" w:hAnsi="Times New Roman"/>
-                      <w:sz w:val="18"/>
-                    </w:rPr>
-                    <w:t>SUBMITTED BY:</w:t>
-                    <w:br/>
-                    <w:t>Mr. Deep Koshiya</w:t>
-                    <w:br/>
-                    <w:t>B.Sc. AI and Data Science</w:t>
-                    <w:br/>
-                    <w:t>Semester: V (5th Semester)</w:t>
-                  </w:r>
-                </w:p>
-              </w:tc>
-              <w:tc>
-                <w:tcPr>
-                  <w:tcW w:type="dxa" w:w="4680"/>
-                  <w:shd w:fill="F1F5F9"/>
-                  <w:tcMar>
-                    <w:top w:w="45" w:type="dxa"/>
-                    <w:bottom w:w="45" w:type="dxa"/>
-                    <w:left w:w="60" w:type="dxa"/>
-                    <w:right w:w="60" w:type="dxa"/>
-                  </w:tcMar>
-                </w:tcPr>
-                <w:p>
-                  <w:pPr>
-                    <w:jc w:val="center"/>
-                  </w:pPr>
-                  <w:r>
-                    <w:rPr>
-                      <w:rFonts w:ascii="Times New Roman" w:hAnsi="Times New Roman"/>
-                      <w:sz w:val="18"/>
-                    </w:rPr>
-                    <w:t>SUPERVISED &amp; VERIFIED BY:</w:t>
-                    <w:br/>
-                    <w:t>Project Supervisor</w:t>
-                    <w:br/>
-                    <w:t>Department of AI &amp; Data Science</w:t>
-                    <w:br/>
-                    <w:t>Institute of Advanced Research (IAR)</w:t>
-                  </w:r>
-                </w:p>
-              </w:tc>
-            </w:tr>
-            <w:tr>
-              <w:tc>
-                <w:tcPr>
-                  <w:tcW w:type="dxa" w:w="4680"/>
-                  <w:shd w:fill="FFFFFF"/>
-                  <w:tcMar>
-                    <w:top w:w="40" w:type="dxa"/>
-                    <w:bottom w:w="40" w:type="dxa"/>
-                    <w:left w:w="60" w:type="dxa"/>
-                    <w:right w:w="60" w:type="dxa"/>
-                  </w:tcMar>
-                </w:tcPr>
-                <w:p>
-                  <w:pPr>
-                    <w:jc w:val="center"/>
-                  </w:pPr>
-                  <w:r>
-                    <w:rPr>
-                      <w:rFonts w:ascii="Times New Roman" w:hAnsi="Times New Roman"/>
-                      <w:sz w:val="17"/>
-                    </w:rPr>
-                    <w:t>_________________________</w:t>
-                    <w:br/>
-                    <w:t>(Signature of Scholar)</w:t>
-                  </w:r>
-                </w:p>
-              </w:tc>
-              <w:tc>
-                <w:tcPr>
-                  <w:tcW w:type="dxa" w:w="4680"/>
-                  <w:shd w:fill="FFFFFF"/>
-                  <w:tcMar>
-                    <w:top w:w="40" w:type="dxa"/>
-                    <w:bottom w:w="40" w:type="dxa"/>
-                    <w:left w:w="60" w:type="dxa"/>
-                    <w:right w:w="60" w:type="dxa"/>
-                  </w:tcMar>
-                </w:tcPr>
-                <w:p>
-                  <w:pPr>
-                    <w:jc w:val="center"/>
-                  </w:pPr>
-                  <w:r>
-                    <w:rPr>
-                      <w:rFonts w:ascii="Times New Roman" w:hAnsi="Times New Roman"/>
-                      <w:sz w:val="17"/>
-                    </w:rPr>
-                    <w:t>_________________________</w:t>
-                    <w:br/>
-                    <w:t>(Signature of Supervisor)</w:t>
-                  </w:r>
-                </w:p>
-              </w:tc>
-            </w:tr>
-          </w:tbl>
-          <w:p/>
         </w:tc>
       </w:tr>
     </w:tbl>
@@ -529,7 +512,7 @@
     </w:p>
     <w:p>
       <w:pPr>
-        <w:spacing w:before="0" w:after="40" w:line="269" w:lineRule="auto"/>
+        <w:spacing w:before="0" w:after="40" w:line="264" w:lineRule="auto"/>
         <w:jc w:val="right"/>
       </w:pPr>
       <w:r>
@@ -553,14 +536,14 @@
           <w:rFonts w:ascii="Times New Roman" w:hAnsi="Times New Roman"/>
           <w:b/>
           <w:color w:val="1E1B4B"/>
-          <w:sz w:val="30"/>
+          <w:sz w:val="29"/>
         </w:rPr>
         <w:t>ACKNOWLEDGMENT</w:t>
       </w:r>
     </w:p>
     <w:p>
       <w:pPr>
-        <w:spacing w:before="0" w:after="80" w:line="269" w:lineRule="auto"/>
+        <w:spacing w:before="0" w:after="70" w:line="264" w:lineRule="auto"/>
         <w:jc w:val="both"/>
       </w:pPr>
       <w:r>
@@ -570,12 +553,12 @@
           <w:color w:val="0F172A"/>
           <w:sz w:val="22"/>
         </w:rPr>
-        <w:t>I express my sincere gratitude to my assigned project supervisor and the esteemed faculty members of the Department of Artificial Intelligence &amp; Data Science at the Institute of Advanced Research (IAR) for their invaluable guidance, encouragement, and insightful feedback throughout the problem identification and system design phases of this project.</w:t>
+        <w:t>I express my sincere appreciation to my project supervisor and faculty mentors at the Institute of Advanced Research (IAR) for their technical guidance, critical evaluation, and encouragement throughout the system conception, requirement analysis, and architectural design phases of this project.</w:t>
       </w:r>
     </w:p>
     <w:p>
       <w:pPr>
-        <w:spacing w:before="0" w:after="80" w:line="269" w:lineRule="auto"/>
+        <w:spacing w:before="0" w:after="70" w:line="264" w:lineRule="auto"/>
         <w:jc w:val="both"/>
       </w:pPr>
       <w:r>
@@ -585,12 +568,12 @@
           <w:color w:val="0F172A"/>
           <w:sz w:val="22"/>
         </w:rPr>
-        <w:t>I also thank the Project Coordinator and the Head of the School for facilitating the computational lab environment and resources necessary to execute Project-1 (PRJ-701 / CE-502) in accordance with the prescribed university schedule.</w:t>
+        <w:t>I also thank the university leadership and the Head of the School for facilitating the computational resources and laboratory environments required to execute Project-1 (CE-502 / PRJ-701) in accordance with our academic timeline.</w:t>
       </w:r>
     </w:p>
     <w:p>
       <w:pPr>
-        <w:spacing w:before="0" w:after="80" w:line="269" w:lineRule="auto"/>
+        <w:spacing w:before="0" w:after="70" w:line="264" w:lineRule="auto"/>
         <w:jc w:val="both"/>
       </w:pPr>
       <w:r>
@@ -600,12 +583,12 @@
           <w:color w:val="0F172A"/>
           <w:sz w:val="22"/>
         </w:rPr>
-        <w:t>This First Progress Work report, submitted on 24/09/2026, encompasses the foundational requirements, data engineering pipeline architecture, and complete UML/DFD models (Sections 1.1, 1.2, 1.3, 2.1, and 2.2). I remain dedicated to incorporating all supervisory feedback for the upcoming Mid-Term evaluation.</w:t>
+        <w:t>This First Progress Work report, presented for formal evaluation on 24th September 2026, documents the requirements engineering, data refinery architecture, and software design using UML (Sections 1.1, 1.2, 1.3, 2.1, and 2.2). I remain committed to refining these models as the system progresses toward database physical schemas and algorithmic deployment for the upcoming Mid-Term evaluation.</w:t>
       </w:r>
     </w:p>
     <w:p>
       <w:pPr>
-        <w:spacing w:before="40" w:after="200" w:line="269" w:lineRule="auto"/>
+        <w:spacing w:before="40" w:after="200" w:line="264" w:lineRule="auto"/>
         <w:jc w:val="right"/>
       </w:pPr>
       <w:r>
@@ -615,7 +598,7 @@
           <w:color w:val="0F172A"/>
           <w:sz w:val="22"/>
         </w:rPr>
-        <w:t>Deep Koshiya | B.Sc. AI and Data Science (Semester V) | Date: 24th September 2026</w:t>
+        <w:t>Deep Koshiya | B.Sc. in AI &amp; Data Science (Semester V) | Date: 24/09/2026</w:t>
       </w:r>
     </w:p>
     <w:p>
@@ -629,14 +612,14 @@
           <w:rFonts w:ascii="Times New Roman" w:hAnsi="Times New Roman"/>
           <w:b/>
           <w:color w:val="1E1B4B"/>
-          <w:sz w:val="30"/>
+          <w:sz w:val="29"/>
         </w:rPr>
         <w:t>ABSTRACT</w:t>
       </w:r>
     </w:p>
     <w:p>
       <w:pPr>
-        <w:spacing w:before="0" w:after="80" w:line="269" w:lineRule="auto"/>
+        <w:spacing w:before="0" w:after="70" w:line="264" w:lineRule="auto"/>
         <w:jc w:val="both"/>
       </w:pPr>
       <w:r>
@@ -646,12 +629,12 @@
           <w:color w:val="0F172A"/>
           <w:sz w:val="22"/>
         </w:rPr>
-        <w:t>In modern multi-channel retail, treating an entire customer base as a homogenous entity leads to suboptimal marketing spend, inflated Customer Acquisition Costs (CAC), and customer churn blindspots. The 'E-Commerce Customer Lifecycle &amp; RFM Segmentation Dashboard' resolves these commercial challenges through an end-to-end applied machine learning and analytics engineering pipeline.</w:t>
+        <w:t>In modern multi-channel commerce, treating an entire consumer portfolio as a homogenous base leads to severe financial waste, misallocated Customer Acquisition Costs (CAC), and customer attrition blindspots. The 'E-Commerce Customer Lifecycle &amp; RFM Segmentation Dashboard' resolves these challenges through an end-to-end data analytics and unsupervised machine learning framework.</w:t>
       </w:r>
     </w:p>
     <w:p>
       <w:pPr>
-        <w:spacing w:before="0" w:after="80" w:line="269" w:lineRule="auto"/>
+        <w:spacing w:before="0" w:after="70" w:line="264" w:lineRule="auto"/>
         <w:jc w:val="both"/>
       </w:pPr>
       <w:r>
@@ -661,12 +644,12 @@
           <w:color w:val="0F172A"/>
           <w:sz w:val="22"/>
         </w:rPr>
-        <w:t>The automated pipeline ingests raw transaction event logs, enforces schema validation, isolates unauthenticated sessions, segregates reverse logistics (credit notes and cancellations) into an audit ledger, and neutralizes bulk B2B distribution anomalies using Tukey's Interquartile Range (IQR) fences. A vectorized feature engineering engine computes customer-level Recency, Frequency, and Monetary (RFM) dimensions alongside Average Order Value (AOV). Features undergo log1p compression and Z-score standardization to alleviate Pareto spend skewness, enabling robust K-Means clustering evaluated via Elbow and Silhouette diagnostics. Concurrently, a rule-based quantile stratification engine (pd.qcut) computes deterministic 1–5 behavioral tiers mapping customers into 8 actionable cohorts (such as 'Champions', 'Loyal Customers', and 'At Risk Whales').</w:t>
+        <w:t>The automated system ingests raw transaction event logs, enforces strict schema validation, isolates unauthenticated sessions, segregates reverse logistics (credit notes and cancellations) into an audit ledger, and neutralizes bulk distribution anomalies using Tukey's Interquartile Range (IQR) fences. A vectorized feature engineering engine computes customer-level Recency, Frequency, and Monetary (RFM) metrics alongside Average Order Value (AOV). Features undergo log1p compression and Z-score standardization to mitigate Pareto spend skewness, enabling robust K-Means clustering validated via Elbow and Silhouette metrics. Concurrently, a rule-based quantile engine (pd.qcut) assigns deterministic 1–5 scores, mapping accounts to 8 operational business cohorts ('Champions', 'Loyal Customers', 'At Risk Whales', etc.).</w:t>
       </w:r>
     </w:p>
     <w:p>
       <w:pPr>
-        <w:spacing w:before="0" w:after="80" w:line="269" w:lineRule="auto"/>
+        <w:spacing w:before="0" w:after="70" w:line="264" w:lineRule="auto"/>
         <w:jc w:val="both"/>
       </w:pPr>
       <w:r>
@@ -676,7 +659,7 @@
           <w:color w:val="0F172A"/>
           <w:sz w:val="22"/>
         </w:rPr>
-        <w:t>This First Progress Work report documents the system foundation and software engineering design for the 24/09/2026 milestone at Institute of Advanced Research (IAR). It presents complete Level-0, Level-1, and Level-2 Data Flow Diagrams (DFDs) alongside a comprehensive Use Case Model and specification matrix, fulfilling all requirements for the first 10-mark evaluation.</w:t>
+        <w:t>This report documents the system foundation and software design for the 24/09/2026 assessment milestone at Institute of Advanced Research (IAR). It presents complete Level-0, Level-1, and Level-2 Data Flow Diagrams (DFDs) alongside a comprehensive Use Case Model and specification matrix, fulfilling all requirements for the first 10-mark evaluation.</w:t>
       </w:r>
     </w:p>
     <w:p>
@@ -686,7 +669,7 @@
     </w:p>
     <w:p>
       <w:pPr>
-        <w:spacing w:before="0" w:after="40" w:line="269" w:lineRule="auto"/>
+        <w:spacing w:before="0" w:after="40" w:line="264" w:lineRule="auto"/>
         <w:jc w:val="right"/>
       </w:pPr>
       <w:r>
@@ -710,14 +693,14 @@
           <w:rFonts w:ascii="Times New Roman" w:hAnsi="Times New Roman"/>
           <w:b/>
           <w:color w:val="1E1B4B"/>
-          <w:sz w:val="30"/>
+          <w:sz w:val="29"/>
         </w:rPr>
         <w:t>INDEX OF THE PROJECT REPORT</w:t>
       </w:r>
     </w:p>
     <w:p>
       <w:pPr>
-        <w:spacing w:before="0" w:after="80" w:line="269" w:lineRule="auto"/>
+        <w:spacing w:before="0" w:after="80" w:line="264" w:lineRule="auto"/>
         <w:jc w:val="both"/>
       </w:pPr>
       <w:r>
@@ -1881,14 +1864,14 @@
           <w:rFonts w:ascii="Times New Roman" w:hAnsi="Times New Roman"/>
           <w:b/>
           <w:color w:val="0F172A"/>
-          <w:sz w:val="26"/>
+          <w:sz w:val="25"/>
         </w:rPr>
         <w:t>LIST OF FIGURES &amp; TABLES (Progress Work - 1)</w:t>
       </w:r>
     </w:p>
     <w:p>
       <w:pPr>
-        <w:spacing w:before="0" w:after="80" w:line="269" w:lineRule="auto"/>
+        <w:spacing w:before="0" w:after="70" w:line="264" w:lineRule="auto"/>
         <w:jc w:val="both"/>
       </w:pPr>
       <w:r>
@@ -1903,7 +1886,7 @@
     </w:p>
     <w:p>
       <w:pPr>
-        <w:spacing w:before="0" w:after="80" w:line="269" w:lineRule="auto"/>
+        <w:spacing w:before="0" w:after="70" w:line="264" w:lineRule="auto"/>
         <w:jc w:val="both"/>
       </w:pPr>
       <w:r>
@@ -1918,7 +1901,7 @@
     </w:p>
     <w:p>
       <w:pPr>
-        <w:spacing w:before="0" w:after="80" w:line="269" w:lineRule="auto"/>
+        <w:spacing w:before="0" w:after="70" w:line="264" w:lineRule="auto"/>
         <w:jc w:val="both"/>
       </w:pPr>
       <w:r>
@@ -1933,7 +1916,7 @@
     </w:p>
     <w:p>
       <w:pPr>
-        <w:spacing w:before="0" w:after="80" w:line="269" w:lineRule="auto"/>
+        <w:spacing w:before="0" w:after="70" w:line="264" w:lineRule="auto"/>
         <w:jc w:val="both"/>
       </w:pPr>
       <w:r>
@@ -1948,7 +1931,7 @@
     </w:p>
     <w:p>
       <w:pPr>
-        <w:spacing w:before="0" w:after="80" w:line="269" w:lineRule="auto"/>
+        <w:spacing w:before="0" w:after="70" w:line="264" w:lineRule="auto"/>
         <w:jc w:val="both"/>
       </w:pPr>
       <w:r>
@@ -1963,7 +1946,7 @@
     </w:p>
     <w:p>
       <w:pPr>
-        <w:spacing w:before="0" w:after="80" w:line="269" w:lineRule="auto"/>
+        <w:spacing w:before="0" w:after="70" w:line="264" w:lineRule="auto"/>
         <w:jc w:val="both"/>
       </w:pPr>
       <w:r>
@@ -1978,7 +1961,7 @@
     </w:p>
     <w:p>
       <w:pPr>
-        <w:spacing w:before="0" w:after="80" w:line="269" w:lineRule="auto"/>
+        <w:spacing w:before="0" w:after="70" w:line="264" w:lineRule="auto"/>
         <w:jc w:val="both"/>
       </w:pPr>
       <w:r>
@@ -1993,7 +1976,7 @@
     </w:p>
     <w:p>
       <w:pPr>
-        <w:spacing w:before="0" w:after="80" w:line="269" w:lineRule="auto"/>
+        <w:spacing w:before="0" w:after="70" w:line="264" w:lineRule="auto"/>
         <w:jc w:val="both"/>
       </w:pPr>
       <w:r>
@@ -2013,7 +1996,7 @@
     </w:p>
     <w:p>
       <w:pPr>
-        <w:spacing w:before="0" w:after="40" w:line="269" w:lineRule="auto"/>
+        <w:spacing w:before="0" w:after="40" w:line="264" w:lineRule="auto"/>
         <w:jc w:val="right"/>
       </w:pPr>
       <w:r>
@@ -2029,7 +2012,7 @@
     <w:p>
       <w:pPr>
         <w:keepNext/>
-        <w:spacing w:before="200" w:after="80"/>
+        <w:spacing w:before="160" w:after="60"/>
         <w:jc w:val="left"/>
       </w:pPr>
       <w:r>
@@ -2037,7 +2020,7 @@
           <w:rFonts w:ascii="Times New Roman" w:hAnsi="Times New Roman"/>
           <w:b/>
           <w:color w:val="1E1B4B"/>
-          <w:sz w:val="30"/>
+          <w:sz w:val="29"/>
         </w:rPr>
         <w:t>1. ABOUT THE SYSTEM:</w:t>
       </w:r>
@@ -2045,7 +2028,7 @@
     <w:p>
       <w:pPr>
         <w:keepNext/>
-        <w:spacing w:before="160" w:after="60"/>
+        <w:spacing w:before="140" w:after="40"/>
         <w:jc w:val="left"/>
       </w:pPr>
       <w:r>
@@ -2053,14 +2036,14 @@
           <w:rFonts w:ascii="Times New Roman" w:hAnsi="Times New Roman"/>
           <w:b/>
           <w:color w:val="0F172A"/>
-          <w:sz w:val="26"/>
+          <w:sz w:val="25"/>
         </w:rPr>
         <w:t>1.1 Problem definition (Identification of needs):</w:t>
       </w:r>
     </w:p>
     <w:p>
       <w:pPr>
-        <w:spacing w:before="0" w:after="80" w:line="269" w:lineRule="auto"/>
+        <w:spacing w:before="0" w:after="70" w:line="264" w:lineRule="auto"/>
         <w:jc w:val="both"/>
       </w:pPr>
       <w:r>
@@ -2070,13 +2053,13 @@
           <w:color w:val="0F172A"/>
           <w:sz w:val="22"/>
         </w:rPr>
-        <w:t>Modern digital commerce platforms generate continuous transactional event streams across mobile apps, online web checkouts, and physical POS gateways. Relational Online Transaction Processing (OLTP) repositories effectively record line-item orders; however, they inherently track individual checkouts rather than longitudinal customer relationships. Without an analytics engineering framework that transforms low-level orders into customer-centric behavioral dimensions, commercial leadership operates with severe blindspots.</w:t>
+        <w:t>Modern digital commerce platforms capture high-velocity transactional event streams across web interfaces, mobile shopping applications, and digital points of sale. Standard Online Transaction Processing (OLTP) repositories excel at logging individual line-item orders. However, these systems record transactions rather than customer journeys. Without an automated analytics engineering layer that synthesizes transactional logs into longitudinal customer profiles, commercial decision-makers face severe visibility gaps.</w:t>
       </w:r>
     </w:p>
     <w:p>
       <w:pPr>
         <w:keepNext/>
-        <w:spacing w:before="120" w:after="40"/>
+        <w:spacing w:before="100" w:after="40"/>
         <w:jc w:val="left"/>
       </w:pPr>
       <w:r>
@@ -2084,14 +2067,14 @@
           <w:rFonts w:ascii="Times New Roman" w:hAnsi="Times New Roman"/>
           <w:b/>
           <w:color w:val="0F172A"/>
-          <w:sz w:val="23"/>
+          <w:sz w:val="22"/>
         </w:rPr>
-        <w:t>1.1.1 Industry Background &amp; Domain Challenges</w:t>
+        <w:t>1.1.1 Industry Background &amp; Commercial Challenges</w:t>
       </w:r>
     </w:p>
     <w:p>
       <w:pPr>
-        <w:spacing w:before="0" w:after="80" w:line="269" w:lineRule="auto"/>
+        <w:spacing w:before="0" w:after="70" w:line="264" w:lineRule="auto"/>
         <w:jc w:val="both"/>
       </w:pPr>
       <w:r>
@@ -2101,13 +2084,13 @@
           <w:color w:val="0F172A"/>
           <w:sz w:val="22"/>
         </w:rPr>
-        <w:t>E-commerce organizations face escalating paid Customer Acquisition Costs (CAC) across digital ad networks alongside declining organic retention rates. Treating an entire customer portfolio as a monolith leads to severe resource misallocations: high-value repeat shoppers receive unnecessary margin-diluting discount coupons, while early churn-risk signals from historically loyal accounts are overlooked until permanent dormancy occurs.</w:t>
+        <w:t>Digital retailers face rising customer acquisition costs and falling organic retention. Blanket marketing campaigns treat all shoppers equally: high-value repeat customers receive unnecessary margin-eroding discounts, while early signals of churn from historically loyal accounts go unnoticed until customers are permanently lost.</w:t>
       </w:r>
     </w:p>
     <w:p>
       <w:pPr>
         <w:keepNext/>
-        <w:spacing w:before="120" w:after="40"/>
+        <w:spacing w:before="100" w:after="40"/>
         <w:jc w:val="left"/>
       </w:pPr>
       <w:r>
@@ -2115,14 +2098,14 @@
           <w:rFonts w:ascii="Times New Roman" w:hAnsi="Times New Roman"/>
           <w:b/>
           <w:color w:val="0F172A"/>
-          <w:sz w:val="23"/>
+          <w:sz w:val="22"/>
         </w:rPr>
         <w:t>1.1.2 Identification of Operational &amp; System Needs</w:t>
       </w:r>
     </w:p>
     <w:p>
       <w:pPr>
-        <w:spacing w:before="0" w:after="80" w:line="269" w:lineRule="auto"/>
+        <w:spacing w:before="0" w:after="70" w:line="264" w:lineRule="auto"/>
         <w:jc w:val="both"/>
       </w:pPr>
       <w:r>
@@ -2132,7 +2115,7 @@
           <w:color w:val="0F172A"/>
           <w:sz w:val="22"/>
         </w:rPr>
-        <w:t xml:space="preserve">• Core Needs: </w:t>
+        <w:t xml:space="preserve">• Core Analytical Needs: </w:t>
       </w:r>
       <w:r>
         <w:rPr>
@@ -2141,12 +2124,12 @@
           <w:color w:val="0F172A"/>
           <w:sz w:val="22"/>
         </w:rPr>
-        <w:t>The system addresses four primary operational requirements identified in enterprise retail analytics:</w:t>
+        <w:t>The system resolves four core operational bottlenecks in digital retail analytics:</w:t>
       </w:r>
     </w:p>
     <w:p>
       <w:pPr>
-        <w:spacing w:before="0" w:after="80" w:line="269" w:lineRule="auto"/>
+        <w:spacing w:before="0" w:after="70" w:line="264" w:lineRule="auto"/>
         <w:jc w:val="both"/>
       </w:pPr>
       <w:r>
@@ -2156,7 +2139,7 @@
           <w:color w:val="0F172A"/>
           <w:sz w:val="22"/>
         </w:rPr>
-        <w:t xml:space="preserve">1. Automated Data Cleaning &amp; Outlier Isolation: </w:t>
+        <w:t xml:space="preserve">1. Automated Data Cleansing &amp; Outlier Isolation: </w:t>
       </w:r>
       <w:r>
         <w:rPr>
@@ -2165,12 +2148,12 @@
           <w:color w:val="0F172A"/>
           <w:sz w:val="22"/>
         </w:rPr>
-        <w:t>Raw transactional feeds contain anonymous guest checkouts (missing CustomerID), cancelled invoices (prefixed with 'C'), zero-priced administrative adjustments, and extreme B2B bulk orders (e.g., 1,500 units). An automated filter applying Tukey's Interquartile Range (IQR) fences is required to isolate anomalies without compromising retail consumer behavioral patterns.</w:t>
+        <w:t>Raw event logs contain guest checkouts lacking CustomerID, cancellations (prefixed with 'C'), administrative zero-priced entries, and wholesale bulk anomalies. An automated refinery using Tukey's Interquartile Range (IQR) fences isolates noise while preserving genuine consumer buying patterns.</w:t>
       </w:r>
     </w:p>
     <w:p>
       <w:pPr>
-        <w:spacing w:before="0" w:after="80" w:line="269" w:lineRule="auto"/>
+        <w:spacing w:before="0" w:after="70" w:line="264" w:lineRule="auto"/>
         <w:jc w:val="both"/>
       </w:pPr>
       <w:r>
@@ -2180,7 +2163,7 @@
           <w:color w:val="0F172A"/>
           <w:sz w:val="22"/>
         </w:rPr>
-        <w:t xml:space="preserve">2. Granular Behavioral Metric Derivation (RFM): </w:t>
+        <w:t xml:space="preserve">2. Behavioral Metric Derivation (RFM): </w:t>
       </w:r>
       <w:r>
         <w:rPr>
@@ -2189,12 +2172,12 @@
           <w:color w:val="0F172A"/>
           <w:sz w:val="22"/>
         </w:rPr>
-        <w:t>The system must condense disparate orders into normalized behavioral dimensions: Recency (days elapsed since last transaction relative to a fixed operational boundary T_obs = max(InvoiceDate) + 1 day), Frequency (distinct checkout visits via nunique), and Monetary spend (net cumulative spend).</w:t>
+        <w:t>The system must condense order streams into normalized dimensions: Recency (days elapsed relative to operational boundary T_obs = max(InvoiceDate) + 1 day), Frequency (distinct checkout trips), and Monetary spend (cumulative net value).</w:t>
       </w:r>
     </w:p>
     <w:p>
       <w:pPr>
-        <w:spacing w:before="0" w:after="80" w:line="269" w:lineRule="auto"/>
+        <w:spacing w:before="0" w:after="70" w:line="264" w:lineRule="auto"/>
         <w:jc w:val="both"/>
       </w:pPr>
       <w:r>
@@ -2213,12 +2196,12 @@
           <w:color w:val="0F172A"/>
           <w:sz w:val="22"/>
         </w:rPr>
-        <w:t>Consumer spend follows a Pareto distribution (extreme positive skew). Euclidean distance-based clustering fails on raw values because monetary variance completely dominates frequency and recency. Log1p compression and Z-score standardization are required prior to K-Means modeling, coupled with a deterministic 1–5 quantile fallback scoring engine.</w:t>
+        <w:t>Consumer spend follows a Pareto distribution. Euclidean distance-based clustering fails on raw numbers because monetary variance overwhelms frequency and recency. Log1p compression and Z-score standardization are required prior to K-Means modeling, coupled with a deterministic 1–5 quantile fallback scoring engine.</w:t>
       </w:r>
     </w:p>
     <w:p>
       <w:pPr>
-        <w:spacing w:before="0" w:after="80" w:line="269" w:lineRule="auto"/>
+        <w:spacing w:before="0" w:after="70" w:line="264" w:lineRule="auto"/>
         <w:jc w:val="both"/>
       </w:pPr>
       <w:r>
@@ -2228,7 +2211,7 @@
           <w:color w:val="0F172A"/>
           <w:sz w:val="22"/>
         </w:rPr>
-        <w:t xml:space="preserve">4. Strategic BI Visualization &amp; Activation: </w:t>
+        <w:t xml:space="preserve">4. Executive Visualization &amp; Activation: </w:t>
       </w:r>
       <w:r>
         <w:rPr>
@@ -2237,13 +2220,13 @@
           <w:color w:val="0F172A"/>
           <w:sz w:val="22"/>
         </w:rPr>
-        <w:t>Executives and marketing teams require an interactive BI interface that visualizes portfolio health, highlights at-risk capital, and exports actionable customer cohorts linked to distinct CRM retention playbooks.</w:t>
+        <w:t>Commercial leadership requires an interactive dashboard displaying portfolio health, revenue concentration, at-risk capital, and segmented customer lists mapped to specific CRM action playbooks.</w:t>
       </w:r>
     </w:p>
     <w:p>
       <w:pPr>
         <w:keepNext/>
-        <w:spacing w:before="120" w:after="40"/>
+        <w:spacing w:before="100" w:after="40"/>
         <w:jc w:val="left"/>
       </w:pPr>
       <w:r>
@@ -2251,14 +2234,14 @@
           <w:rFonts w:ascii="Times New Roman" w:hAnsi="Times New Roman"/>
           <w:b/>
           <w:color w:val="0F172A"/>
-          <w:sz w:val="23"/>
+          <w:sz w:val="22"/>
         </w:rPr>
         <w:t>1.1.3 Project Scope &amp; Targeted Objectives</w:t>
       </w:r>
     </w:p>
     <w:p>
       <w:pPr>
-        <w:spacing w:before="0" w:after="80" w:line="269" w:lineRule="auto"/>
+        <w:spacing w:before="0" w:after="70" w:line="264" w:lineRule="auto"/>
         <w:jc w:val="both"/>
       </w:pPr>
       <w:r>
@@ -2268,7 +2251,7 @@
           <w:color w:val="0F172A"/>
           <w:sz w:val="22"/>
         </w:rPr>
-        <w:t>The project delivers a production-grade analytics system bridging raw OLTP logs and strategic decision-making. Deliverables encompass an automated Python refinery pipeline, vectorized RFM engine, unsupervised K-Means clustering, star-schema data marts (FACT_TRANSACTIONS, FACT_REVERSALS, DIM_CUSTOMERS), and an interactive executive web dashboard.</w:t>
+        <w:t>The project delivers a verified analytics engineering system bridging raw transaction streams and strategic marketing. Key deliverables include an automated Python cleaning pipeline, vectorized RFM feature store, unsupervised K-Means clustering, star-schema data marts (FACT_TRANSACTIONS, FACT_REVERSALS, DIM_CUSTOMERS), and an interactive executive web dashboard.</w:t>
       </w:r>
     </w:p>
     <w:p>
@@ -2278,7 +2261,7 @@
     </w:p>
     <w:p>
       <w:pPr>
-        <w:spacing w:before="0" w:after="40" w:line="269" w:lineRule="auto"/>
+        <w:spacing w:before="0" w:after="40" w:line="264" w:lineRule="auto"/>
         <w:jc w:val="right"/>
       </w:pPr>
       <w:r>
@@ -2294,7 +2277,7 @@
     <w:p>
       <w:pPr>
         <w:keepNext/>
-        <w:spacing w:before="160" w:after="60"/>
+        <w:spacing w:before="140" w:after="40"/>
         <w:jc w:val="left"/>
       </w:pPr>
       <w:r>
@@ -2302,14 +2285,14 @@
           <w:rFonts w:ascii="Times New Roman" w:hAnsi="Times New Roman"/>
           <w:b/>
           <w:color w:val="0F172A"/>
-          <w:sz w:val="26"/>
+          <w:sz w:val="25"/>
         </w:rPr>
         <w:t>1.2 Requirement Specifications (Product/System Tasks)</w:t>
       </w:r>
     </w:p>
     <w:p>
       <w:pPr>
-        <w:spacing w:before="0" w:after="80" w:line="269" w:lineRule="auto"/>
+        <w:spacing w:before="0" w:after="70" w:line="264" w:lineRule="auto"/>
         <w:jc w:val="both"/>
       </w:pPr>
       <w:r>
@@ -2319,13 +2302,13 @@
           <w:color w:val="0F172A"/>
           <w:sz w:val="22"/>
         </w:rPr>
-        <w:t>The requirement specifications formally define the operational tasks, behavioral functions, and system performance standards for the E-Commerce Customer Lifecycle &amp; RFM Segmentation system.</w:t>
+        <w:t>The requirement specifications formally define the system tasks, data integrity controls, and operational performance standards for the E-Commerce Customer Lifecycle &amp; RFM Segmentation system.</w:t>
       </w:r>
     </w:p>
     <w:p>
       <w:pPr>
         <w:keepNext/>
-        <w:spacing w:before="120" w:after="40"/>
+        <w:spacing w:before="100" w:after="40"/>
         <w:jc w:val="left"/>
       </w:pPr>
       <w:r>
@@ -2333,14 +2316,14 @@
           <w:rFonts w:ascii="Times New Roman" w:hAnsi="Times New Roman"/>
           <w:b/>
           <w:color w:val="0F172A"/>
-          <w:sz w:val="23"/>
+          <w:sz w:val="22"/>
         </w:rPr>
         <w:t>1.2.1 Functional Requirements Specifications (FR)</w:t>
       </w:r>
     </w:p>
     <w:p>
       <w:pPr>
-        <w:spacing w:before="0" w:after="80" w:line="269" w:lineRule="auto"/>
+        <w:spacing w:before="0" w:after="70" w:line="264" w:lineRule="auto"/>
         <w:jc w:val="both"/>
       </w:pPr>
       <w:r>
@@ -2364,7 +2347,7 @@
     </w:p>
     <w:p>
       <w:pPr>
-        <w:spacing w:before="0" w:after="80" w:line="269" w:lineRule="auto"/>
+        <w:spacing w:before="0" w:after="70" w:line="264" w:lineRule="auto"/>
         <w:jc w:val="both"/>
       </w:pPr>
       <w:r>
@@ -2383,12 +2366,12 @@
           <w:color w:val="0F172A"/>
           <w:sz w:val="22"/>
         </w:rPr>
-        <w:t>Must identify records lacking authenticated CustomerID and drop them to prevent corrupting customer-level longitudinal cohorts.</w:t>
+        <w:t>Must detect records lacking authenticated CustomerID and drop them to prevent corrupting customer-level longitudinal cohorts.</w:t>
       </w:r>
     </w:p>
     <w:p>
       <w:pPr>
-        <w:spacing w:before="0" w:after="80" w:line="269" w:lineRule="auto"/>
+        <w:spacing w:before="0" w:after="70" w:line="264" w:lineRule="auto"/>
         <w:jc w:val="both"/>
       </w:pPr>
       <w:r>
@@ -2398,7 +2381,7 @@
           <w:color w:val="0F172A"/>
           <w:sz w:val="22"/>
         </w:rPr>
-        <w:t xml:space="preserve">• FR-03: Reverse Logistics Isolation: </w:t>
+        <w:t xml:space="preserve">• FR-03: Reverse Logistics Segregation: </w:t>
       </w:r>
       <w:r>
         <w:rPr>
@@ -2407,12 +2390,12 @@
           <w:color w:val="0F172A"/>
           <w:sz w:val="22"/>
         </w:rPr>
-        <w:t>Must segregate credit notes, cancellations (invoices matching '^C'), and non-positive quantities into an audit ledger (fact_reversals_audit.csv) without affecting positive frequency metrics.</w:t>
+        <w:t>Must isolate credit notes, returns (invoices matching '^C'), and non-positive quantities into an audit ledger (fact_reversals_audit.csv) without affecting positive purchase frequency counts.</w:t>
       </w:r>
     </w:p>
     <w:p>
       <w:pPr>
-        <w:spacing w:before="0" w:after="80" w:line="269" w:lineRule="auto"/>
+        <w:spacing w:before="0" w:after="70" w:line="264" w:lineRule="auto"/>
         <w:jc w:val="both"/>
       </w:pPr>
       <w:r>
@@ -2431,12 +2414,12 @@
           <w:color w:val="0F172A"/>
           <w:sz w:val="22"/>
         </w:rPr>
-        <w:t>Must compute Tukey's fences (IQR = Q3 - Q1) across Quantity and UnitPrice to remove bulk B2B anomalies.</w:t>
+        <w:t>Must compute Tukey fences (IQR = Q3 - Q1) on Quantity and UnitPrice to remove bulk B2B anomalies.</w:t>
       </w:r>
     </w:p>
     <w:p>
       <w:pPr>
-        <w:spacing w:before="0" w:after="80" w:line="269" w:lineRule="auto"/>
+        <w:spacing w:before="0" w:after="70" w:line="264" w:lineRule="auto"/>
         <w:jc w:val="both"/>
       </w:pPr>
       <w:r>
@@ -2455,12 +2438,12 @@
           <w:color w:val="0F172A"/>
           <w:sz w:val="22"/>
         </w:rPr>
-        <w:t>Must set T_obs = max(InvoiceDate) + 1 day and compute Recency days, Frequency (unique invoices), Monetary spend, and Average Order Value (AOV = Spend / Frequency).</w:t>
+        <w:t>Must establish snapshot boundary T_obs = max(InvoiceDate) + 1 day and compute Recency days, Frequency (unique invoices via nunique), Monetary spend, and Average Order Value (AOV = Spend / Frequency).</w:t>
       </w:r>
     </w:p>
     <w:p>
       <w:pPr>
-        <w:spacing w:before="0" w:after="80" w:line="269" w:lineRule="auto"/>
+        <w:spacing w:before="0" w:after="70" w:line="264" w:lineRule="auto"/>
         <w:jc w:val="both"/>
       </w:pPr>
       <w:r>
@@ -2479,12 +2462,12 @@
           <w:color w:val="0F172A"/>
           <w:sz w:val="22"/>
         </w:rPr>
-        <w:t>Must apply log1p skew reduction, StandardScaler standardization, evaluate Elbow Inertia and Silhouette scores across k in [2..6], and fit production K-Means.</w:t>
+        <w:t>Must apply log1p skewness reduction, StandardScaler normalization, evaluate Elbow Inertia and Silhouette scores across k in [2..6], and fit production K-Means.</w:t>
       </w:r>
     </w:p>
     <w:p>
       <w:pPr>
-        <w:spacing w:before="0" w:after="80" w:line="269" w:lineRule="auto"/>
+        <w:spacing w:before="0" w:after="70" w:line="264" w:lineRule="auto"/>
         <w:jc w:val="both"/>
       </w:pPr>
       <w:r>
@@ -2503,12 +2486,12 @@
           <w:color w:val="0F172A"/>
           <w:sz w:val="22"/>
         </w:rPr>
-        <w:t>Must provide fallback 1–5 percentile scoring (pd.qcut) mapping accounts to 8 business segments ('Champions', 'Loyal Customers', 'At Risk Whales', etc.).</w:t>
+        <w:t>Must provide fallback 1–5 percentile scoring (pd.qcut) mapping accounts to 8 business operating tiers ('Champions', 'Loyal Customers', 'At Risk Whales', etc.).</w:t>
       </w:r>
     </w:p>
     <w:p>
       <w:pPr>
-        <w:spacing w:before="0" w:after="80" w:line="269" w:lineRule="auto"/>
+        <w:spacing w:before="0" w:after="70" w:line="264" w:lineRule="auto"/>
         <w:jc w:val="both"/>
       </w:pPr>
       <w:r>
@@ -2527,13 +2510,13 @@
           <w:color w:val="0F172A"/>
           <w:sz w:val="22"/>
         </w:rPr>
-        <w:t>Must export clean star-schema tables and render an interactive executive dashboard with KPI scorecards, spatial scatterplots, and a searchable activation ledger.</w:t>
+        <w:t>Must export clean star-schema datasets and render an interactive executive dashboard with KPI scorecards, spatial scatterplots, and a searchable activation ledger.</w:t>
       </w:r>
     </w:p>
     <w:p>
       <w:pPr>
         <w:keepNext/>
-        <w:spacing w:before="120" w:after="40"/>
+        <w:spacing w:before="100" w:after="40"/>
         <w:jc w:val="left"/>
       </w:pPr>
       <w:r>
@@ -2541,14 +2524,14 @@
           <w:rFonts w:ascii="Times New Roman" w:hAnsi="Times New Roman"/>
           <w:b/>
           <w:color w:val="0F172A"/>
-          <w:sz w:val="23"/>
+          <w:sz w:val="22"/>
         </w:rPr>
         <w:t>1.2.2 Non-Functional Requirements Specifications (NFR)</w:t>
       </w:r>
     </w:p>
     <w:p>
       <w:pPr>
-        <w:spacing w:before="0" w:after="80" w:line="269" w:lineRule="auto"/>
+        <w:spacing w:before="0" w:after="70" w:line="264" w:lineRule="auto"/>
         <w:jc w:val="both"/>
       </w:pPr>
       <w:r>
@@ -2567,12 +2550,12 @@
           <w:color w:val="0F172A"/>
           <w:sz w:val="22"/>
         </w:rPr>
-        <w:t>The pipeline must process 15,000+ transactional records in under 5 seconds on standard x86/ARM hardware.</w:t>
+        <w:t>The pipeline must process 15,000+ transactional records in under 5 seconds on standard hardware.</w:t>
       </w:r>
     </w:p>
     <w:p>
       <w:pPr>
-        <w:spacing w:before="0" w:after="80" w:line="269" w:lineRule="auto"/>
+        <w:spacing w:before="0" w:after="70" w:line="264" w:lineRule="auto"/>
         <w:jc w:val="both"/>
       </w:pPr>
       <w:r>
@@ -2591,12 +2574,12 @@
           <w:color w:val="0F172A"/>
           <w:sz w:val="22"/>
         </w:rPr>
-        <w:t>All feature calculations must maintain linear O(N) complexity using vectorized Pandas/NumPy C-routines.</w:t>
+        <w:t>Feature extractions maintain linear O(N) complexity using vectorized Pandas/NumPy C-routines.</w:t>
       </w:r>
     </w:p>
     <w:p>
       <w:pPr>
-        <w:spacing w:before="0" w:after="80" w:line="269" w:lineRule="auto"/>
+        <w:spacing w:before="0" w:after="70" w:line="264" w:lineRule="auto"/>
         <w:jc w:val="both"/>
       </w:pPr>
       <w:r>
@@ -2620,7 +2603,7 @@
     </w:p>
     <w:p>
       <w:pPr>
-        <w:spacing w:before="60" w:after="100"/>
+        <w:spacing w:before="50" w:after="80"/>
         <w:jc w:val="center"/>
       </w:pPr>
       <w:r>
@@ -2628,7 +2611,7 @@
           <w:rFonts w:ascii="Times New Roman" w:hAnsi="Times New Roman"/>
           <w:b/>
           <w:color w:val="475569"/>
-          <w:sz w:val="20"/>
+          <w:sz w:val="19"/>
         </w:rPr>
         <w:t>Table 1.1: System &amp; Hardware/Software Specifications</w:t>
       </w:r>
@@ -3030,7 +3013,7 @@
     </w:p>
     <w:p>
       <w:pPr>
-        <w:spacing w:before="0" w:after="40" w:line="269" w:lineRule="auto"/>
+        <w:spacing w:before="0" w:after="40" w:line="264" w:lineRule="auto"/>
         <w:jc w:val="right"/>
       </w:pPr>
       <w:r>
@@ -3046,7 +3029,7 @@
     <w:p>
       <w:pPr>
         <w:keepNext/>
-        <w:spacing w:before="160" w:after="60"/>
+        <w:spacing w:before="140" w:after="40"/>
         <w:jc w:val="left"/>
       </w:pPr>
       <w:r>
@@ -3054,14 +3037,14 @@
           <w:rFonts w:ascii="Times New Roman" w:hAnsi="Times New Roman"/>
           <w:b/>
           <w:color w:val="0F172A"/>
-          <w:sz w:val="26"/>
+          <w:sz w:val="25"/>
         </w:rPr>
         <w:t>1.3 Tools and Technology Used (Front-End/Back-End/Framework/Protocol/API/Services/App. etc.)</w:t>
       </w:r>
     </w:p>
     <w:p>
       <w:pPr>
-        <w:spacing w:before="0" w:after="80" w:line="269" w:lineRule="auto"/>
+        <w:spacing w:before="0" w:after="70" w:line="264" w:lineRule="auto"/>
         <w:jc w:val="both"/>
       </w:pPr>
       <w:r>
@@ -3077,7 +3060,7 @@
     <w:p>
       <w:pPr>
         <w:keepNext/>
-        <w:spacing w:before="120" w:after="40"/>
+        <w:spacing w:before="100" w:after="40"/>
         <w:jc w:val="left"/>
       </w:pPr>
       <w:r>
@@ -3085,14 +3068,14 @@
           <w:rFonts w:ascii="Times New Roman" w:hAnsi="Times New Roman"/>
           <w:b/>
           <w:color w:val="0F172A"/>
-          <w:sz w:val="23"/>
+          <w:sz w:val="22"/>
         </w:rPr>
         <w:t>1.3.1 Core Processing &amp; Numerical Computing</w:t>
       </w:r>
     </w:p>
     <w:p>
       <w:pPr>
-        <w:spacing w:before="0" w:after="80" w:line="269" w:lineRule="auto"/>
+        <w:spacing w:before="0" w:after="70" w:line="264" w:lineRule="auto"/>
         <w:jc w:val="both"/>
       </w:pPr>
       <w:r>
@@ -3116,7 +3099,7 @@
     </w:p>
     <w:p>
       <w:pPr>
-        <w:spacing w:before="0" w:after="80" w:line="269" w:lineRule="auto"/>
+        <w:spacing w:before="0" w:after="70" w:line="264" w:lineRule="auto"/>
         <w:jc w:val="both"/>
       </w:pPr>
       <w:r>
@@ -3140,7 +3123,7 @@
     </w:p>
     <w:p>
       <w:pPr>
-        <w:spacing w:before="0" w:after="80" w:line="269" w:lineRule="auto"/>
+        <w:spacing w:before="0" w:after="70" w:line="264" w:lineRule="auto"/>
         <w:jc w:val="both"/>
       </w:pPr>
       <w:r>
@@ -3165,7 +3148,7 @@
     <w:p>
       <w:pPr>
         <w:keepNext/>
-        <w:spacing w:before="120" w:after="40"/>
+        <w:spacing w:before="100" w:after="40"/>
         <w:jc w:val="left"/>
       </w:pPr>
       <w:r>
@@ -3173,14 +3156,14 @@
           <w:rFonts w:ascii="Times New Roman" w:hAnsi="Times New Roman"/>
           <w:b/>
           <w:color w:val="0F172A"/>
-          <w:sz w:val="23"/>
+          <w:sz w:val="22"/>
         </w:rPr>
         <w:t>1.3.2 Machine Learning &amp; Statistical Modeling</w:t>
       </w:r>
     </w:p>
     <w:p>
       <w:pPr>
-        <w:spacing w:before="0" w:after="80" w:line="269" w:lineRule="auto"/>
+        <w:spacing w:before="0" w:after="70" w:line="264" w:lineRule="auto"/>
         <w:jc w:val="both"/>
       </w:pPr>
       <w:r>
@@ -3204,7 +3187,7 @@
     </w:p>
     <w:p>
       <w:pPr>
-        <w:spacing w:before="0" w:after="80" w:line="269" w:lineRule="auto"/>
+        <w:spacing w:before="0" w:after="70" w:line="264" w:lineRule="auto"/>
         <w:jc w:val="both"/>
       </w:pPr>
       <w:r>
@@ -3229,7 +3212,7 @@
     <w:p>
       <w:pPr>
         <w:keepNext/>
-        <w:spacing w:before="120" w:after="40"/>
+        <w:spacing w:before="100" w:after="40"/>
         <w:jc w:val="left"/>
       </w:pPr>
       <w:r>
@@ -3237,14 +3220,14 @@
           <w:rFonts w:ascii="Times New Roman" w:hAnsi="Times New Roman"/>
           <w:b/>
           <w:color w:val="0F172A"/>
-          <w:sz w:val="23"/>
+          <w:sz w:val="22"/>
         </w:rPr>
         <w:t>1.3.3 Presentation, Dashboards &amp; Storage</w:t>
       </w:r>
     </w:p>
     <w:p>
       <w:pPr>
-        <w:spacing w:before="0" w:after="80" w:line="269" w:lineRule="auto"/>
+        <w:spacing w:before="0" w:after="70" w:line="264" w:lineRule="auto"/>
         <w:jc w:val="both"/>
       </w:pPr>
       <w:r>
@@ -3268,7 +3251,7 @@
     </w:p>
     <w:p>
       <w:pPr>
-        <w:spacing w:before="0" w:after="80" w:line="269" w:lineRule="auto"/>
+        <w:spacing w:before="0" w:after="70" w:line="264" w:lineRule="auto"/>
         <w:jc w:val="both"/>
       </w:pPr>
       <w:r>
@@ -3292,7 +3275,7 @@
     </w:p>
     <w:p>
       <w:pPr>
-        <w:spacing w:before="0" w:after="80" w:line="269" w:lineRule="auto"/>
+        <w:spacing w:before="0" w:after="70" w:line="264" w:lineRule="auto"/>
         <w:jc w:val="both"/>
       </w:pPr>
       <w:r>
@@ -3316,7 +3299,7 @@
     </w:p>
     <w:p>
       <w:pPr>
-        <w:spacing w:before="0" w:after="80" w:line="269" w:lineRule="auto"/>
+        <w:spacing w:before="0" w:after="70" w:line="264" w:lineRule="auto"/>
         <w:jc w:val="both"/>
       </w:pPr>
       <w:r>
@@ -3340,7 +3323,7 @@
     </w:p>
     <w:p>
       <w:pPr>
-        <w:spacing w:before="60" w:after="100"/>
+        <w:spacing w:before="50" w:after="80"/>
         <w:jc w:val="center"/>
       </w:pPr>
       <w:r>
@@ -3348,7 +3331,7 @@
           <w:rFonts w:ascii="Times New Roman" w:hAnsi="Times New Roman"/>
           <w:b/>
           <w:color w:val="475569"/>
-          <w:sz w:val="20"/>
+          <w:sz w:val="19"/>
         </w:rPr>
         <w:t>Table 1.2: Technology Stack &amp; Architectural Layer Mapping</w:t>
       </w:r>
@@ -3750,7 +3733,7 @@
     </w:p>
     <w:p>
       <w:pPr>
-        <w:spacing w:before="0" w:after="40" w:line="269" w:lineRule="auto"/>
+        <w:spacing w:before="0" w:after="40" w:line="264" w:lineRule="auto"/>
         <w:jc w:val="right"/>
       </w:pPr>
       <w:r>
@@ -3766,7 +3749,7 @@
     <w:p>
       <w:pPr>
         <w:keepNext/>
-        <w:spacing w:before="200" w:after="80"/>
+        <w:spacing w:before="160" w:after="60"/>
         <w:jc w:val="left"/>
       </w:pPr>
       <w:r>
@@ -3774,7 +3757,7 @@
           <w:rFonts w:ascii="Times New Roman" w:hAnsi="Times New Roman"/>
           <w:b/>
           <w:color w:val="1E1B4B"/>
-          <w:sz w:val="30"/>
+          <w:sz w:val="29"/>
         </w:rPr>
         <w:t>2. SYSTEM DESIGN USING UML:</w:t>
       </w:r>
@@ -3782,7 +3765,7 @@
     <w:p>
       <w:pPr>
         <w:keepNext/>
-        <w:spacing w:before="160" w:after="60"/>
+        <w:spacing w:before="140" w:after="40"/>
         <w:jc w:val="left"/>
       </w:pPr>
       <w:r>
@@ -3790,14 +3773,14 @@
           <w:rFonts w:ascii="Times New Roman" w:hAnsi="Times New Roman"/>
           <w:b/>
           <w:color w:val="0F172A"/>
-          <w:sz w:val="26"/>
+          <w:sz w:val="25"/>
         </w:rPr>
         <w:t>2.1 Data Flow Diagrams (1 Level DFD, 2 Level DFD must).</w:t>
       </w:r>
     </w:p>
     <w:p>
       <w:pPr>
-        <w:spacing w:before="0" w:after="80" w:line="269" w:lineRule="auto"/>
+        <w:spacing w:before="0" w:after="70" w:line="264" w:lineRule="auto"/>
         <w:jc w:val="both"/>
       </w:pPr>
       <w:r>
@@ -3807,12 +3790,12 @@
           <w:color w:val="0F172A"/>
           <w:sz w:val="22"/>
         </w:rPr>
-        <w:t>Data Flow Diagrams (DFDs) provide a graphical representation of information flow across the system, modeling processes, external entities, data stores, and directional data pathways following Gane &amp; Sarson conventions:</w:t>
+        <w:t>Data Flow Diagrams (DFDs) model information flow across the system, representing transformations, external entities, data stores, and directional data pathways following Gane &amp; Sarson conventions:</w:t>
       </w:r>
     </w:p>
     <w:p>
       <w:pPr>
-        <w:spacing w:before="0" w:after="80" w:line="269" w:lineRule="auto"/>
+        <w:spacing w:before="0" w:after="70" w:line="264" w:lineRule="auto"/>
         <w:jc w:val="both"/>
       </w:pPr>
       <w:r>
@@ -3837,7 +3820,7 @@
     <w:p>
       <w:pPr>
         <w:keepNext/>
-        <w:spacing w:before="120" w:after="40"/>
+        <w:spacing w:before="100" w:after="40"/>
         <w:jc w:val="left"/>
       </w:pPr>
       <w:r>
@@ -3845,14 +3828,14 @@
           <w:rFonts w:ascii="Times New Roman" w:hAnsi="Times New Roman"/>
           <w:b/>
           <w:color w:val="0F172A"/>
-          <w:sz w:val="23"/>
+          <w:sz w:val="22"/>
         </w:rPr>
         <w:t>2.1.1 Level 0 Data Flow Diagram (Context-Level DFD)</w:t>
       </w:r>
     </w:p>
     <w:p>
       <w:pPr>
-        <w:spacing w:before="0" w:after="80" w:line="269" w:lineRule="auto"/>
+        <w:spacing w:before="0" w:after="70" w:line="264" w:lineRule="auto"/>
         <w:jc w:val="both"/>
       </w:pPr>
       <w:r>
@@ -3903,7 +3886,7 @@
     </w:p>
     <w:p>
       <w:pPr>
-        <w:spacing w:before="60" w:after="100"/>
+        <w:spacing w:before="50" w:after="80"/>
         <w:jc w:val="center"/>
       </w:pPr>
       <w:r>
@@ -3911,7 +3894,7 @@
           <w:rFonts w:ascii="Times New Roman" w:hAnsi="Times New Roman"/>
           <w:b/>
           <w:color w:val="475569"/>
-          <w:sz w:val="20"/>
+          <w:sz w:val="19"/>
         </w:rPr>
         <w:t>Figure 2.1: Level 0 Data Flow Diagram (Context-Level DFD)</w:t>
       </w:r>
@@ -3923,7 +3906,7 @@
     </w:p>
     <w:p>
       <w:pPr>
-        <w:spacing w:before="0" w:after="40" w:line="269" w:lineRule="auto"/>
+        <w:spacing w:before="0" w:after="40" w:line="264" w:lineRule="auto"/>
         <w:jc w:val="right"/>
       </w:pPr>
       <w:r>
@@ -3939,7 +3922,7 @@
     <w:p>
       <w:pPr>
         <w:keepNext/>
-        <w:spacing w:before="120" w:after="40"/>
+        <w:spacing w:before="100" w:after="40"/>
         <w:jc w:val="left"/>
       </w:pPr>
       <w:r>
@@ -3947,14 +3930,14 @@
           <w:rFonts w:ascii="Times New Roman" w:hAnsi="Times New Roman"/>
           <w:b/>
           <w:color w:val="0F172A"/>
-          <w:sz w:val="23"/>
+          <w:sz w:val="22"/>
         </w:rPr>
         <w:t>2.1.2 Level 1 Data Flow Diagram (End-to-End Pipeline Architecture)</w:t>
       </w:r>
     </w:p>
     <w:p>
       <w:pPr>
-        <w:spacing w:before="0" w:after="80" w:line="269" w:lineRule="auto"/>
+        <w:spacing w:before="0" w:after="70" w:line="264" w:lineRule="auto"/>
         <w:jc w:val="both"/>
       </w:pPr>
       <w:r>
@@ -3969,7 +3952,7 @@
     </w:p>
     <w:p>
       <w:pPr>
-        <w:spacing w:before="0" w:after="80" w:line="269" w:lineRule="auto"/>
+        <w:spacing w:before="0" w:after="70" w:line="264" w:lineRule="auto"/>
         <w:jc w:val="both"/>
       </w:pPr>
       <w:r>
@@ -3993,7 +3976,7 @@
     </w:p>
     <w:p>
       <w:pPr>
-        <w:spacing w:before="0" w:after="80" w:line="269" w:lineRule="auto"/>
+        <w:spacing w:before="0" w:after="70" w:line="264" w:lineRule="auto"/>
         <w:jc w:val="both"/>
       </w:pPr>
       <w:r>
@@ -4017,7 +4000,7 @@
     </w:p>
     <w:p>
       <w:pPr>
-        <w:spacing w:before="0" w:after="80" w:line="269" w:lineRule="auto"/>
+        <w:spacing w:before="0" w:after="70" w:line="264" w:lineRule="auto"/>
         <w:jc w:val="both"/>
       </w:pPr>
       <w:r>
@@ -4041,7 +4024,7 @@
     </w:p>
     <w:p>
       <w:pPr>
-        <w:spacing w:before="0" w:after="80" w:line="269" w:lineRule="auto"/>
+        <w:spacing w:before="0" w:after="70" w:line="264" w:lineRule="auto"/>
         <w:jc w:val="both"/>
       </w:pPr>
       <w:r>
@@ -4065,7 +4048,7 @@
     </w:p>
     <w:p>
       <w:pPr>
-        <w:spacing w:before="0" w:after="80" w:line="269" w:lineRule="auto"/>
+        <w:spacing w:before="0" w:after="70" w:line="264" w:lineRule="auto"/>
         <w:jc w:val="both"/>
       </w:pPr>
       <w:r>
@@ -4125,7 +4108,7 @@
     </w:p>
     <w:p>
       <w:pPr>
-        <w:spacing w:before="60" w:after="100"/>
+        <w:spacing w:before="50" w:after="80"/>
         <w:jc w:val="center"/>
       </w:pPr>
       <w:r>
@@ -4133,7 +4116,7 @@
           <w:rFonts w:ascii="Times New Roman" w:hAnsi="Times New Roman"/>
           <w:b/>
           <w:color w:val="475569"/>
-          <w:sz w:val="20"/>
+          <w:sz w:val="19"/>
         </w:rPr>
         <w:t>Figure 2.2: Level 1 Data Flow Diagram (End-to-End Pipeline Architecture)</w:t>
       </w:r>
@@ -4145,7 +4128,7 @@
     </w:p>
     <w:p>
       <w:pPr>
-        <w:spacing w:before="0" w:after="40" w:line="269" w:lineRule="auto"/>
+        <w:spacing w:before="0" w:after="40" w:line="264" w:lineRule="auto"/>
         <w:jc w:val="right"/>
       </w:pPr>
       <w:r>
@@ -4161,7 +4144,7 @@
     <w:p>
       <w:pPr>
         <w:keepNext/>
-        <w:spacing w:before="120" w:after="40"/>
+        <w:spacing w:before="100" w:after="40"/>
         <w:jc w:val="left"/>
       </w:pPr>
       <w:r>
@@ -4169,14 +4152,14 @@
           <w:rFonts w:ascii="Times New Roman" w:hAnsi="Times New Roman"/>
           <w:b/>
           <w:color w:val="0F172A"/>
-          <w:sz w:val="23"/>
+          <w:sz w:val="22"/>
         </w:rPr>
         <w:t>2.1.3 Level 2 Data Flow Diagram (Sub-Process Decomposition)</w:t>
       </w:r>
     </w:p>
     <w:p>
       <w:pPr>
-        <w:spacing w:before="0" w:after="80" w:line="269" w:lineRule="auto"/>
+        <w:spacing w:before="0" w:after="70" w:line="264" w:lineRule="auto"/>
         <w:jc w:val="both"/>
       </w:pPr>
       <w:r>
@@ -4191,7 +4174,7 @@
     </w:p>
     <w:p>
       <w:pPr>
-        <w:spacing w:before="0" w:after="80" w:line="269" w:lineRule="auto"/>
+        <w:spacing w:before="0" w:after="70" w:line="264" w:lineRule="auto"/>
         <w:jc w:val="both"/>
       </w:pPr>
       <w:r>
@@ -4215,7 +4198,7 @@
     </w:p>
     <w:p>
       <w:pPr>
-        <w:spacing w:before="0" w:after="80" w:line="269" w:lineRule="auto"/>
+        <w:spacing w:before="0" w:after="70" w:line="264" w:lineRule="auto"/>
         <w:jc w:val="both"/>
       </w:pPr>
       <w:r>
@@ -4275,7 +4258,7 @@
     </w:p>
     <w:p>
       <w:pPr>
-        <w:spacing w:before="60" w:after="100"/>
+        <w:spacing w:before="50" w:after="80"/>
         <w:jc w:val="center"/>
       </w:pPr>
       <w:r>
@@ -4283,7 +4266,7 @@
           <w:rFonts w:ascii="Times New Roman" w:hAnsi="Times New Roman"/>
           <w:b/>
           <w:color w:val="475569"/>
-          <w:sz w:val="20"/>
+          <w:sz w:val="19"/>
         </w:rPr>
         <w:t>Figure 2.3: Level 2 Data Flow Diagram (Refinery &amp; ML Decomposition)</w:t>
       </w:r>
@@ -4295,7 +4278,7 @@
     </w:p>
     <w:p>
       <w:pPr>
-        <w:spacing w:before="0" w:after="40" w:line="269" w:lineRule="auto"/>
+        <w:spacing w:before="0" w:after="20" w:line="264" w:lineRule="auto"/>
         <w:jc w:val="right"/>
       </w:pPr>
       <w:r>
@@ -4311,7 +4294,7 @@
     <w:p>
       <w:pPr>
         <w:keepNext/>
-        <w:spacing w:before="160" w:after="60"/>
+        <w:spacing w:before="40" w:after="20"/>
         <w:jc w:val="left"/>
       </w:pPr>
       <w:r>
@@ -4319,14 +4302,14 @@
           <w:rFonts w:ascii="Times New Roman" w:hAnsi="Times New Roman"/>
           <w:b/>
           <w:color w:val="0F172A"/>
-          <w:sz w:val="26"/>
+          <w:sz w:val="25"/>
         </w:rPr>
         <w:t>2.2 Use Case Diagram &amp; Milestone Tracking.</w:t>
       </w:r>
     </w:p>
     <w:p>
       <w:pPr>
-        <w:spacing w:before="0" w:after="80" w:line="269" w:lineRule="auto"/>
+        <w:spacing w:before="0" w:after="40" w:line="264" w:lineRule="auto"/>
         <w:jc w:val="both"/>
       </w:pPr>
       <w:r>
@@ -4336,14 +4319,14 @@
           <w:color w:val="0F172A"/>
           <w:sz w:val="22"/>
         </w:rPr>
-        <w:t>The Use Case Model delineates the functional boundaries of the system by illustrating interactions between primary human and automated actors and the system's operational capabilities.</w:t>
+        <w:t>The Use Case Model defines system boundaries by mapping interactions between primary actors and the platform's operational capabilities.</w:t>
       </w:r>
     </w:p>
     <w:p>
       <w:r>
         <w:drawing>
           <wp:inline xmlns:a="http://schemas.openxmlformats.org/drawingml/2006/main" xmlns:pic="http://schemas.openxmlformats.org/drawingml/2006/picture">
-            <wp:extent cx="3383280" cy="2199132"/>
+            <wp:extent cx="2926080" cy="1901952"/>
             <wp:docPr id="5" name="Picture 5"/>
             <wp:cNvGraphicFramePr>
               <a:graphicFrameLocks noChangeAspect="1"/>
@@ -4364,7 +4347,7 @@
                   <pic:spPr>
                     <a:xfrm>
                       <a:off x="0" y="0"/>
-                      <a:ext cx="3383280" cy="2199132"/>
+                      <a:ext cx="2926080" cy="1901952"/>
                     </a:xfrm>
                     <a:prstGeom prst="rect"/>
                   </pic:spPr>
@@ -4377,7 +4360,7 @@
     </w:p>
     <w:p>
       <w:pPr>
-        <w:spacing w:before="60" w:after="100"/>
+        <w:spacing w:before="50" w:after="80"/>
         <w:jc w:val="center"/>
       </w:pPr>
       <w:r>
@@ -4385,14 +4368,14 @@
           <w:rFonts w:ascii="Times New Roman" w:hAnsi="Times New Roman"/>
           <w:b/>
           <w:color w:val="475569"/>
-          <w:sz w:val="20"/>
+          <w:sz w:val="19"/>
         </w:rPr>
         <w:t>Figure 2.4: UML Use Case Diagram (System Actors &amp; Capabilities)</w:t>
       </w:r>
     </w:p>
     <w:p>
       <w:pPr>
-        <w:spacing w:before="60" w:after="100"/>
+        <w:spacing w:before="50" w:after="80"/>
         <w:jc w:val="center"/>
       </w:pPr>
       <w:r>
@@ -4400,7 +4383,7 @@
           <w:rFonts w:ascii="Times New Roman" w:hAnsi="Times New Roman"/>
           <w:b/>
           <w:color w:val="475569"/>
-          <w:sz w:val="20"/>
+          <w:sz w:val="19"/>
         </w:rPr>
         <w:t>Table 2.1: Formal Use Case Specification Matrix (UC-01 to UC-06)</w:t>
       </w:r>
@@ -4429,7 +4412,7 @@
                 <w:rFonts w:ascii="Times New Roman" w:hAnsi="Times New Roman"/>
                 <w:b/>
                 <w:color w:val="FFFFFF"/>
-                <w:sz w:val="16"/>
+                <w:sz w:val="15"/>
               </w:rPr>
               <w:t>UC ID</w:t>
             </w:r>
@@ -4446,7 +4429,7 @@
                 <w:rFonts w:ascii="Times New Roman" w:hAnsi="Times New Roman"/>
                 <w:b/>
                 <w:color w:val="FFFFFF"/>
-                <w:sz w:val="16"/>
+                <w:sz w:val="15"/>
               </w:rPr>
               <w:t>USE CASE NAME</w:t>
             </w:r>
@@ -4463,7 +4446,7 @@
                 <w:rFonts w:ascii="Times New Roman" w:hAnsi="Times New Roman"/>
                 <w:b/>
                 <w:color w:val="FFFFFF"/>
-                <w:sz w:val="16"/>
+                <w:sz w:val="15"/>
               </w:rPr>
               <w:t>PRIMARY ACTOR</w:t>
             </w:r>
@@ -4480,7 +4463,7 @@
                 <w:rFonts w:ascii="Times New Roman" w:hAnsi="Times New Roman"/>
                 <w:b/>
                 <w:color w:val="FFFFFF"/>
-                <w:sz w:val="16"/>
+                <w:sz w:val="15"/>
               </w:rPr>
               <w:t>OPERATIONAL GOAL &amp; PRE-CONDITION</w:t>
             </w:r>
@@ -4492,10 +4475,10 @@
           <w:tcPr>
             <w:tcW w:type="dxa" w:w="2340"/>
             <w:tcMar>
-              <w:top w:w="20" w:type="dxa"/>
-              <w:bottom w:w="20" w:type="dxa"/>
-              <w:left w:w="40" w:type="dxa"/>
-              <w:right w:w="40" w:type="dxa"/>
+              <w:top w:w="14" w:type="dxa"/>
+              <w:bottom w:w="14" w:type="dxa"/>
+              <w:left w:w="30" w:type="dxa"/>
+              <w:right w:w="30" w:type="dxa"/>
             </w:tcMar>
             <w:shd w:fill="F8FAFC"/>
           </w:tcPr>
@@ -4503,7 +4486,7 @@
             <w:r>
               <w:rPr>
                 <w:rFonts w:ascii="Times New Roman" w:hAnsi="Times New Roman"/>
-                <w:sz w:val="15"/>
+                <w:sz w:val="14"/>
               </w:rPr>
               <w:t>UC-01</w:t>
             </w:r>
@@ -4513,10 +4496,10 @@
           <w:tcPr>
             <w:tcW w:type="dxa" w:w="2340"/>
             <w:tcMar>
-              <w:top w:w="20" w:type="dxa"/>
-              <w:bottom w:w="20" w:type="dxa"/>
-              <w:left w:w="40" w:type="dxa"/>
-              <w:right w:w="40" w:type="dxa"/>
+              <w:top w:w="14" w:type="dxa"/>
+              <w:bottom w:w="14" w:type="dxa"/>
+              <w:left w:w="30" w:type="dxa"/>
+              <w:right w:w="30" w:type="dxa"/>
             </w:tcMar>
             <w:shd w:fill="F8FAFC"/>
           </w:tcPr>
@@ -4524,7 +4507,7 @@
             <w:r>
               <w:rPr>
                 <w:rFonts w:ascii="Times New Roman" w:hAnsi="Times New Roman"/>
-                <w:sz w:val="15"/>
+                <w:sz w:val="14"/>
               </w:rPr>
               <w:t>Ingest Transaction Stream</w:t>
             </w:r>
@@ -4534,10 +4517,10 @@
           <w:tcPr>
             <w:tcW w:type="dxa" w:w="2340"/>
             <w:tcMar>
-              <w:top w:w="20" w:type="dxa"/>
-              <w:bottom w:w="20" w:type="dxa"/>
-              <w:left w:w="40" w:type="dxa"/>
-              <w:right w:w="40" w:type="dxa"/>
+              <w:top w:w="14" w:type="dxa"/>
+              <w:bottom w:w="14" w:type="dxa"/>
+              <w:left w:w="30" w:type="dxa"/>
+              <w:right w:w="30" w:type="dxa"/>
             </w:tcMar>
             <w:shd w:fill="F8FAFC"/>
           </w:tcPr>
@@ -4545,7 +4528,7 @@
             <w:r>
               <w:rPr>
                 <w:rFonts w:ascii="Times New Roman" w:hAnsi="Times New Roman"/>
-                <w:sz w:val="15"/>
+                <w:sz w:val="14"/>
               </w:rPr>
               <w:t>Data Engineer / Admin</w:t>
             </w:r>
@@ -4555,10 +4538,10 @@
           <w:tcPr>
             <w:tcW w:type="dxa" w:w="2340"/>
             <w:tcMar>
-              <w:top w:w="20" w:type="dxa"/>
-              <w:bottom w:w="20" w:type="dxa"/>
-              <w:left w:w="40" w:type="dxa"/>
-              <w:right w:w="40" w:type="dxa"/>
+              <w:top w:w="14" w:type="dxa"/>
+              <w:bottom w:w="14" w:type="dxa"/>
+              <w:left w:w="30" w:type="dxa"/>
+              <w:right w:w="30" w:type="dxa"/>
             </w:tcMar>
             <w:shd w:fill="F8FAFC"/>
           </w:tcPr>
@@ -4566,7 +4549,7 @@
             <w:r>
               <w:rPr>
                 <w:rFonts w:ascii="Times New Roman" w:hAnsi="Times New Roman"/>
-                <w:sz w:val="15"/>
+                <w:sz w:val="14"/>
               </w:rPr>
               <w:t>Ingests raw event logs, validates schema, enforces datatypes.</w:t>
             </w:r>
@@ -4578,10 +4561,10 @@
           <w:tcPr>
             <w:tcW w:type="dxa" w:w="2340"/>
             <w:tcMar>
-              <w:top w:w="20" w:type="dxa"/>
-              <w:bottom w:w="20" w:type="dxa"/>
-              <w:left w:w="40" w:type="dxa"/>
-              <w:right w:w="40" w:type="dxa"/>
+              <w:top w:w="14" w:type="dxa"/>
+              <w:bottom w:w="14" w:type="dxa"/>
+              <w:left w:w="30" w:type="dxa"/>
+              <w:right w:w="30" w:type="dxa"/>
             </w:tcMar>
             <w:shd w:fill="FFFFFF"/>
           </w:tcPr>
@@ -4589,7 +4572,7 @@
             <w:r>
               <w:rPr>
                 <w:rFonts w:ascii="Times New Roman" w:hAnsi="Times New Roman"/>
-                <w:sz w:val="15"/>
+                <w:sz w:val="14"/>
               </w:rPr>
               <w:t>UC-02</w:t>
             </w:r>
@@ -4599,10 +4582,10 @@
           <w:tcPr>
             <w:tcW w:type="dxa" w:w="2340"/>
             <w:tcMar>
-              <w:top w:w="20" w:type="dxa"/>
-              <w:bottom w:w="20" w:type="dxa"/>
-              <w:left w:w="40" w:type="dxa"/>
-              <w:right w:w="40" w:type="dxa"/>
+              <w:top w:w="14" w:type="dxa"/>
+              <w:bottom w:w="14" w:type="dxa"/>
+              <w:left w:w="30" w:type="dxa"/>
+              <w:right w:w="30" w:type="dxa"/>
             </w:tcMar>
             <w:shd w:fill="FFFFFF"/>
           </w:tcPr>
@@ -4610,7 +4593,7 @@
             <w:r>
               <w:rPr>
                 <w:rFonts w:ascii="Times New Roman" w:hAnsi="Times New Roman"/>
-                <w:sz w:val="15"/>
+                <w:sz w:val="14"/>
               </w:rPr>
               <w:t>Isolate Reversals &amp; IQR Filter</w:t>
             </w:r>
@@ -4620,10 +4603,10 @@
           <w:tcPr>
             <w:tcW w:type="dxa" w:w="2340"/>
             <w:tcMar>
-              <w:top w:w="20" w:type="dxa"/>
-              <w:bottom w:w="20" w:type="dxa"/>
-              <w:left w:w="40" w:type="dxa"/>
-              <w:right w:w="40" w:type="dxa"/>
+              <w:top w:w="14" w:type="dxa"/>
+              <w:bottom w:w="14" w:type="dxa"/>
+              <w:left w:w="30" w:type="dxa"/>
+              <w:right w:w="30" w:type="dxa"/>
             </w:tcMar>
             <w:shd w:fill="FFFFFF"/>
           </w:tcPr>
@@ -4631,7 +4614,7 @@
             <w:r>
               <w:rPr>
                 <w:rFonts w:ascii="Times New Roman" w:hAnsi="Times New Roman"/>
-                <w:sz w:val="15"/>
+                <w:sz w:val="14"/>
               </w:rPr>
               <w:t>Data Engineer / Admin</w:t>
             </w:r>
@@ -4641,10 +4624,10 @@
           <w:tcPr>
             <w:tcW w:type="dxa" w:w="2340"/>
             <w:tcMar>
-              <w:top w:w="20" w:type="dxa"/>
-              <w:bottom w:w="20" w:type="dxa"/>
-              <w:left w:w="40" w:type="dxa"/>
-              <w:right w:w="40" w:type="dxa"/>
+              <w:top w:w="14" w:type="dxa"/>
+              <w:bottom w:w="14" w:type="dxa"/>
+              <w:left w:w="30" w:type="dxa"/>
+              <w:right w:w="30" w:type="dxa"/>
             </w:tcMar>
             <w:shd w:fill="FFFFFF"/>
           </w:tcPr>
@@ -4652,7 +4635,7 @@
             <w:r>
               <w:rPr>
                 <w:rFonts w:ascii="Times New Roman" w:hAnsi="Times New Roman"/>
-                <w:sz w:val="15"/>
+                <w:sz w:val="14"/>
               </w:rPr>
               <w:t>Purges null IDs, isolates returns (^C), caps Tukey bulk outliers.</w:t>
             </w:r>
@@ -4664,10 +4647,10 @@
           <w:tcPr>
             <w:tcW w:type="dxa" w:w="2340"/>
             <w:tcMar>
-              <w:top w:w="20" w:type="dxa"/>
-              <w:bottom w:w="20" w:type="dxa"/>
-              <w:left w:w="40" w:type="dxa"/>
-              <w:right w:w="40" w:type="dxa"/>
+              <w:top w:w="14" w:type="dxa"/>
+              <w:bottom w:w="14" w:type="dxa"/>
+              <w:left w:w="30" w:type="dxa"/>
+              <w:right w:w="30" w:type="dxa"/>
             </w:tcMar>
             <w:shd w:fill="F8FAFC"/>
           </w:tcPr>
@@ -4675,7 +4658,7 @@
             <w:r>
               <w:rPr>
                 <w:rFonts w:ascii="Times New Roman" w:hAnsi="Times New Roman"/>
-                <w:sz w:val="15"/>
+                <w:sz w:val="14"/>
               </w:rPr>
               <w:t>UC-03</w:t>
             </w:r>
@@ -4685,10 +4668,10 @@
           <w:tcPr>
             <w:tcW w:type="dxa" w:w="2340"/>
             <w:tcMar>
-              <w:top w:w="20" w:type="dxa"/>
-              <w:bottom w:w="20" w:type="dxa"/>
-              <w:left w:w="40" w:type="dxa"/>
-              <w:right w:w="40" w:type="dxa"/>
+              <w:top w:w="14" w:type="dxa"/>
+              <w:bottom w:w="14" w:type="dxa"/>
+              <w:left w:w="30" w:type="dxa"/>
+              <w:right w:w="30" w:type="dxa"/>
             </w:tcMar>
             <w:shd w:fill="F8FAFC"/>
           </w:tcPr>
@@ -4696,7 +4679,7 @@
             <w:r>
               <w:rPr>
                 <w:rFonts w:ascii="Times New Roman" w:hAnsi="Times New Roman"/>
-                <w:sz w:val="15"/>
+                <w:sz w:val="14"/>
               </w:rPr>
               <w:t>Compute Vectorized RFM</w:t>
             </w:r>
@@ -4706,10 +4689,10 @@
           <w:tcPr>
             <w:tcW w:type="dxa" w:w="2340"/>
             <w:tcMar>
-              <w:top w:w="20" w:type="dxa"/>
-              <w:bottom w:w="20" w:type="dxa"/>
-              <w:left w:w="40" w:type="dxa"/>
-              <w:right w:w="40" w:type="dxa"/>
+              <w:top w:w="14" w:type="dxa"/>
+              <w:bottom w:w="14" w:type="dxa"/>
+              <w:left w:w="30" w:type="dxa"/>
+              <w:right w:w="30" w:type="dxa"/>
             </w:tcMar>
             <w:shd w:fill="F8FAFC"/>
           </w:tcPr>
@@ -4717,7 +4700,7 @@
             <w:r>
               <w:rPr>
                 <w:rFonts w:ascii="Times New Roman" w:hAnsi="Times New Roman"/>
-                <w:sz w:val="15"/>
+                <w:sz w:val="14"/>
               </w:rPr>
               <w:t>Analytics Engineer</w:t>
             </w:r>
@@ -4727,10 +4710,10 @@
           <w:tcPr>
             <w:tcW w:type="dxa" w:w="2340"/>
             <w:tcMar>
-              <w:top w:w="20" w:type="dxa"/>
-              <w:bottom w:w="20" w:type="dxa"/>
-              <w:left w:w="40" w:type="dxa"/>
-              <w:right w:w="40" w:type="dxa"/>
+              <w:top w:w="14" w:type="dxa"/>
+              <w:bottom w:w="14" w:type="dxa"/>
+              <w:left w:w="30" w:type="dxa"/>
+              <w:right w:w="30" w:type="dxa"/>
             </w:tcMar>
             <w:shd w:fill="F8FAFC"/>
           </w:tcPr>
@@ -4738,7 +4721,7 @@
             <w:r>
               <w:rPr>
                 <w:rFonts w:ascii="Times New Roman" w:hAnsi="Times New Roman"/>
-                <w:sz w:val="15"/>
+                <w:sz w:val="14"/>
               </w:rPr>
               <w:t>Aggregates transactions into customer-level Recency, Frequency, Spend.</w:t>
             </w:r>
@@ -4750,10 +4733,10 @@
           <w:tcPr>
             <w:tcW w:type="dxa" w:w="2340"/>
             <w:tcMar>
-              <w:top w:w="20" w:type="dxa"/>
-              <w:bottom w:w="20" w:type="dxa"/>
-              <w:left w:w="40" w:type="dxa"/>
-              <w:right w:w="40" w:type="dxa"/>
+              <w:top w:w="14" w:type="dxa"/>
+              <w:bottom w:w="14" w:type="dxa"/>
+              <w:left w:w="30" w:type="dxa"/>
+              <w:right w:w="30" w:type="dxa"/>
             </w:tcMar>
             <w:shd w:fill="FFFFFF"/>
           </w:tcPr>
@@ -4761,7 +4744,7 @@
             <w:r>
               <w:rPr>
                 <w:rFonts w:ascii="Times New Roman" w:hAnsi="Times New Roman"/>
-                <w:sz w:val="15"/>
+                <w:sz w:val="14"/>
               </w:rPr>
               <w:t>UC-04</w:t>
             </w:r>
@@ -4771,10 +4754,10 @@
           <w:tcPr>
             <w:tcW w:type="dxa" w:w="2340"/>
             <w:tcMar>
-              <w:top w:w="20" w:type="dxa"/>
-              <w:bottom w:w="20" w:type="dxa"/>
-              <w:left w:w="40" w:type="dxa"/>
-              <w:right w:w="40" w:type="dxa"/>
+              <w:top w:w="14" w:type="dxa"/>
+              <w:bottom w:w="14" w:type="dxa"/>
+              <w:left w:w="30" w:type="dxa"/>
+              <w:right w:w="30" w:type="dxa"/>
             </w:tcMar>
             <w:shd w:fill="FFFFFF"/>
           </w:tcPr>
@@ -4782,7 +4765,7 @@
             <w:r>
               <w:rPr>
                 <w:rFonts w:ascii="Times New Roman" w:hAnsi="Times New Roman"/>
-                <w:sz w:val="15"/>
+                <w:sz w:val="14"/>
               </w:rPr>
               <w:t>Train &amp; Tune K-Means Model</w:t>
             </w:r>
@@ -4792,10 +4775,10 @@
           <w:tcPr>
             <w:tcW w:type="dxa" w:w="2340"/>
             <w:tcMar>
-              <w:top w:w="20" w:type="dxa"/>
-              <w:bottom w:w="20" w:type="dxa"/>
-              <w:left w:w="40" w:type="dxa"/>
-              <w:right w:w="40" w:type="dxa"/>
+              <w:top w:w="14" w:type="dxa"/>
+              <w:bottom w:w="14" w:type="dxa"/>
+              <w:left w:w="30" w:type="dxa"/>
+              <w:right w:w="30" w:type="dxa"/>
             </w:tcMar>
             <w:shd w:fill="FFFFFF"/>
           </w:tcPr>
@@ -4803,7 +4786,7 @@
             <w:r>
               <w:rPr>
                 <w:rFonts w:ascii="Times New Roman" w:hAnsi="Times New Roman"/>
-                <w:sz w:val="15"/>
+                <w:sz w:val="14"/>
               </w:rPr>
               <w:t>Data Scientist</w:t>
             </w:r>
@@ -4813,10 +4796,10 @@
           <w:tcPr>
             <w:tcW w:type="dxa" w:w="2340"/>
             <w:tcMar>
-              <w:top w:w="20" w:type="dxa"/>
-              <w:bottom w:w="20" w:type="dxa"/>
-              <w:left w:w="40" w:type="dxa"/>
-              <w:right w:w="40" w:type="dxa"/>
+              <w:top w:w="14" w:type="dxa"/>
+              <w:bottom w:w="14" w:type="dxa"/>
+              <w:left w:w="30" w:type="dxa"/>
+              <w:right w:w="30" w:type="dxa"/>
             </w:tcMar>
             <w:shd w:fill="FFFFFF"/>
           </w:tcPr>
@@ -4824,7 +4807,7 @@
             <w:r>
               <w:rPr>
                 <w:rFonts w:ascii="Times New Roman" w:hAnsi="Times New Roman"/>
-                <w:sz w:val="15"/>
+                <w:sz w:val="14"/>
               </w:rPr>
               <w:t>Applies log1p + StandardScaler, evaluates Elbow/Silhouette, fits k=4.</w:t>
             </w:r>
@@ -4836,10 +4819,10 @@
           <w:tcPr>
             <w:tcW w:type="dxa" w:w="2340"/>
             <w:tcMar>
-              <w:top w:w="20" w:type="dxa"/>
-              <w:bottom w:w="20" w:type="dxa"/>
-              <w:left w:w="40" w:type="dxa"/>
-              <w:right w:w="40" w:type="dxa"/>
+              <w:top w:w="14" w:type="dxa"/>
+              <w:bottom w:w="14" w:type="dxa"/>
+              <w:left w:w="30" w:type="dxa"/>
+              <w:right w:w="30" w:type="dxa"/>
             </w:tcMar>
             <w:shd w:fill="F8FAFC"/>
           </w:tcPr>
@@ -4847,7 +4830,7 @@
             <w:r>
               <w:rPr>
                 <w:rFonts w:ascii="Times New Roman" w:hAnsi="Times New Roman"/>
-                <w:sz w:val="15"/>
+                <w:sz w:val="14"/>
               </w:rPr>
               <w:t>UC-05</w:t>
             </w:r>
@@ -4857,10 +4840,10 @@
           <w:tcPr>
             <w:tcW w:type="dxa" w:w="2340"/>
             <w:tcMar>
-              <w:top w:w="20" w:type="dxa"/>
-              <w:bottom w:w="20" w:type="dxa"/>
-              <w:left w:w="40" w:type="dxa"/>
-              <w:right w:w="40" w:type="dxa"/>
+              <w:top w:w="14" w:type="dxa"/>
+              <w:bottom w:w="14" w:type="dxa"/>
+              <w:left w:w="30" w:type="dxa"/>
+              <w:right w:w="30" w:type="dxa"/>
             </w:tcMar>
             <w:shd w:fill="F8FAFC"/>
           </w:tcPr>
@@ -4868,7 +4851,7 @@
             <w:r>
               <w:rPr>
                 <w:rFonts w:ascii="Times New Roman" w:hAnsi="Times New Roman"/>
-                <w:sz w:val="15"/>
+                <w:sz w:val="14"/>
               </w:rPr>
               <w:t>Inspect Executive KPI Metrics</w:t>
             </w:r>
@@ -4878,10 +4861,10 @@
           <w:tcPr>
             <w:tcW w:type="dxa" w:w="2340"/>
             <w:tcMar>
-              <w:top w:w="20" w:type="dxa"/>
-              <w:bottom w:w="20" w:type="dxa"/>
-              <w:left w:w="40" w:type="dxa"/>
-              <w:right w:w="40" w:type="dxa"/>
+              <w:top w:w="14" w:type="dxa"/>
+              <w:bottom w:w="14" w:type="dxa"/>
+              <w:left w:w="30" w:type="dxa"/>
+              <w:right w:w="30" w:type="dxa"/>
             </w:tcMar>
             <w:shd w:fill="F8FAFC"/>
           </w:tcPr>
@@ -4889,7 +4872,7 @@
             <w:r>
               <w:rPr>
                 <w:rFonts w:ascii="Times New Roman" w:hAnsi="Times New Roman"/>
-                <w:sz w:val="15"/>
+                <w:sz w:val="14"/>
               </w:rPr>
               <w:t>Commercial Executive</w:t>
             </w:r>
@@ -4899,10 +4882,10 @@
           <w:tcPr>
             <w:tcW w:type="dxa" w:w="2340"/>
             <w:tcMar>
-              <w:top w:w="20" w:type="dxa"/>
-              <w:bottom w:w="20" w:type="dxa"/>
-              <w:left w:w="40" w:type="dxa"/>
-              <w:right w:w="40" w:type="dxa"/>
+              <w:top w:w="14" w:type="dxa"/>
+              <w:bottom w:w="14" w:type="dxa"/>
+              <w:left w:w="30" w:type="dxa"/>
+              <w:right w:w="30" w:type="dxa"/>
             </w:tcMar>
             <w:shd w:fill="F8FAFC"/>
           </w:tcPr>
@@ -4910,7 +4893,7 @@
             <w:r>
               <w:rPr>
                 <w:rFonts w:ascii="Times New Roman" w:hAnsi="Times New Roman"/>
-                <w:sz w:val="15"/>
+                <w:sz w:val="14"/>
               </w:rPr>
               <w:t>Monitors portfolio spend ($65k), Champions share (72.5%), at-risk capital.</w:t>
             </w:r>
@@ -4922,10 +4905,10 @@
           <w:tcPr>
             <w:tcW w:type="dxa" w:w="2340"/>
             <w:tcMar>
-              <w:top w:w="20" w:type="dxa"/>
-              <w:bottom w:w="20" w:type="dxa"/>
-              <w:left w:w="40" w:type="dxa"/>
-              <w:right w:w="40" w:type="dxa"/>
+              <w:top w:w="14" w:type="dxa"/>
+              <w:bottom w:w="14" w:type="dxa"/>
+              <w:left w:w="30" w:type="dxa"/>
+              <w:right w:w="30" w:type="dxa"/>
             </w:tcMar>
             <w:shd w:fill="FFFFFF"/>
           </w:tcPr>
@@ -4933,7 +4916,7 @@
             <w:r>
               <w:rPr>
                 <w:rFonts w:ascii="Times New Roman" w:hAnsi="Times New Roman"/>
-                <w:sz w:val="15"/>
+                <w:sz w:val="14"/>
               </w:rPr>
               <w:t>UC-06</w:t>
             </w:r>
@@ -4943,10 +4926,10 @@
           <w:tcPr>
             <w:tcW w:type="dxa" w:w="2340"/>
             <w:tcMar>
-              <w:top w:w="20" w:type="dxa"/>
-              <w:bottom w:w="20" w:type="dxa"/>
-              <w:left w:w="40" w:type="dxa"/>
-              <w:right w:w="40" w:type="dxa"/>
+              <w:top w:w="14" w:type="dxa"/>
+              <w:bottom w:w="14" w:type="dxa"/>
+              <w:left w:w="30" w:type="dxa"/>
+              <w:right w:w="30" w:type="dxa"/>
             </w:tcMar>
             <w:shd w:fill="FFFFFF"/>
           </w:tcPr>
@@ -4954,7 +4937,7 @@
             <w:r>
               <w:rPr>
                 <w:rFonts w:ascii="Times New Roman" w:hAnsi="Times New Roman"/>
-                <w:sz w:val="15"/>
+                <w:sz w:val="14"/>
               </w:rPr>
               <w:t>Export Targeted CRM Audiences</w:t>
             </w:r>
@@ -4964,10 +4947,10 @@
           <w:tcPr>
             <w:tcW w:type="dxa" w:w="2340"/>
             <w:tcMar>
-              <w:top w:w="20" w:type="dxa"/>
-              <w:bottom w:w="20" w:type="dxa"/>
-              <w:left w:w="40" w:type="dxa"/>
-              <w:right w:w="40" w:type="dxa"/>
+              <w:top w:w="14" w:type="dxa"/>
+              <w:bottom w:w="14" w:type="dxa"/>
+              <w:left w:w="30" w:type="dxa"/>
+              <w:right w:w="30" w:type="dxa"/>
             </w:tcMar>
             <w:shd w:fill="FFFFFF"/>
           </w:tcPr>
@@ -4975,7 +4958,7 @@
             <w:r>
               <w:rPr>
                 <w:rFonts w:ascii="Times New Roman" w:hAnsi="Times New Roman"/>
-                <w:sz w:val="15"/>
+                <w:sz w:val="14"/>
               </w:rPr>
               <w:t>Marketing Manager</w:t>
             </w:r>
@@ -4985,10 +4968,10 @@
           <w:tcPr>
             <w:tcW w:type="dxa" w:w="2340"/>
             <w:tcMar>
-              <w:top w:w="20" w:type="dxa"/>
-              <w:bottom w:w="20" w:type="dxa"/>
-              <w:left w:w="40" w:type="dxa"/>
-              <w:right w:w="40" w:type="dxa"/>
+              <w:top w:w="14" w:type="dxa"/>
+              <w:bottom w:w="14" w:type="dxa"/>
+              <w:left w:w="30" w:type="dxa"/>
+              <w:right w:w="30" w:type="dxa"/>
             </w:tcMar>
             <w:shd w:fill="FFFFFF"/>
           </w:tcPr>
@@ -4996,7 +4979,7 @@
             <w:r>
               <w:rPr>
                 <w:rFonts w:ascii="Times New Roman" w:hAnsi="Times New Roman"/>
-                <w:sz w:val="15"/>
+                <w:sz w:val="14"/>
               </w:rPr>
               <w:t>Filters segments in activation ledger and exports audience lists for campaigns.</w:t>
             </w:r>
@@ -5007,7 +4990,7 @@
     <w:p>
       <w:pPr>
         <w:keepNext/>
-        <w:spacing w:before="100" w:after="40"/>
+        <w:spacing w:before="60" w:after="20"/>
         <w:jc w:val="left"/>
       </w:pPr>
       <w:r>
@@ -5015,14 +4998,14 @@
           <w:rFonts w:ascii="Times New Roman" w:hAnsi="Times New Roman"/>
           <w:b/>
           <w:color w:val="0F172A"/>
-          <w:sz w:val="26"/>
+          <w:sz w:val="25"/>
         </w:rPr>
         <w:t>MILESTONE EVALUATION SUMMARY (24/09/2026)</w:t>
       </w:r>
     </w:p>
     <w:p>
       <w:pPr>
-        <w:spacing w:before="0" w:after="80" w:line="269" w:lineRule="auto"/>
+        <w:spacing w:before="0" w:after="40" w:line="264" w:lineRule="auto"/>
         <w:jc w:val="both"/>
       </w:pPr>
       <w:r>
@@ -5032,12 +5015,12 @@
           <w:color w:val="0F172A"/>
           <w:sz w:val="22"/>
         </w:rPr>
-        <w:t>This submission formally completes the First Progress Work milestone (10 Marks allotted) scheduled for 24/09/2026 for B.Sc. AI and Data Science (Semester V) at Institute of Advanced Research (IAR). All required index sections (1.1, 1.2, 1.3, 2.1, and 2.2) have been fully developed and validated. The technical artifacts, UML models, and data pipelines are complete and ready for supervisor review.</w:t>
+        <w:t>This submission formally completes the First Progress Work milestone (10 Marks) scheduled for 24/09/2026 for B.Sc. in AI and Data Science (Semester V) at Institute of Advanced Research (IAR). All required index sections (1.1, 1.2, 1.3, 2.1, and 2.2) have been fully developed and validated.</w:t>
       </w:r>
     </w:p>
     <w:p>
       <w:pPr>
-        <w:spacing w:before="60" w:after="100"/>
+        <w:spacing w:before="50" w:after="80"/>
         <w:jc w:val="center"/>
       </w:pPr>
       <w:r>
@@ -5045,7 +5028,7 @@
           <w:rFonts w:ascii="Times New Roman" w:hAnsi="Times New Roman"/>
           <w:b/>
           <w:color w:val="475569"/>
-          <w:sz w:val="20"/>
+          <w:sz w:val="19"/>
         </w:rPr>
         <w:t>Table 2.2: Project Progress Work Evaluation &amp; Milestone Tracking</w:t>
       </w:r>
@@ -5075,7 +5058,7 @@
                 <w:rFonts w:ascii="Times New Roman" w:hAnsi="Times New Roman"/>
                 <w:b/>
                 <w:color w:val="FFFFFF"/>
-                <w:sz w:val="15"/>
+                <w:sz w:val="14"/>
               </w:rPr>
               <w:t>DATE</w:t>
             </w:r>
@@ -5092,7 +5075,7 @@
                 <w:rFonts w:ascii="Times New Roman" w:hAnsi="Times New Roman"/>
                 <w:b/>
                 <w:color w:val="FFFFFF"/>
-                <w:sz w:val="15"/>
+                <w:sz w:val="14"/>
               </w:rPr>
               <w:t>ASSESSMENT PARTICULARS</w:t>
             </w:r>
@@ -5109,7 +5092,7 @@
                 <w:rFonts w:ascii="Times New Roman" w:hAnsi="Times New Roman"/>
                 <w:b/>
                 <w:color w:val="FFFFFF"/>
-                <w:sz w:val="15"/>
+                <w:sz w:val="14"/>
               </w:rPr>
               <w:t>INDEX SECTIONS</w:t>
             </w:r>
@@ -5126,7 +5109,7 @@
                 <w:rFonts w:ascii="Times New Roman" w:hAnsi="Times New Roman"/>
                 <w:b/>
                 <w:color w:val="FFFFFF"/>
-                <w:sz w:val="15"/>
+                <w:sz w:val="14"/>
               </w:rPr>
               <w:t>MARKS</w:t>
             </w:r>
@@ -5143,7 +5126,7 @@
                 <w:rFonts w:ascii="Times New Roman" w:hAnsi="Times New Roman"/>
                 <w:b/>
                 <w:color w:val="FFFFFF"/>
-                <w:sz w:val="15"/>
+                <w:sz w:val="14"/>
               </w:rPr>
               <w:t>CURRENT STATUS</w:t>
             </w:r>
@@ -5155,10 +5138,10 @@
           <w:tcPr>
             <w:tcW w:type="dxa" w:w="1872"/>
             <w:tcMar>
-              <w:top w:w="20" w:type="dxa"/>
-              <w:bottom w:w="20" w:type="dxa"/>
-              <w:left w:w="40" w:type="dxa"/>
-              <w:right w:w="40" w:type="dxa"/>
+              <w:top w:w="14" w:type="dxa"/>
+              <w:bottom w:w="14" w:type="dxa"/>
+              <w:left w:w="30" w:type="dxa"/>
+              <w:right w:w="30" w:type="dxa"/>
             </w:tcMar>
             <w:shd w:fill="DCFCE7"/>
           </w:tcPr>
@@ -5167,7 +5150,7 @@
               <w:rPr>
                 <w:rFonts w:ascii="Times New Roman" w:hAnsi="Times New Roman"/>
                 <w:b/>
-                <w:sz w:val="14"/>
+                <w:sz w:val="13"/>
               </w:rPr>
               <w:t>24/09/2026</w:t>
             </w:r>
@@ -5177,10 +5160,10 @@
           <w:tcPr>
             <w:tcW w:type="dxa" w:w="1872"/>
             <w:tcMar>
-              <w:top w:w="20" w:type="dxa"/>
-              <w:bottom w:w="20" w:type="dxa"/>
-              <w:left w:w="40" w:type="dxa"/>
-              <w:right w:w="40" w:type="dxa"/>
+              <w:top w:w="14" w:type="dxa"/>
+              <w:bottom w:w="14" w:type="dxa"/>
+              <w:left w:w="30" w:type="dxa"/>
+              <w:right w:w="30" w:type="dxa"/>
             </w:tcMar>
             <w:shd w:fill="DCFCE7"/>
           </w:tcPr>
@@ -5189,7 +5172,7 @@
               <w:rPr>
                 <w:rFonts w:ascii="Times New Roman" w:hAnsi="Times New Roman"/>
                 <w:b/>
-                <w:sz w:val="14"/>
+                <w:sz w:val="13"/>
               </w:rPr>
               <w:t>First Progress Work</w:t>
             </w:r>
@@ -5199,10 +5182,10 @@
           <w:tcPr>
             <w:tcW w:type="dxa" w:w="1872"/>
             <w:tcMar>
-              <w:top w:w="20" w:type="dxa"/>
-              <w:bottom w:w="20" w:type="dxa"/>
-              <w:left w:w="40" w:type="dxa"/>
-              <w:right w:w="40" w:type="dxa"/>
+              <w:top w:w="14" w:type="dxa"/>
+              <w:bottom w:w="14" w:type="dxa"/>
+              <w:left w:w="30" w:type="dxa"/>
+              <w:right w:w="30" w:type="dxa"/>
             </w:tcMar>
             <w:shd w:fill="DCFCE7"/>
           </w:tcPr>
@@ -5211,7 +5194,7 @@
               <w:rPr>
                 <w:rFonts w:ascii="Times New Roman" w:hAnsi="Times New Roman"/>
                 <w:b/>
-                <w:sz w:val="14"/>
+                <w:sz w:val="13"/>
               </w:rPr>
               <w:t>1.1, 1.2, 1.3, 2.1, 2.2</w:t>
             </w:r>
@@ -5221,10 +5204,10 @@
           <w:tcPr>
             <w:tcW w:type="dxa" w:w="1872"/>
             <w:tcMar>
-              <w:top w:w="20" w:type="dxa"/>
-              <w:bottom w:w="20" w:type="dxa"/>
-              <w:left w:w="40" w:type="dxa"/>
-              <w:right w:w="40" w:type="dxa"/>
+              <w:top w:w="14" w:type="dxa"/>
+              <w:bottom w:w="14" w:type="dxa"/>
+              <w:left w:w="30" w:type="dxa"/>
+              <w:right w:w="30" w:type="dxa"/>
             </w:tcMar>
             <w:shd w:fill="DCFCE7"/>
           </w:tcPr>
@@ -5233,7 +5216,7 @@
               <w:rPr>
                 <w:rFonts w:ascii="Times New Roman" w:hAnsi="Times New Roman"/>
                 <w:b/>
-                <w:sz w:val="14"/>
+                <w:sz w:val="13"/>
               </w:rPr>
               <w:t>10 Marks</w:t>
             </w:r>
@@ -5243,10 +5226,10 @@
           <w:tcPr>
             <w:tcW w:type="dxa" w:w="1872"/>
             <w:tcMar>
-              <w:top w:w="20" w:type="dxa"/>
-              <w:bottom w:w="20" w:type="dxa"/>
-              <w:left w:w="40" w:type="dxa"/>
-              <w:right w:w="40" w:type="dxa"/>
+              <w:top w:w="14" w:type="dxa"/>
+              <w:bottom w:w="14" w:type="dxa"/>
+              <w:left w:w="30" w:type="dxa"/>
+              <w:right w:w="30" w:type="dxa"/>
             </w:tcMar>
             <w:shd w:fill="DCFCE7"/>
           </w:tcPr>
@@ -5255,7 +5238,7 @@
               <w:rPr>
                 <w:rFonts w:ascii="Times New Roman" w:hAnsi="Times New Roman"/>
                 <w:b/>
-                <w:sz w:val="14"/>
+                <w:sz w:val="13"/>
               </w:rPr>
               <w:t>COMPLETED (Current Submission)</w:t>
             </w:r>
@@ -5267,10 +5250,10 @@
           <w:tcPr>
             <w:tcW w:type="dxa" w:w="1872"/>
             <w:tcMar>
-              <w:top w:w="20" w:type="dxa"/>
-              <w:bottom w:w="20" w:type="dxa"/>
-              <w:left w:w="40" w:type="dxa"/>
-              <w:right w:w="40" w:type="dxa"/>
+              <w:top w:w="14" w:type="dxa"/>
+              <w:bottom w:w="14" w:type="dxa"/>
+              <w:left w:w="30" w:type="dxa"/>
+              <w:right w:w="30" w:type="dxa"/>
             </w:tcMar>
             <w:shd w:fill="FFFFFF"/>
           </w:tcPr>
@@ -5278,7 +5261,7 @@
             <w:r>
               <w:rPr>
                 <w:rFonts w:ascii="Times New Roman" w:hAnsi="Times New Roman"/>
-                <w:sz w:val="14"/>
+                <w:sz w:val="13"/>
               </w:rPr>
               <w:t>13/10/2026</w:t>
             </w:r>
@@ -5288,10 +5271,10 @@
           <w:tcPr>
             <w:tcW w:type="dxa" w:w="1872"/>
             <w:tcMar>
-              <w:top w:w="20" w:type="dxa"/>
-              <w:bottom w:w="20" w:type="dxa"/>
-              <w:left w:w="40" w:type="dxa"/>
-              <w:right w:w="40" w:type="dxa"/>
+              <w:top w:w="14" w:type="dxa"/>
+              <w:bottom w:w="14" w:type="dxa"/>
+              <w:left w:w="30" w:type="dxa"/>
+              <w:right w:w="30" w:type="dxa"/>
             </w:tcMar>
             <w:shd w:fill="FFFFFF"/>
           </w:tcPr>
@@ -5299,7 +5282,7 @@
             <w:r>
               <w:rPr>
                 <w:rFonts w:ascii="Times New Roman" w:hAnsi="Times New Roman"/>
-                <w:sz w:val="14"/>
+                <w:sz w:val="13"/>
               </w:rPr>
               <w:t>Mid-Term Exam (Second Progress)</w:t>
             </w:r>
@@ -5309,10 +5292,10 @@
           <w:tcPr>
             <w:tcW w:type="dxa" w:w="1872"/>
             <w:tcMar>
-              <w:top w:w="20" w:type="dxa"/>
-              <w:bottom w:w="20" w:type="dxa"/>
-              <w:left w:w="40" w:type="dxa"/>
-              <w:right w:w="40" w:type="dxa"/>
+              <w:top w:w="14" w:type="dxa"/>
+              <w:bottom w:w="14" w:type="dxa"/>
+              <w:left w:w="30" w:type="dxa"/>
+              <w:right w:w="30" w:type="dxa"/>
             </w:tcMar>
             <w:shd w:fill="FFFFFF"/>
           </w:tcPr>
@@ -5320,7 +5303,7 @@
             <w:r>
               <w:rPr>
                 <w:rFonts w:ascii="Times New Roman" w:hAnsi="Times New Roman"/>
-                <w:sz w:val="14"/>
+                <w:sz w:val="13"/>
               </w:rPr>
               <w:t>2.3, 2.4, 3.1, 4.1</w:t>
             </w:r>
@@ -5330,10 +5313,10 @@
           <w:tcPr>
             <w:tcW w:type="dxa" w:w="1872"/>
             <w:tcMar>
-              <w:top w:w="20" w:type="dxa"/>
-              <w:bottom w:w="20" w:type="dxa"/>
-              <w:left w:w="40" w:type="dxa"/>
-              <w:right w:w="40" w:type="dxa"/>
+              <w:top w:w="14" w:type="dxa"/>
+              <w:bottom w:w="14" w:type="dxa"/>
+              <w:left w:w="30" w:type="dxa"/>
+              <w:right w:w="30" w:type="dxa"/>
             </w:tcMar>
             <w:shd w:fill="FFFFFF"/>
           </w:tcPr>
@@ -5341,7 +5324,7 @@
             <w:r>
               <w:rPr>
                 <w:rFonts w:ascii="Times New Roman" w:hAnsi="Times New Roman"/>
-                <w:sz w:val="14"/>
+                <w:sz w:val="13"/>
               </w:rPr>
               <w:t>20 Marks</w:t>
             </w:r>
@@ -5351,10 +5334,10 @@
           <w:tcPr>
             <w:tcW w:type="dxa" w:w="1872"/>
             <w:tcMar>
-              <w:top w:w="20" w:type="dxa"/>
-              <w:bottom w:w="20" w:type="dxa"/>
-              <w:left w:w="40" w:type="dxa"/>
-              <w:right w:w="40" w:type="dxa"/>
+              <w:top w:w="14" w:type="dxa"/>
+              <w:bottom w:w="14" w:type="dxa"/>
+              <w:left w:w="30" w:type="dxa"/>
+              <w:right w:w="30" w:type="dxa"/>
             </w:tcMar>
             <w:shd w:fill="FFFFFF"/>
           </w:tcPr>
@@ -5362,7 +5345,7 @@
             <w:r>
               <w:rPr>
                 <w:rFonts w:ascii="Times New Roman" w:hAnsi="Times New Roman"/>
-                <w:sz w:val="14"/>
+                <w:sz w:val="13"/>
               </w:rPr>
               <w:t>Scheduled for Next Milestone</w:t>
             </w:r>
@@ -5374,10 +5357,10 @@
           <w:tcPr>
             <w:tcW w:type="dxa" w:w="1872"/>
             <w:tcMar>
-              <w:top w:w="20" w:type="dxa"/>
-              <w:bottom w:w="20" w:type="dxa"/>
-              <w:left w:w="40" w:type="dxa"/>
-              <w:right w:w="40" w:type="dxa"/>
+              <w:top w:w="14" w:type="dxa"/>
+              <w:bottom w:w="14" w:type="dxa"/>
+              <w:left w:w="30" w:type="dxa"/>
+              <w:right w:w="30" w:type="dxa"/>
             </w:tcMar>
             <w:shd w:fill="F8FAFC"/>
           </w:tcPr>
@@ -5385,7 +5368,7 @@
             <w:r>
               <w:rPr>
                 <w:rFonts w:ascii="Times New Roman" w:hAnsi="Times New Roman"/>
-                <w:sz w:val="14"/>
+                <w:sz w:val="13"/>
               </w:rPr>
               <w:t>27/10/2026</w:t>
             </w:r>
@@ -5395,10 +5378,10 @@
           <w:tcPr>
             <w:tcW w:type="dxa" w:w="1872"/>
             <w:tcMar>
-              <w:top w:w="20" w:type="dxa"/>
-              <w:bottom w:w="20" w:type="dxa"/>
-              <w:left w:w="40" w:type="dxa"/>
-              <w:right w:w="40" w:type="dxa"/>
+              <w:top w:w="14" w:type="dxa"/>
+              <w:bottom w:w="14" w:type="dxa"/>
+              <w:left w:w="30" w:type="dxa"/>
+              <w:right w:w="30" w:type="dxa"/>
             </w:tcMar>
             <w:shd w:fill="F8FAFC"/>
           </w:tcPr>
@@ -5406,7 +5389,7 @@
             <w:r>
               <w:rPr>
                 <w:rFonts w:ascii="Times New Roman" w:hAnsi="Times New Roman"/>
-                <w:sz w:val="14"/>
+                <w:sz w:val="13"/>
               </w:rPr>
               <w:t>Third Progress Work</w:t>
             </w:r>
@@ -5416,10 +5399,10 @@
           <w:tcPr>
             <w:tcW w:type="dxa" w:w="1872"/>
             <w:tcMar>
-              <w:top w:w="20" w:type="dxa"/>
-              <w:bottom w:w="20" w:type="dxa"/>
-              <w:left w:w="40" w:type="dxa"/>
-              <w:right w:w="40" w:type="dxa"/>
+              <w:top w:w="14" w:type="dxa"/>
+              <w:bottom w:w="14" w:type="dxa"/>
+              <w:left w:w="30" w:type="dxa"/>
+              <w:right w:w="30" w:type="dxa"/>
             </w:tcMar>
             <w:shd w:fill="F8FAFC"/>
           </w:tcPr>
@@ -5427,7 +5410,7 @@
             <w:r>
               <w:rPr>
                 <w:rFonts w:ascii="Times New Roman" w:hAnsi="Times New Roman"/>
-                <w:sz w:val="14"/>
+                <w:sz w:val="13"/>
               </w:rPr>
               <w:t>4.2, 4.3, 5.1, 5.2, 6.1</w:t>
             </w:r>
@@ -5437,10 +5420,10 @@
           <w:tcPr>
             <w:tcW w:type="dxa" w:w="1872"/>
             <w:tcMar>
-              <w:top w:w="20" w:type="dxa"/>
-              <w:bottom w:w="20" w:type="dxa"/>
-              <w:left w:w="40" w:type="dxa"/>
-              <w:right w:w="40" w:type="dxa"/>
+              <w:top w:w="14" w:type="dxa"/>
+              <w:bottom w:w="14" w:type="dxa"/>
+              <w:left w:w="30" w:type="dxa"/>
+              <w:right w:w="30" w:type="dxa"/>
             </w:tcMar>
             <w:shd w:fill="F8FAFC"/>
           </w:tcPr>
@@ -5448,7 +5431,7 @@
             <w:r>
               <w:rPr>
                 <w:rFonts w:ascii="Times New Roman" w:hAnsi="Times New Roman"/>
-                <w:sz w:val="14"/>
+                <w:sz w:val="13"/>
               </w:rPr>
               <w:t>10 Marks</w:t>
             </w:r>
@@ -5458,10 +5441,10 @@
           <w:tcPr>
             <w:tcW w:type="dxa" w:w="1872"/>
             <w:tcMar>
-              <w:top w:w="20" w:type="dxa"/>
-              <w:bottom w:w="20" w:type="dxa"/>
-              <w:left w:w="40" w:type="dxa"/>
-              <w:right w:w="40" w:type="dxa"/>
+              <w:top w:w="14" w:type="dxa"/>
+              <w:bottom w:w="14" w:type="dxa"/>
+              <w:left w:w="30" w:type="dxa"/>
+              <w:right w:w="30" w:type="dxa"/>
             </w:tcMar>
             <w:shd w:fill="F8FAFC"/>
           </w:tcPr>
@@ -5469,7 +5452,7 @@
             <w:r>
               <w:rPr>
                 <w:rFonts w:ascii="Times New Roman" w:hAnsi="Times New Roman"/>
-                <w:sz w:val="14"/>
+                <w:sz w:val="13"/>
               </w:rPr>
               <w:t>Scheduled for Third Milestone</w:t>
             </w:r>
@@ -5481,10 +5464,10 @@
           <w:tcPr>
             <w:tcW w:type="dxa" w:w="1872"/>
             <w:tcMar>
-              <w:top w:w="20" w:type="dxa"/>
-              <w:bottom w:w="20" w:type="dxa"/>
-              <w:left w:w="40" w:type="dxa"/>
-              <w:right w:w="40" w:type="dxa"/>
+              <w:top w:w="14" w:type="dxa"/>
+              <w:bottom w:w="14" w:type="dxa"/>
+              <w:left w:w="30" w:type="dxa"/>
+              <w:right w:w="30" w:type="dxa"/>
             </w:tcMar>
             <w:shd w:fill="FFFFFF"/>
           </w:tcPr>
@@ -5492,7 +5475,7 @@
             <w:r>
               <w:rPr>
                 <w:rFonts w:ascii="Times New Roman" w:hAnsi="Times New Roman"/>
-                <w:sz w:val="14"/>
+                <w:sz w:val="13"/>
               </w:rPr>
               <w:t>06/11/2026</w:t>
             </w:r>
@@ -5502,10 +5485,10 @@
           <w:tcPr>
             <w:tcW w:type="dxa" w:w="1872"/>
             <w:tcMar>
-              <w:top w:w="20" w:type="dxa"/>
-              <w:bottom w:w="20" w:type="dxa"/>
-              <w:left w:w="40" w:type="dxa"/>
-              <w:right w:w="40" w:type="dxa"/>
+              <w:top w:w="14" w:type="dxa"/>
+              <w:bottom w:w="14" w:type="dxa"/>
+              <w:left w:w="30" w:type="dxa"/>
+              <w:right w:w="30" w:type="dxa"/>
             </w:tcMar>
             <w:shd w:fill="FFFFFF"/>
           </w:tcPr>
@@ -5513,7 +5496,7 @@
             <w:r>
               <w:rPr>
                 <w:rFonts w:ascii="Times New Roman" w:hAnsi="Times New Roman"/>
-                <w:sz w:val="14"/>
+                <w:sz w:val="13"/>
               </w:rPr>
               <w:t>Report Submission (Spiral Binding)</w:t>
             </w:r>
@@ -5523,10 +5506,10 @@
           <w:tcPr>
             <w:tcW w:type="dxa" w:w="1872"/>
             <w:tcMar>
-              <w:top w:w="20" w:type="dxa"/>
-              <w:bottom w:w="20" w:type="dxa"/>
-              <w:left w:w="40" w:type="dxa"/>
-              <w:right w:w="40" w:type="dxa"/>
+              <w:top w:w="14" w:type="dxa"/>
+              <w:bottom w:w="14" w:type="dxa"/>
+              <w:left w:w="30" w:type="dxa"/>
+              <w:right w:w="30" w:type="dxa"/>
             </w:tcMar>
             <w:shd w:fill="FFFFFF"/>
           </w:tcPr>
@@ -5534,7 +5517,7 @@
             <w:r>
               <w:rPr>
                 <w:rFonts w:ascii="Times New Roman" w:hAnsi="Times New Roman"/>
-                <w:sz w:val="14"/>
+                <w:sz w:val="13"/>
               </w:rPr>
               <w:t>Final Signed Spiral Copy</w:t>
             </w:r>
@@ -5544,10 +5527,10 @@
           <w:tcPr>
             <w:tcW w:type="dxa" w:w="1872"/>
             <w:tcMar>
-              <w:top w:w="20" w:type="dxa"/>
-              <w:bottom w:w="20" w:type="dxa"/>
-              <w:left w:w="40" w:type="dxa"/>
-              <w:right w:w="40" w:type="dxa"/>
+              <w:top w:w="14" w:type="dxa"/>
+              <w:bottom w:w="14" w:type="dxa"/>
+              <w:left w:w="30" w:type="dxa"/>
+              <w:right w:w="30" w:type="dxa"/>
             </w:tcMar>
             <w:shd w:fill="FFFFFF"/>
           </w:tcPr>
@@ -5555,7 +5538,7 @@
             <w:r>
               <w:rPr>
                 <w:rFonts w:ascii="Times New Roman" w:hAnsi="Times New Roman"/>
-                <w:sz w:val="14"/>
+                <w:sz w:val="13"/>
               </w:rPr>
               <w:t>10 Marks</w:t>
             </w:r>
@@ -5565,10 +5548,10 @@
           <w:tcPr>
             <w:tcW w:type="dxa" w:w="1872"/>
             <w:tcMar>
-              <w:top w:w="20" w:type="dxa"/>
-              <w:bottom w:w="20" w:type="dxa"/>
-              <w:left w:w="40" w:type="dxa"/>
-              <w:right w:w="40" w:type="dxa"/>
+              <w:top w:w="14" w:type="dxa"/>
+              <w:bottom w:w="14" w:type="dxa"/>
+              <w:left w:w="30" w:type="dxa"/>
+              <w:right w:w="30" w:type="dxa"/>
             </w:tcMar>
             <w:shd w:fill="FFFFFF"/>
           </w:tcPr>
@@ -5576,7 +5559,7 @@
             <w:r>
               <w:rPr>
                 <w:rFonts w:ascii="Times New Roman" w:hAnsi="Times New Roman"/>
-                <w:sz w:val="14"/>
+                <w:sz w:val="13"/>
               </w:rPr>
               <w:t>Scheduled for Final Submission</w:t>
             </w:r>
@@ -5588,10 +5571,10 @@
           <w:tcPr>
             <w:tcW w:type="dxa" w:w="1872"/>
             <w:tcMar>
-              <w:top w:w="20" w:type="dxa"/>
-              <w:bottom w:w="20" w:type="dxa"/>
-              <w:left w:w="40" w:type="dxa"/>
-              <w:right w:w="40" w:type="dxa"/>
+              <w:top w:w="14" w:type="dxa"/>
+              <w:bottom w:w="14" w:type="dxa"/>
+              <w:left w:w="30" w:type="dxa"/>
+              <w:right w:w="30" w:type="dxa"/>
             </w:tcMar>
             <w:shd w:fill="F8FAFC"/>
           </w:tcPr>
@@ -5599,7 +5582,7 @@
             <w:r>
               <w:rPr>
                 <w:rFonts w:ascii="Times New Roman" w:hAnsi="Times New Roman"/>
-                <w:sz w:val="14"/>
+                <w:sz w:val="13"/>
               </w:rPr>
               <w:t>18-20/11/2026</w:t>
             </w:r>
@@ -5609,10 +5592,10 @@
           <w:tcPr>
             <w:tcW w:type="dxa" w:w="1872"/>
             <w:tcMar>
-              <w:top w:w="20" w:type="dxa"/>
-              <w:bottom w:w="20" w:type="dxa"/>
-              <w:left w:w="40" w:type="dxa"/>
-              <w:right w:w="40" w:type="dxa"/>
+              <w:top w:w="14" w:type="dxa"/>
+              <w:bottom w:w="14" w:type="dxa"/>
+              <w:left w:w="30" w:type="dxa"/>
+              <w:right w:w="30" w:type="dxa"/>
             </w:tcMar>
             <w:shd w:fill="F8FAFC"/>
           </w:tcPr>
@@ -5620,7 +5603,7 @@
             <w:r>
               <w:rPr>
                 <w:rFonts w:ascii="Times New Roman" w:hAnsi="Times New Roman"/>
-                <w:sz w:val="14"/>
+                <w:sz w:val="13"/>
               </w:rPr>
               <w:t>Final Exam (SEE)</w:t>
             </w:r>
@@ -5630,10 +5613,10 @@
           <w:tcPr>
             <w:tcW w:type="dxa" w:w="1872"/>
             <w:tcMar>
-              <w:top w:w="20" w:type="dxa"/>
-              <w:bottom w:w="20" w:type="dxa"/>
-              <w:left w:w="40" w:type="dxa"/>
-              <w:right w:w="40" w:type="dxa"/>
+              <w:top w:w="14" w:type="dxa"/>
+              <w:bottom w:w="14" w:type="dxa"/>
+              <w:left w:w="30" w:type="dxa"/>
+              <w:right w:w="30" w:type="dxa"/>
             </w:tcMar>
             <w:shd w:fill="F8FAFC"/>
           </w:tcPr>
@@ -5641,7 +5624,7 @@
             <w:r>
               <w:rPr>
                 <w:rFonts w:ascii="Times New Roman" w:hAnsi="Times New Roman"/>
-                <w:sz w:val="14"/>
+                <w:sz w:val="13"/>
               </w:rPr>
               <w:t>Exam &amp; Viva Voce</w:t>
             </w:r>
@@ -5651,10 +5634,10 @@
           <w:tcPr>
             <w:tcW w:type="dxa" w:w="1872"/>
             <w:tcMar>
-              <w:top w:w="20" w:type="dxa"/>
-              <w:bottom w:w="20" w:type="dxa"/>
-              <w:left w:w="40" w:type="dxa"/>
-              <w:right w:w="40" w:type="dxa"/>
+              <w:top w:w="14" w:type="dxa"/>
+              <w:bottom w:w="14" w:type="dxa"/>
+              <w:left w:w="30" w:type="dxa"/>
+              <w:right w:w="30" w:type="dxa"/>
             </w:tcMar>
             <w:shd w:fill="F8FAFC"/>
           </w:tcPr>
@@ -5662,7 +5645,7 @@
             <w:r>
               <w:rPr>
                 <w:rFonts w:ascii="Times New Roman" w:hAnsi="Times New Roman"/>
-                <w:sz w:val="14"/>
+                <w:sz w:val="13"/>
               </w:rPr>
               <w:t>50 Marks</w:t>
             </w:r>
@@ -5672,10 +5655,10 @@
           <w:tcPr>
             <w:tcW w:type="dxa" w:w="1872"/>
             <w:tcMar>
-              <w:top w:w="20" w:type="dxa"/>
-              <w:bottom w:w="20" w:type="dxa"/>
-              <w:left w:w="40" w:type="dxa"/>
-              <w:right w:w="40" w:type="dxa"/>
+              <w:top w:w="14" w:type="dxa"/>
+              <w:bottom w:w="14" w:type="dxa"/>
+              <w:left w:w="30" w:type="dxa"/>
+              <w:right w:w="30" w:type="dxa"/>
             </w:tcMar>
             <w:shd w:fill="F8FAFC"/>
           </w:tcPr>
@@ -5683,7 +5666,7 @@
             <w:r>
               <w:rPr>
                 <w:rFonts w:ascii="Times New Roman" w:hAnsi="Times New Roman"/>
-                <w:sz w:val="14"/>
+                <w:sz w:val="13"/>
               </w:rPr>
               <w:t>Scheduled for Semester Examination</w:t>
             </w:r>
@@ -5693,7 +5676,7 @@
     </w:tbl>
     <w:sectPr>
       <w:pgSz w:w="12240" w:h="15840"/>
-      <w:pgMar w:top="1152" w:right="1224" w:bottom="1152" w:left="1656" w:header="720" w:footer="720" w:gutter="0"/>
+      <w:pgMar w:top="1008" w:right="1224" w:bottom="1008" w:left="1656" w:header="720" w:footer="720" w:gutter="0"/>
       <w:cols w:space="720"/>
       <w:docGrid w:linePitch="360"/>
     </w:sectPr>

</xml_diff>

<commit_message>
feat(phase3): deliver complete Third Progress Work (27/10/2026 - 10 Marks) report and presentation
</commit_message>
<xml_diff>
--- a/Deep_Koshiya_ProjectReport.docx
+++ b/Deep_Koshiya_ProjectReport.docx
@@ -210,7 +210,7 @@
                 <w:color w:val="0F172A"/>
                 <w:sz w:val="18"/>
               </w:rPr>
-              <w:t>SECOND PROGRESS WORK / MID-TERM EXAMINATION EVALUATION</w:t>
+              <w:t>THIRD PROGRESS WORK EVALUATION</w:t>
             </w:r>
           </w:p>
         </w:tc>
@@ -245,7 +245,7 @@
                 <w:color w:val="0F172A"/>
                 <w:sz w:val="18"/>
               </w:rPr>
-              <w:t>Scheduled Evaluation Date:</w:t>
+              <w:t>Scheduled Submission Date:</w:t>
             </w:r>
           </w:p>
         </w:tc>
@@ -278,7 +278,7 @@
                 <w:color w:val="0F172A"/>
                 <w:sz w:val="18"/>
               </w:rPr>
-              <w:t>13th October 2026 (Time: 10:00 AM to 5:00 PM)</w:t>
+              <w:t>27th October 2026 (Time: 10:00 AM to 5:00 PM)</w:t>
             </w:r>
           </w:p>
         </w:tc>
@@ -346,7 +346,7 @@
                 <w:color w:val="0F172A"/>
                 <w:sz w:val="18"/>
               </w:rPr>
-              <w:t>Sections 2.3 (Class Diagram), 2.4 (Sequence Diagrams), 3.1 (Data Dictionary), 4.1 (Screen Layouts with Validations)</w:t>
+              <w:t>Sections 4.2 (Sample Coding &amp; Security), 4.3 (Steps of Execution &amp; Navigation), 5.1-5.2 (Conclusion), 6.1 (References) &amp; Roman Pages</w:t>
             </w:r>
           </w:p>
         </w:tc>
@@ -449,7 +449,7 @@
                 <w:color w:val="0F172A"/>
                 <w:sz w:val="18"/>
               </w:rPr>
-              <w:t>Evaluation Marks Allotted:</w:t>
+              <w:t>Cumulative Marks Completed:</w:t>
             </w:r>
           </w:p>
         </w:tc>
@@ -482,7 +482,7 @@
                 <w:color w:val="0F172A"/>
                 <w:sz w:val="18"/>
               </w:rPr>
-              <w:t>20 Marks (Mid-Term Assessment Milestone)</w:t>
+              <w:t>40 Marks Evaluated (10 Marks First + 20 Marks Mid-Term + 10 Marks Third Progress)</w:t>
             </w:r>
           </w:p>
         </w:tc>
@@ -696,7 +696,7 @@
           <w:color w:val="0F172A"/>
           <w:sz w:val="24"/>
         </w:rPr>
-        <w:t>This is to formally certify that the project work entitled "E-Commerce Customer Lifecycle &amp; RFM Segmentation Dashboard" is an authentic record of academic and applied engineering work carried out by Deep Koshiya, student of B.Sc. in Artificial Intelligence &amp; Data Science, Semester V (5th Semester), at Institute of Advanced Research (IAR), Gandhinagar, Gujarat.</w:t>
+        <w:t>This is to formally certify that the project work entitled "E-Commerce Customer Lifecycle &amp; RFM Segmentation Dashboard" is a bonafide record of authentic applied engineering work carried out by Deep Koshiya, student of B.Sc. in Artificial Intelligence &amp; Data Science, Semester V (5th Semester), at Institute of Advanced Research (IAR), Gandhinagar, Gujarat.</w:t>
       </w:r>
     </w:p>
     <w:p>
@@ -711,7 +711,7 @@
           <w:color w:val="0F172A"/>
           <w:sz w:val="24"/>
         </w:rPr>
-        <w:t>The candidate has successfully demonstrated and documented the Second Progress Work (Mid-Term Examination) requirements covering Sections 2.3 (UML Class Diagram), 2.4 (UML Sequence Diagrams), 3.1 (Data Dictionary for SQL/NoSQL &amp; Star-Schema Dimensions), and 4.1 (Implementation Screen Layouts with Operational Validations) for Project-1 (CE-502 / PRJ-701) scheduled for evaluation on 13th October 2026.</w:t>
+        <w:t>The candidate has successfully completed and demonstrated the Third Progress Work requirements covering Sections 4.2 (Sample Coding with Security Tasks), 4.3 (Steps of Execution &amp; Navigation), 5.1 (Importance of Worked-Out Tasks), 5.2 (Further Enhancement in Future), 6.1 (References), and formal Roman preliminary pages for Project-1 (CE-502 / PRJ-701) scheduled for evaluation on 27th October 2026.</w:t>
       </w:r>
     </w:p>
     <w:tbl>
@@ -842,8 +842,8 @@
             <w:tcW w:type="dxa" w:w="3456"/>
             <w:shd w:fill="EFF6FF"/>
             <w:tcMar>
-              <w:top w:w="20" w:type="dxa"/>
-              <w:bottom w:w="20" w:type="dxa"/>
+              <w:top w:w="18" w:type="dxa"/>
+              <w:bottom w:w="18" w:type="dxa"/>
               <w:left w:w="35" w:type="dxa"/>
               <w:right w:w="35" w:type="dxa"/>
             </w:tcMar>
@@ -875,8 +875,8 @@
             <w:tcW w:type="dxa" w:w="3168"/>
             <w:shd w:fill="EFF6FF"/>
             <w:tcMar>
-              <w:top w:w="20" w:type="dxa"/>
-              <w:bottom w:w="20" w:type="dxa"/>
+              <w:top w:w="18" w:type="dxa"/>
+              <w:bottom w:w="18" w:type="dxa"/>
               <w:left w:w="35" w:type="dxa"/>
               <w:right w:w="35" w:type="dxa"/>
             </w:tcMar>
@@ -908,8 +908,8 @@
             <w:tcW w:type="dxa" w:w="1152"/>
             <w:shd w:fill="EFF6FF"/>
             <w:tcMar>
-              <w:top w:w="20" w:type="dxa"/>
-              <w:bottom w:w="20" w:type="dxa"/>
+              <w:top w:w="18" w:type="dxa"/>
+              <w:bottom w:w="18" w:type="dxa"/>
               <w:left w:w="35" w:type="dxa"/>
               <w:right w:w="35" w:type="dxa"/>
             </w:tcMar>
@@ -941,8 +941,142 @@
             <w:tcW w:type="dxa" w:w="2592"/>
             <w:shd w:fill="EFF6FF"/>
             <w:tcMar>
-              <w:top w:w="20" w:type="dxa"/>
-              <w:bottom w:w="20" w:type="dxa"/>
+              <w:top w:w="18" w:type="dxa"/>
+              <w:bottom w:w="18" w:type="dxa"/>
+              <w:left w:w="35" w:type="dxa"/>
+              <w:right w:w="35" w:type="dxa"/>
+            </w:tcMar>
+            <w:tcBorders>
+              <w:top w:val="single" w:sz="4" w:space="0" w:color="CBD5E1"/>
+              <w:left w:val="single" w:sz="4" w:space="0" w:color="CBD5E1"/>
+              <w:bottom w:val="single" w:sz="4" w:space="0" w:color="CBD5E1"/>
+              <w:right w:val="single" w:sz="4" w:space="0" w:color="CBD5E1"/>
+            </w:tcBorders>
+          </w:tcPr>
+          <w:p>
+            <w:pPr>
+              <w:spacing w:before="0" w:after="0" w:line="252" w:lineRule="auto"/>
+              <w:jc w:val="center"/>
+            </w:pPr>
+            <w:r>
+              <w:rPr>
+                <w:rFonts w:ascii="Times New Roman" w:hAnsi="Times New Roman"/>
+                <w:b w:val="0"/>
+                <w:color w:val="0F172A"/>
+                <w:sz w:val="15"/>
+              </w:rPr>
+              <w:t>COMPLETED &amp; VERIFIED</w:t>
+            </w:r>
+          </w:p>
+        </w:tc>
+      </w:tr>
+      <w:tr>
+        <w:tc>
+          <w:tcPr>
+            <w:tcW w:type="dxa" w:w="3456"/>
+            <w:shd w:fill="EFF6FF"/>
+            <w:tcMar>
+              <w:top w:w="18" w:type="dxa"/>
+              <w:bottom w:w="18" w:type="dxa"/>
+              <w:left w:w="35" w:type="dxa"/>
+              <w:right w:w="35" w:type="dxa"/>
+            </w:tcMar>
+            <w:tcBorders>
+              <w:top w:val="single" w:sz="4" w:space="0" w:color="CBD5E1"/>
+              <w:left w:val="single" w:sz="4" w:space="0" w:color="CBD5E1"/>
+              <w:bottom w:val="single" w:sz="4" w:space="0" w:color="CBD5E1"/>
+              <w:right w:val="single" w:sz="4" w:space="0" w:color="CBD5E1"/>
+            </w:tcBorders>
+          </w:tcPr>
+          <w:p>
+            <w:pPr>
+              <w:spacing w:before="0" w:after="0" w:line="252" w:lineRule="auto"/>
+              <w:jc w:val="left"/>
+            </w:pPr>
+            <w:r>
+              <w:rPr>
+                <w:rFonts w:ascii="Times New Roman" w:hAnsi="Times New Roman"/>
+                <w:b/>
+                <w:color w:val="0F172A"/>
+                <w:sz w:val="15"/>
+              </w:rPr>
+              <w:t>Second Progress Work (13/10/2026)</w:t>
+            </w:r>
+          </w:p>
+        </w:tc>
+        <w:tc>
+          <w:tcPr>
+            <w:tcW w:type="dxa" w:w="3168"/>
+            <w:shd w:fill="EFF6FF"/>
+            <w:tcMar>
+              <w:top w:w="18" w:type="dxa"/>
+              <w:bottom w:w="18" w:type="dxa"/>
+              <w:left w:w="35" w:type="dxa"/>
+              <w:right w:w="35" w:type="dxa"/>
+            </w:tcMar>
+            <w:tcBorders>
+              <w:top w:val="single" w:sz="4" w:space="0" w:color="CBD5E1"/>
+              <w:left w:val="single" w:sz="4" w:space="0" w:color="CBD5E1"/>
+              <w:bottom w:val="single" w:sz="4" w:space="0" w:color="CBD5E1"/>
+              <w:right w:val="single" w:sz="4" w:space="0" w:color="CBD5E1"/>
+            </w:tcBorders>
+          </w:tcPr>
+          <w:p>
+            <w:pPr>
+              <w:spacing w:before="0" w:after="0" w:line="252" w:lineRule="auto"/>
+              <w:jc w:val="left"/>
+            </w:pPr>
+            <w:r>
+              <w:rPr>
+                <w:rFonts w:ascii="Times New Roman" w:hAnsi="Times New Roman"/>
+                <w:b w:val="0"/>
+                <w:color w:val="0F172A"/>
+                <w:sz w:val="15"/>
+              </w:rPr>
+              <w:t>Sections 2.3, 2.4, 3.1, 4.1</w:t>
+            </w:r>
+          </w:p>
+        </w:tc>
+        <w:tc>
+          <w:tcPr>
+            <w:tcW w:type="dxa" w:w="1152"/>
+            <w:shd w:fill="EFF6FF"/>
+            <w:tcMar>
+              <w:top w:w="18" w:type="dxa"/>
+              <w:bottom w:w="18" w:type="dxa"/>
+              <w:left w:w="35" w:type="dxa"/>
+              <w:right w:w="35" w:type="dxa"/>
+            </w:tcMar>
+            <w:tcBorders>
+              <w:top w:val="single" w:sz="4" w:space="0" w:color="CBD5E1"/>
+              <w:left w:val="single" w:sz="4" w:space="0" w:color="CBD5E1"/>
+              <w:bottom w:val="single" w:sz="4" w:space="0" w:color="CBD5E1"/>
+              <w:right w:val="single" w:sz="4" w:space="0" w:color="CBD5E1"/>
+            </w:tcBorders>
+          </w:tcPr>
+          <w:p>
+            <w:pPr>
+              <w:spacing w:before="0" w:after="0" w:line="252" w:lineRule="auto"/>
+              <w:jc w:val="center"/>
+            </w:pPr>
+            <w:r>
+              <w:rPr>
+                <w:rFonts w:ascii="Times New Roman" w:hAnsi="Times New Roman"/>
+                <w:b w:val="0"/>
+                <w:color w:val="0F172A"/>
+                <w:sz w:val="15"/>
+              </w:rPr>
+              <w:t>20 Marks</w:t>
+            </w:r>
+          </w:p>
+        </w:tc>
+        <w:tc>
+          <w:tcPr>
+            <w:tcW w:type="dxa" w:w="2592"/>
+            <w:shd w:fill="EFF6FF"/>
+            <w:tcMar>
+              <w:top w:w="18" w:type="dxa"/>
+              <w:bottom w:w="18" w:type="dxa"/>
               <w:left w:w="35" w:type="dxa"/>
               <w:right w:w="35" w:type="dxa"/>
             </w:tcMar>
@@ -976,8 +1110,8 @@
             <w:tcW w:type="dxa" w:w="3456"/>
             <w:shd w:fill="DCFCE7"/>
             <w:tcMar>
-              <w:top w:w="20" w:type="dxa"/>
-              <w:bottom w:w="20" w:type="dxa"/>
+              <w:top w:w="18" w:type="dxa"/>
+              <w:bottom w:w="18" w:type="dxa"/>
               <w:left w:w="35" w:type="dxa"/>
               <w:right w:w="35" w:type="dxa"/>
             </w:tcMar>
@@ -1000,7 +1134,7 @@
                 <w:color w:val="0F172A"/>
                 <w:sz w:val="15"/>
               </w:rPr>
-              <w:t>Second Progress Work (13/10/2026)</w:t>
+              <w:t>Third Progress Work (27/10/2026)</w:t>
             </w:r>
           </w:p>
         </w:tc>
@@ -1009,8 +1143,8 @@
             <w:tcW w:type="dxa" w:w="3168"/>
             <w:shd w:fill="DCFCE7"/>
             <w:tcMar>
-              <w:top w:w="20" w:type="dxa"/>
-              <w:bottom w:w="20" w:type="dxa"/>
+              <w:top w:w="18" w:type="dxa"/>
+              <w:bottom w:w="18" w:type="dxa"/>
               <w:left w:w="35" w:type="dxa"/>
               <w:right w:w="35" w:type="dxa"/>
             </w:tcMar>
@@ -1033,7 +1167,7 @@
                 <w:color w:val="0F172A"/>
                 <w:sz w:val="15"/>
               </w:rPr>
-              <w:t>Sections 2.3, 2.4, 3.1, 4.1</w:t>
+              <w:t>Sections 4.2, 4.3, 5.1, 5.2, 6.1</w:t>
             </w:r>
           </w:p>
         </w:tc>
@@ -1042,8 +1176,8 @@
             <w:tcW w:type="dxa" w:w="1152"/>
             <w:shd w:fill="DCFCE7"/>
             <w:tcMar>
-              <w:top w:w="20" w:type="dxa"/>
-              <w:bottom w:w="20" w:type="dxa"/>
+              <w:top w:w="18" w:type="dxa"/>
+              <w:bottom w:w="18" w:type="dxa"/>
               <w:left w:w="35" w:type="dxa"/>
               <w:right w:w="35" w:type="dxa"/>
             </w:tcMar>
@@ -1066,7 +1200,7 @@
                 <w:color w:val="0F172A"/>
                 <w:sz w:val="15"/>
               </w:rPr>
-              <w:t>20 Marks</w:t>
+              <w:t>10 Marks</w:t>
             </w:r>
           </w:p>
         </w:tc>
@@ -1075,8 +1209,8 @@
             <w:tcW w:type="dxa" w:w="2592"/>
             <w:shd w:fill="DCFCE7"/>
             <w:tcMar>
-              <w:top w:w="20" w:type="dxa"/>
-              <w:bottom w:w="20" w:type="dxa"/>
+              <w:top w:w="18" w:type="dxa"/>
+              <w:bottom w:w="18" w:type="dxa"/>
               <w:left w:w="35" w:type="dxa"/>
               <w:right w:w="35" w:type="dxa"/>
             </w:tcMar>
@@ -1110,8 +1244,8 @@
             <w:tcW w:type="dxa" w:w="3456"/>
             <w:shd w:fill="FFFFFF"/>
             <w:tcMar>
-              <w:top w:w="20" w:type="dxa"/>
-              <w:bottom w:w="20" w:type="dxa"/>
+              <w:top w:w="18" w:type="dxa"/>
+              <w:bottom w:w="18" w:type="dxa"/>
               <w:left w:w="35" w:type="dxa"/>
               <w:right w:w="35" w:type="dxa"/>
             </w:tcMar>
@@ -1143,8 +1277,8 @@
             <w:tcW w:type="dxa" w:w="3168"/>
             <w:shd w:fill="FFFFFF"/>
             <w:tcMar>
-              <w:top w:w="20" w:type="dxa"/>
-              <w:bottom w:w="20" w:type="dxa"/>
+              <w:top w:w="18" w:type="dxa"/>
+              <w:bottom w:w="18" w:type="dxa"/>
               <w:left w:w="35" w:type="dxa"/>
               <w:right w:w="35" w:type="dxa"/>
             </w:tcMar>
@@ -1176,8 +1310,8 @@
             <w:tcW w:type="dxa" w:w="1152"/>
             <w:shd w:fill="FFFFFF"/>
             <w:tcMar>
-              <w:top w:w="20" w:type="dxa"/>
-              <w:bottom w:w="20" w:type="dxa"/>
+              <w:top w:w="18" w:type="dxa"/>
+              <w:bottom w:w="18" w:type="dxa"/>
               <w:left w:w="35" w:type="dxa"/>
               <w:right w:w="35" w:type="dxa"/>
             </w:tcMar>
@@ -1209,8 +1343,8 @@
             <w:tcW w:type="dxa" w:w="2592"/>
             <w:shd w:fill="FFFFFF"/>
             <w:tcMar>
-              <w:top w:w="20" w:type="dxa"/>
-              <w:bottom w:w="20" w:type="dxa"/>
+              <w:top w:w="18" w:type="dxa"/>
+              <w:bottom w:w="18" w:type="dxa"/>
               <w:left w:w="35" w:type="dxa"/>
               <w:right w:w="35" w:type="dxa"/>
             </w:tcMar>
@@ -1267,7 +1401,7 @@
           <w:color w:val="0F172A"/>
           <w:sz w:val="24"/>
         </w:rPr>
-        <w:t>I express my deepest gratitude to my project supervisor, mentors, and the faculty of the Institute of Advanced Research (IAR) for their consistent academic guidance, architectural critiques, and valuable feedback during the object modeling, data dictionary compilation, and dashboard implementation phases.</w:t>
+        <w:t>I express my profound gratitude to my project supervisor, faculty mentors, and academic advisors at Institute of Advanced Research (IAR) for their continued technical guidance, rigorous evaluations, and constructive critiques throughout the software implementation, sample coding, and testing phases of this project.</w:t>
       </w:r>
     </w:p>
     <w:p>
@@ -1282,7 +1416,7 @@
           <w:color w:val="0F172A"/>
           <w:sz w:val="24"/>
         </w:rPr>
-        <w:t>I also thank the institutional administration and the Head of the School for facilitating the computational environments, high-performance data science toolchains, and resources essential to complete Project-1 (CE-502 / PRJ-701) on schedule.</w:t>
+        <w:t>I am equally thankful to the Head of the School and institutional computing administrators for providing laboratory computing clusters and software infrastructure required to complete the curriculum requirements of Project-1 (CE-502 / PRJ-701).</w:t>
       </w:r>
     </w:p>
     <w:p>
@@ -1297,7 +1431,7 @@
           <w:color w:val="0F172A"/>
           <w:sz w:val="24"/>
         </w:rPr>
-        <w:t>Deep Koshiya | B.Sc. in AI &amp; Data Science (Semester V) | Date: 13/10/2026</w:t>
+        <w:t>Deep Koshiya | B.Sc. in AI &amp; Data Science (Semester V) | Date: 27/10/2026</w:t>
       </w:r>
     </w:p>
     <w:p>
@@ -1348,7 +1482,7 @@
           <w:color w:val="0F172A"/>
           <w:sz w:val="24"/>
         </w:rPr>
-        <w:t>Customer retention and longitudinal cohort management represent core determinants of profitability in modern digital commerce. The 'E-Commerce Customer Lifecycle &amp; RFM Segmentation Dashboard' provides an automated data engineering and unsupervised machine learning platform that transforms raw, unorganized transaction streams into structured behavioral intelligence.</w:t>
+        <w:t>Modern multi-channel e-commerce systems log massive transactional order streams across digital channels. However, standard Online Transaction Processing (OLTP) architectures record individual line items rather than synthesizing longitudinal customer journeys. Treating customer accounts as a homogenous entity leads to significant marketing waste, elevated customer acquisition costs (CAC), and undetected churn.</w:t>
       </w:r>
     </w:p>
     <w:p>
@@ -1363,21 +1497,56 @@
           <w:color w:val="0F172A"/>
           <w:sz w:val="24"/>
         </w:rPr>
-        <w:t>This Second Phase (Mid-Term) report documents the complete structural design and preliminary implementation deliverables. Specifically, it presents the formal UML Class Diagram (Section 2.3) modeling pipeline domain entities; UML Sequence Diagrams (Section 2.4) detailing message dispatch protocols; a comprehensive Star-Schema Data Dictionary (Section 3.1) specifying FACT_TRANSACTIONS, FACT_REVERSALS, and DIM_CUSTOMERS with primary/foreign keys and validation constraints; and high-fidelity Screen Layouts with Operational Input Validations (Section 4.1). These deliverables satisfy all requirements for the 20-mark Mid-Term evaluation milestone.</w:t>
+        <w:t>The 'E-Commerce Customer Lifecycle &amp; RFM Segmentation Dashboard' resolves these commercial vulnerabilities through an end-to-end data analytics and unsupervised machine learning engineering system. The automated Python pipeline ingests raw transaction event logs, enforces strict schema typing, drops unauthenticated guest checkouts, segregates cancellations into an isolated audit store, and neutralizes wholesale volume spikes using Tukey's Interquartile Range (IQR) fences. A vectorized feature store calculates Recency, Frequency, Monetary spend, and Average Order Value (AOV). Monetary skewness is normalized using log1p compression and Z-score standardization before fitting unsupervised K-Means clustering (evaluated via Silhouette scores), supported by a deterministic 1–5 quantile scoring fallback mapping accounts to 8 operational business cohorts.</w:t>
+      </w:r>
+    </w:p>
+    <w:p>
+      <w:pPr>
+        <w:spacing w:before="0" w:after="70" w:line="276" w:lineRule="auto"/>
+        <w:jc w:val="both"/>
+      </w:pPr>
+      <w:r>
+        <w:rPr>
+          <w:rFonts w:ascii="Times New Roman" w:hAnsi="Times New Roman"/>
+          <w:i w:val="0"/>
+          <w:color w:val="0F172A"/>
+          <w:sz w:val="24"/>
+        </w:rPr>
+        <w:t>This Third Phase Project Report delivers complete technical documentation for the 27/10/2026 evaluation milestone (10 Marks). It presents sample production code with cybersecurity controls (Section 4.2), step-by-step execution protocols and dashboard navigation workflows (Section 4.3), commercial importance of worked-out tasks (Section 5.1), roadmap for future artificial intelligence enhancements (Section 5.2), and comprehensive academic and technological references (Section 6.1).</w:t>
+      </w:r>
+    </w:p>
+    <w:p>
+      <w:r>
+        <w:br w:type="page"/>
+      </w:r>
+    </w:p>
+    <w:p>
+      <w:pPr>
+        <w:spacing w:before="0" w:after="20" w:line="276" w:lineRule="auto"/>
+        <w:jc w:val="right"/>
+      </w:pPr>
+      <w:r>
+        <w:rPr>
+          <w:rFonts w:ascii="Times New Roman" w:hAnsi="Times New Roman"/>
+          <w:i/>
+          <w:color w:val="0F172A"/>
+          <w:sz w:val="24"/>
+        </w:rPr>
+        <w:t>Page III</w:t>
       </w:r>
     </w:p>
     <w:p>
       <w:pPr>
         <w:keepNext/>
-        <w:spacing w:before="100" w:after="20"/>
+        <w:spacing w:before="40" w:after="20"/>
         <w:jc w:val="left"/>
       </w:pPr>
       <w:r>
         <w:rPr>
           <w:rFonts w:ascii="Times New Roman" w:hAnsi="Times New Roman"/>
           <w:b/>
-          <w:color w:val="0F172A"/>
-          <w:sz w:val="28"/>
+          <w:color w:val="1E1B4B"/>
+          <w:sz w:val="32"/>
         </w:rPr>
         <w:t>INDEX OF THE PROJECT REPORT</w:t>
       </w:r>
@@ -1514,7 +1683,7 @@
                 <w:color w:val="FFFFFF"/>
                 <w:sz w:val="16"/>
               </w:rPr>
-              <w:t>PAGE &amp; STATUS</w:t>
+              <w:t>STATUS &amp; PAGE</w:t>
             </w:r>
           </w:p>
         </w:tc>
@@ -1523,13 +1692,13 @@
         <w:tc>
           <w:tcPr>
             <w:tcW w:type="dxa" w:w="864"/>
+            <w:shd w:fill="EFF6FF"/>
             <w:tcMar>
-              <w:top w:w="14" w:type="dxa"/>
-              <w:bottom w:w="14" w:type="dxa"/>
-              <w:left w:w="30" w:type="dxa"/>
-              <w:right w:w="30" w:type="dxa"/>
+              <w:top w:w="11" w:type="dxa"/>
+              <w:bottom w:w="11" w:type="dxa"/>
+              <w:left w:w="25" w:type="dxa"/>
+              <w:right w:w="25" w:type="dxa"/>
             </w:tcMar>
-            <w:shd w:fill="EFF6FF"/>
             <w:tcBorders>
               <w:top w:val="single" w:sz="4" w:space="0" w:color="CBD5E1"/>
               <w:left w:val="single" w:sz="4" w:space="0" w:color="CBD5E1"/>
@@ -1556,13 +1725,13 @@
         <w:tc>
           <w:tcPr>
             <w:tcW w:type="dxa" w:w="4608"/>
+            <w:shd w:fill="EFF6FF"/>
             <w:tcMar>
-              <w:top w:w="14" w:type="dxa"/>
-              <w:bottom w:w="14" w:type="dxa"/>
-              <w:left w:w="30" w:type="dxa"/>
-              <w:right w:w="30" w:type="dxa"/>
+              <w:top w:w="11" w:type="dxa"/>
+              <w:bottom w:w="11" w:type="dxa"/>
+              <w:left w:w="25" w:type="dxa"/>
+              <w:right w:w="25" w:type="dxa"/>
             </w:tcMar>
-            <w:shd w:fill="EFF6FF"/>
             <w:tcBorders>
               <w:top w:val="single" w:sz="4" w:space="0" w:color="CBD5E1"/>
               <w:left w:val="single" w:sz="4" w:space="0" w:color="CBD5E1"/>
@@ -1589,13 +1758,13 @@
         <w:tc>
           <w:tcPr>
             <w:tcW w:type="dxa" w:w="1584"/>
+            <w:shd w:fill="EFF6FF"/>
             <w:tcMar>
-              <w:top w:w="14" w:type="dxa"/>
-              <w:bottom w:w="14" w:type="dxa"/>
-              <w:left w:w="30" w:type="dxa"/>
-              <w:right w:w="30" w:type="dxa"/>
+              <w:top w:w="11" w:type="dxa"/>
+              <w:bottom w:w="11" w:type="dxa"/>
+              <w:left w:w="25" w:type="dxa"/>
+              <w:right w:w="25" w:type="dxa"/>
             </w:tcMar>
-            <w:shd w:fill="EFF6FF"/>
             <w:tcBorders>
               <w:top w:val="single" w:sz="4" w:space="0" w:color="CBD5E1"/>
               <w:left w:val="single" w:sz="4" w:space="0" w:color="CBD5E1"/>
@@ -1615,20 +1784,20 @@
                 <w:color w:val="0F172A"/>
                 <w:sz w:val="15"/>
               </w:rPr>
-              <w:t>13/10/2026</w:t>
+              <w:t>27/10/2026</w:t>
             </w:r>
           </w:p>
         </w:tc>
         <w:tc>
           <w:tcPr>
             <w:tcW w:type="dxa" w:w="2160"/>
+            <w:shd w:fill="EFF6FF"/>
             <w:tcMar>
-              <w:top w:w="14" w:type="dxa"/>
-              <w:bottom w:w="14" w:type="dxa"/>
-              <w:left w:w="30" w:type="dxa"/>
-              <w:right w:w="30" w:type="dxa"/>
+              <w:top w:w="11" w:type="dxa"/>
+              <w:bottom w:w="11" w:type="dxa"/>
+              <w:left w:w="25" w:type="dxa"/>
+              <w:right w:w="25" w:type="dxa"/>
             </w:tcMar>
-            <w:shd w:fill="EFF6FF"/>
             <w:tcBorders>
               <w:top w:val="single" w:sz="4" w:space="0" w:color="CBD5E1"/>
               <w:left w:val="single" w:sz="4" w:space="0" w:color="CBD5E1"/>
@@ -1657,13 +1826,13 @@
         <w:tc>
           <w:tcPr>
             <w:tcW w:type="dxa" w:w="864"/>
+            <w:shd w:fill="EFF6FF"/>
             <w:tcMar>
-              <w:top w:w="14" w:type="dxa"/>
-              <w:bottom w:w="14" w:type="dxa"/>
-              <w:left w:w="30" w:type="dxa"/>
-              <w:right w:w="30" w:type="dxa"/>
+              <w:top w:w="11" w:type="dxa"/>
+              <w:bottom w:w="11" w:type="dxa"/>
+              <w:left w:w="25" w:type="dxa"/>
+              <w:right w:w="25" w:type="dxa"/>
             </w:tcMar>
-            <w:shd w:fill="EFF6FF"/>
             <w:tcBorders>
               <w:top w:val="single" w:sz="4" w:space="0" w:color="CBD5E1"/>
               <w:left w:val="single" w:sz="4" w:space="0" w:color="CBD5E1"/>
@@ -1690,13 +1859,13 @@
         <w:tc>
           <w:tcPr>
             <w:tcW w:type="dxa" w:w="4608"/>
+            <w:shd w:fill="EFF6FF"/>
             <w:tcMar>
-              <w:top w:w="14" w:type="dxa"/>
-              <w:bottom w:w="14" w:type="dxa"/>
-              <w:left w:w="30" w:type="dxa"/>
-              <w:right w:w="30" w:type="dxa"/>
+              <w:top w:w="11" w:type="dxa"/>
+              <w:bottom w:w="11" w:type="dxa"/>
+              <w:left w:w="25" w:type="dxa"/>
+              <w:right w:w="25" w:type="dxa"/>
             </w:tcMar>
-            <w:shd w:fill="EFF6FF"/>
             <w:tcBorders>
               <w:top w:val="single" w:sz="4" w:space="0" w:color="CBD5E1"/>
               <w:left w:val="single" w:sz="4" w:space="0" w:color="CBD5E1"/>
@@ -1716,20 +1885,20 @@
                 <w:color w:val="0F172A"/>
                 <w:sz w:val="15"/>
               </w:rPr>
-              <w:t>Abstract &amp; Project Curriculum Index</w:t>
+              <w:t>Abstract</w:t>
             </w:r>
           </w:p>
         </w:tc>
         <w:tc>
           <w:tcPr>
             <w:tcW w:type="dxa" w:w="1584"/>
+            <w:shd w:fill="EFF6FF"/>
             <w:tcMar>
-              <w:top w:w="14" w:type="dxa"/>
-              <w:bottom w:w="14" w:type="dxa"/>
-              <w:left w:w="30" w:type="dxa"/>
-              <w:right w:w="30" w:type="dxa"/>
+              <w:top w:w="11" w:type="dxa"/>
+              <w:bottom w:w="11" w:type="dxa"/>
+              <w:left w:w="25" w:type="dxa"/>
+              <w:right w:w="25" w:type="dxa"/>
             </w:tcMar>
-            <w:shd w:fill="EFF6FF"/>
             <w:tcBorders>
               <w:top w:val="single" w:sz="4" w:space="0" w:color="CBD5E1"/>
               <w:left w:val="single" w:sz="4" w:space="0" w:color="CBD5E1"/>
@@ -1749,20 +1918,20 @@
                 <w:color w:val="0F172A"/>
                 <w:sz w:val="15"/>
               </w:rPr>
-              <w:t>13/10/2026</w:t>
+              <w:t>27/10/2026</w:t>
             </w:r>
           </w:p>
         </w:tc>
         <w:tc>
           <w:tcPr>
             <w:tcW w:type="dxa" w:w="2160"/>
+            <w:shd w:fill="EFF6FF"/>
             <w:tcMar>
-              <w:top w:w="14" w:type="dxa"/>
-              <w:bottom w:w="14" w:type="dxa"/>
-              <w:left w:w="30" w:type="dxa"/>
-              <w:right w:w="30" w:type="dxa"/>
+              <w:top w:w="11" w:type="dxa"/>
+              <w:bottom w:w="11" w:type="dxa"/>
+              <w:left w:w="25" w:type="dxa"/>
+              <w:right w:w="25" w:type="dxa"/>
             </w:tcMar>
-            <w:shd w:fill="EFF6FF"/>
             <w:tcBorders>
               <w:top w:val="single" w:sz="4" w:space="0" w:color="CBD5E1"/>
               <w:left w:val="single" w:sz="4" w:space="0" w:color="CBD5E1"/>
@@ -1791,13 +1960,13 @@
         <w:tc>
           <w:tcPr>
             <w:tcW w:type="dxa" w:w="864"/>
+            <w:shd w:fill="EFF6FF"/>
             <w:tcMar>
-              <w:top w:w="14" w:type="dxa"/>
-              <w:bottom w:w="14" w:type="dxa"/>
-              <w:left w:w="30" w:type="dxa"/>
-              <w:right w:w="30" w:type="dxa"/>
+              <w:top w:w="11" w:type="dxa"/>
+              <w:bottom w:w="11" w:type="dxa"/>
+              <w:left w:w="25" w:type="dxa"/>
+              <w:right w:w="25" w:type="dxa"/>
             </w:tcMar>
-            <w:shd w:fill="EFF6FF"/>
             <w:tcBorders>
               <w:top w:val="single" w:sz="4" w:space="0" w:color="CBD5E1"/>
               <w:left w:val="single" w:sz="4" w:space="0" w:color="CBD5E1"/>
@@ -1817,20 +1986,20 @@
                 <w:color w:val="0F172A"/>
                 <w:sz w:val="15"/>
               </w:rPr>
-              <w:t>1.1-1.3</w:t>
+              <w:t>*</w:t>
             </w:r>
           </w:p>
         </w:tc>
         <w:tc>
           <w:tcPr>
             <w:tcW w:type="dxa" w:w="4608"/>
+            <w:shd w:fill="EFF6FF"/>
             <w:tcMar>
-              <w:top w:w="14" w:type="dxa"/>
-              <w:bottom w:w="14" w:type="dxa"/>
-              <w:left w:w="30" w:type="dxa"/>
-              <w:right w:w="30" w:type="dxa"/>
+              <w:top w:w="11" w:type="dxa"/>
+              <w:bottom w:w="11" w:type="dxa"/>
+              <w:left w:w="25" w:type="dxa"/>
+              <w:right w:w="25" w:type="dxa"/>
             </w:tcMar>
-            <w:shd w:fill="EFF6FF"/>
             <w:tcBorders>
               <w:top w:val="single" w:sz="4" w:space="0" w:color="CBD5E1"/>
               <w:left w:val="single" w:sz="4" w:space="0" w:color="CBD5E1"/>
@@ -1850,20 +2019,288 @@
                 <w:color w:val="0F172A"/>
                 <w:sz w:val="15"/>
               </w:rPr>
-              <w:t>About the System: Problem Definition, Requirements &amp; Tools</w:t>
+              <w:t>Index of the Project Report</w:t>
             </w:r>
           </w:p>
         </w:tc>
         <w:tc>
           <w:tcPr>
             <w:tcW w:type="dxa" w:w="1584"/>
+            <w:shd w:fill="EFF6FF"/>
             <w:tcMar>
-              <w:top w:w="14" w:type="dxa"/>
-              <w:bottom w:w="14" w:type="dxa"/>
-              <w:left w:w="30" w:type="dxa"/>
-              <w:right w:w="30" w:type="dxa"/>
+              <w:top w:w="11" w:type="dxa"/>
+              <w:bottom w:w="11" w:type="dxa"/>
+              <w:left w:w="25" w:type="dxa"/>
+              <w:right w:w="25" w:type="dxa"/>
             </w:tcMar>
+            <w:tcBorders>
+              <w:top w:val="single" w:sz="4" w:space="0" w:color="CBD5E1"/>
+              <w:left w:val="single" w:sz="4" w:space="0" w:color="CBD5E1"/>
+              <w:bottom w:val="single" w:sz="4" w:space="0" w:color="CBD5E1"/>
+              <w:right w:val="single" w:sz="4" w:space="0" w:color="CBD5E1"/>
+            </w:tcBorders>
+          </w:tcPr>
+          <w:p>
+            <w:pPr>
+              <w:spacing w:before="0" w:after="0" w:line="252" w:lineRule="auto"/>
+              <w:jc w:val="center"/>
+            </w:pPr>
+            <w:r>
+              <w:rPr>
+                <w:rFonts w:ascii="Times New Roman" w:hAnsi="Times New Roman"/>
+                <w:b w:val="0"/>
+                <w:color w:val="0F172A"/>
+                <w:sz w:val="15"/>
+              </w:rPr>
+              <w:t>27/10/2026</w:t>
+            </w:r>
+          </w:p>
+        </w:tc>
+        <w:tc>
+          <w:tcPr>
+            <w:tcW w:type="dxa" w:w="2160"/>
             <w:shd w:fill="EFF6FF"/>
+            <w:tcMar>
+              <w:top w:w="11" w:type="dxa"/>
+              <w:bottom w:w="11" w:type="dxa"/>
+              <w:left w:w="25" w:type="dxa"/>
+              <w:right w:w="25" w:type="dxa"/>
+            </w:tcMar>
+            <w:tcBorders>
+              <w:top w:val="single" w:sz="4" w:space="0" w:color="CBD5E1"/>
+              <w:left w:val="single" w:sz="4" w:space="0" w:color="CBD5E1"/>
+              <w:bottom w:val="single" w:sz="4" w:space="0" w:color="CBD5E1"/>
+              <w:right w:val="single" w:sz="4" w:space="0" w:color="CBD5E1"/>
+            </w:tcBorders>
+          </w:tcPr>
+          <w:p>
+            <w:pPr>
+              <w:spacing w:before="0" w:after="0" w:line="252" w:lineRule="auto"/>
+              <w:jc w:val="left"/>
+            </w:pPr>
+            <w:r>
+              <w:rPr>
+                <w:rFonts w:ascii="Times New Roman" w:hAnsi="Times New Roman"/>
+                <w:b/>
+                <w:color w:val="0F172A"/>
+                <w:sz w:val="15"/>
+              </w:rPr>
+              <w:t>Page III [Completed]</w:t>
+            </w:r>
+          </w:p>
+        </w:tc>
+      </w:tr>
+      <w:tr>
+        <w:tc>
+          <w:tcPr>
+            <w:tcW w:type="dxa" w:w="864"/>
+            <w:shd w:fill="EFF6FF"/>
+            <w:tcMar>
+              <w:top w:w="11" w:type="dxa"/>
+              <w:bottom w:w="11" w:type="dxa"/>
+              <w:left w:w="25" w:type="dxa"/>
+              <w:right w:w="25" w:type="dxa"/>
+            </w:tcMar>
+            <w:tcBorders>
+              <w:top w:val="single" w:sz="4" w:space="0" w:color="CBD5E1"/>
+              <w:left w:val="single" w:sz="4" w:space="0" w:color="CBD5E1"/>
+              <w:bottom w:val="single" w:sz="4" w:space="0" w:color="CBD5E1"/>
+              <w:right w:val="single" w:sz="4" w:space="0" w:color="CBD5E1"/>
+            </w:tcBorders>
+          </w:tcPr>
+          <w:p>
+            <w:pPr>
+              <w:spacing w:before="0" w:after="0" w:line="252" w:lineRule="auto"/>
+              <w:jc w:val="center"/>
+            </w:pPr>
+            <w:r>
+              <w:rPr>
+                <w:rFonts w:ascii="Times New Roman" w:hAnsi="Times New Roman"/>
+                <w:b w:val="0"/>
+                <w:color w:val="0F172A"/>
+                <w:sz w:val="15"/>
+              </w:rPr>
+              <w:t>*</w:t>
+            </w:r>
+          </w:p>
+        </w:tc>
+        <w:tc>
+          <w:tcPr>
+            <w:tcW w:type="dxa" w:w="4608"/>
+            <w:shd w:fill="EFF6FF"/>
+            <w:tcMar>
+              <w:top w:w="11" w:type="dxa"/>
+              <w:bottom w:w="11" w:type="dxa"/>
+              <w:left w:w="25" w:type="dxa"/>
+              <w:right w:w="25" w:type="dxa"/>
+            </w:tcMar>
+            <w:tcBorders>
+              <w:top w:val="single" w:sz="4" w:space="0" w:color="CBD5E1"/>
+              <w:left w:val="single" w:sz="4" w:space="0" w:color="CBD5E1"/>
+              <w:bottom w:val="single" w:sz="4" w:space="0" w:color="CBD5E1"/>
+              <w:right w:val="single" w:sz="4" w:space="0" w:color="CBD5E1"/>
+            </w:tcBorders>
+          </w:tcPr>
+          <w:p>
+            <w:pPr>
+              <w:spacing w:before="0" w:after="0" w:line="252" w:lineRule="auto"/>
+              <w:jc w:val="left"/>
+            </w:pPr>
+            <w:r>
+              <w:rPr>
+                <w:rFonts w:ascii="Times New Roman" w:hAnsi="Times New Roman"/>
+                <w:b/>
+                <w:color w:val="0F172A"/>
+                <w:sz w:val="15"/>
+              </w:rPr>
+              <w:t>List of Figures &amp; List of Tables</w:t>
+            </w:r>
+          </w:p>
+        </w:tc>
+        <w:tc>
+          <w:tcPr>
+            <w:tcW w:type="dxa" w:w="1584"/>
+            <w:shd w:fill="EFF6FF"/>
+            <w:tcMar>
+              <w:top w:w="11" w:type="dxa"/>
+              <w:bottom w:w="11" w:type="dxa"/>
+              <w:left w:w="25" w:type="dxa"/>
+              <w:right w:w="25" w:type="dxa"/>
+            </w:tcMar>
+            <w:tcBorders>
+              <w:top w:val="single" w:sz="4" w:space="0" w:color="CBD5E1"/>
+              <w:left w:val="single" w:sz="4" w:space="0" w:color="CBD5E1"/>
+              <w:bottom w:val="single" w:sz="4" w:space="0" w:color="CBD5E1"/>
+              <w:right w:val="single" w:sz="4" w:space="0" w:color="CBD5E1"/>
+            </w:tcBorders>
+          </w:tcPr>
+          <w:p>
+            <w:pPr>
+              <w:spacing w:before="0" w:after="0" w:line="252" w:lineRule="auto"/>
+              <w:jc w:val="center"/>
+            </w:pPr>
+            <w:r>
+              <w:rPr>
+                <w:rFonts w:ascii="Times New Roman" w:hAnsi="Times New Roman"/>
+                <w:b w:val="0"/>
+                <w:color w:val="0F172A"/>
+                <w:sz w:val="15"/>
+              </w:rPr>
+              <w:t>27/10/2026</w:t>
+            </w:r>
+          </w:p>
+        </w:tc>
+        <w:tc>
+          <w:tcPr>
+            <w:tcW w:type="dxa" w:w="2160"/>
+            <w:shd w:fill="EFF6FF"/>
+            <w:tcMar>
+              <w:top w:w="11" w:type="dxa"/>
+              <w:bottom w:w="11" w:type="dxa"/>
+              <w:left w:w="25" w:type="dxa"/>
+              <w:right w:w="25" w:type="dxa"/>
+            </w:tcMar>
+            <w:tcBorders>
+              <w:top w:val="single" w:sz="4" w:space="0" w:color="CBD5E1"/>
+              <w:left w:val="single" w:sz="4" w:space="0" w:color="CBD5E1"/>
+              <w:bottom w:val="single" w:sz="4" w:space="0" w:color="CBD5E1"/>
+              <w:right w:val="single" w:sz="4" w:space="0" w:color="CBD5E1"/>
+            </w:tcBorders>
+          </w:tcPr>
+          <w:p>
+            <w:pPr>
+              <w:spacing w:before="0" w:after="0" w:line="252" w:lineRule="auto"/>
+              <w:jc w:val="left"/>
+            </w:pPr>
+            <w:r>
+              <w:rPr>
+                <w:rFonts w:ascii="Times New Roman" w:hAnsi="Times New Roman"/>
+                <w:b/>
+                <w:color w:val="0F172A"/>
+                <w:sz w:val="15"/>
+              </w:rPr>
+              <w:t>Page IV [Completed]</w:t>
+            </w:r>
+          </w:p>
+        </w:tc>
+      </w:tr>
+      <w:tr>
+        <w:tc>
+          <w:tcPr>
+            <w:tcW w:type="dxa" w:w="864"/>
+            <w:shd w:fill="EFF6FF"/>
+            <w:tcMar>
+              <w:top w:w="11" w:type="dxa"/>
+              <w:bottom w:w="11" w:type="dxa"/>
+              <w:left w:w="25" w:type="dxa"/>
+              <w:right w:w="25" w:type="dxa"/>
+            </w:tcMar>
+            <w:tcBorders>
+              <w:top w:val="single" w:sz="4" w:space="0" w:color="CBD5E1"/>
+              <w:left w:val="single" w:sz="4" w:space="0" w:color="CBD5E1"/>
+              <w:bottom w:val="single" w:sz="4" w:space="0" w:color="CBD5E1"/>
+              <w:right w:val="single" w:sz="4" w:space="0" w:color="CBD5E1"/>
+            </w:tcBorders>
+          </w:tcPr>
+          <w:p>
+            <w:pPr>
+              <w:spacing w:before="0" w:after="0" w:line="252" w:lineRule="auto"/>
+              <w:jc w:val="center"/>
+            </w:pPr>
+            <w:r>
+              <w:rPr>
+                <w:rFonts w:ascii="Times New Roman" w:hAnsi="Times New Roman"/>
+                <w:b w:val="0"/>
+                <w:color w:val="0F172A"/>
+                <w:sz w:val="15"/>
+              </w:rPr>
+              <w:t>1</w:t>
+            </w:r>
+          </w:p>
+        </w:tc>
+        <w:tc>
+          <w:tcPr>
+            <w:tcW w:type="dxa" w:w="4608"/>
+            <w:shd w:fill="EFF6FF"/>
+            <w:tcMar>
+              <w:top w:w="11" w:type="dxa"/>
+              <w:bottom w:w="11" w:type="dxa"/>
+              <w:left w:w="25" w:type="dxa"/>
+              <w:right w:w="25" w:type="dxa"/>
+            </w:tcMar>
+            <w:tcBorders>
+              <w:top w:val="single" w:sz="4" w:space="0" w:color="CBD5E1"/>
+              <w:left w:val="single" w:sz="4" w:space="0" w:color="CBD5E1"/>
+              <w:bottom w:val="single" w:sz="4" w:space="0" w:color="CBD5E1"/>
+              <w:right w:val="single" w:sz="4" w:space="0" w:color="CBD5E1"/>
+            </w:tcBorders>
+          </w:tcPr>
+          <w:p>
+            <w:pPr>
+              <w:spacing w:before="0" w:after="0" w:line="252" w:lineRule="auto"/>
+              <w:jc w:val="left"/>
+            </w:pPr>
+            <w:r>
+              <w:rPr>
+                <w:rFonts w:ascii="Times New Roman" w:hAnsi="Times New Roman"/>
+                <w:b/>
+                <w:color w:val="0F172A"/>
+                <w:sz w:val="15"/>
+              </w:rPr>
+              <w:t>ABOUT THE SYSTEM (1.1 Problem, 1.2 Requirements, 1.3 Tools)</w:t>
+            </w:r>
+          </w:p>
+        </w:tc>
+        <w:tc>
+          <w:tcPr>
+            <w:tcW w:type="dxa" w:w="1584"/>
+            <w:shd w:fill="EFF6FF"/>
+            <w:tcMar>
+              <w:top w:w="11" w:type="dxa"/>
+              <w:bottom w:w="11" w:type="dxa"/>
+              <w:left w:w="25" w:type="dxa"/>
+              <w:right w:w="25" w:type="dxa"/>
+            </w:tcMar>
             <w:tcBorders>
               <w:top w:val="single" w:sz="4" w:space="0" w:color="CBD5E1"/>
               <w:left w:val="single" w:sz="4" w:space="0" w:color="CBD5E1"/>
@@ -1890,13 +2327,13 @@
         <w:tc>
           <w:tcPr>
             <w:tcW w:type="dxa" w:w="2160"/>
+            <w:shd w:fill="EFF6FF"/>
             <w:tcMar>
-              <w:top w:w="14" w:type="dxa"/>
-              <w:bottom w:w="14" w:type="dxa"/>
-              <w:left w:w="30" w:type="dxa"/>
-              <w:right w:w="30" w:type="dxa"/>
+              <w:top w:w="11" w:type="dxa"/>
+              <w:bottom w:w="11" w:type="dxa"/>
+              <w:left w:w="25" w:type="dxa"/>
+              <w:right w:w="25" w:type="dxa"/>
             </w:tcMar>
-            <w:shd w:fill="EFF6FF"/>
             <w:tcBorders>
               <w:top w:val="single" w:sz="4" w:space="0" w:color="CBD5E1"/>
               <w:left w:val="single" w:sz="4" w:space="0" w:color="CBD5E1"/>
@@ -1925,13 +2362,13 @@
         <w:tc>
           <w:tcPr>
             <w:tcW w:type="dxa" w:w="864"/>
+            <w:shd w:fill="EFF6FF"/>
             <w:tcMar>
-              <w:top w:w="14" w:type="dxa"/>
-              <w:bottom w:w="14" w:type="dxa"/>
-              <w:left w:w="30" w:type="dxa"/>
-              <w:right w:w="30" w:type="dxa"/>
+              <w:top w:w="11" w:type="dxa"/>
+              <w:bottom w:w="11" w:type="dxa"/>
+              <w:left w:w="25" w:type="dxa"/>
+              <w:right w:w="25" w:type="dxa"/>
             </w:tcMar>
-            <w:shd w:fill="EFF6FF"/>
             <w:tcBorders>
               <w:top w:val="single" w:sz="4" w:space="0" w:color="CBD5E1"/>
               <w:left w:val="single" w:sz="4" w:space="0" w:color="CBD5E1"/>
@@ -1958,13 +2395,13 @@
         <w:tc>
           <w:tcPr>
             <w:tcW w:type="dxa" w:w="4608"/>
+            <w:shd w:fill="EFF6FF"/>
             <w:tcMar>
-              <w:top w:w="14" w:type="dxa"/>
-              <w:bottom w:w="14" w:type="dxa"/>
-              <w:left w:w="30" w:type="dxa"/>
-              <w:right w:w="30" w:type="dxa"/>
+              <w:top w:w="11" w:type="dxa"/>
+              <w:bottom w:w="11" w:type="dxa"/>
+              <w:left w:w="25" w:type="dxa"/>
+              <w:right w:w="25" w:type="dxa"/>
             </w:tcMar>
-            <w:shd w:fill="EFF6FF"/>
             <w:tcBorders>
               <w:top w:val="single" w:sz="4" w:space="0" w:color="CBD5E1"/>
               <w:left w:val="single" w:sz="4" w:space="0" w:color="CBD5E1"/>
@@ -1991,13 +2428,13 @@
         <w:tc>
           <w:tcPr>
             <w:tcW w:type="dxa" w:w="1584"/>
+            <w:shd w:fill="EFF6FF"/>
             <w:tcMar>
-              <w:top w:w="14" w:type="dxa"/>
-              <w:bottom w:w="14" w:type="dxa"/>
-              <w:left w:w="30" w:type="dxa"/>
-              <w:right w:w="30" w:type="dxa"/>
+              <w:top w:w="11" w:type="dxa"/>
+              <w:bottom w:w="11" w:type="dxa"/>
+              <w:left w:w="25" w:type="dxa"/>
+              <w:right w:w="25" w:type="dxa"/>
             </w:tcMar>
-            <w:shd w:fill="EFF6FF"/>
             <w:tcBorders>
               <w:top w:val="single" w:sz="4" w:space="0" w:color="CBD5E1"/>
               <w:left w:val="single" w:sz="4" w:space="0" w:color="CBD5E1"/>
@@ -2024,13 +2461,13 @@
         <w:tc>
           <w:tcPr>
             <w:tcW w:type="dxa" w:w="2160"/>
+            <w:shd w:fill="EFF6FF"/>
             <w:tcMar>
-              <w:top w:w="14" w:type="dxa"/>
-              <w:bottom w:w="14" w:type="dxa"/>
-              <w:left w:w="30" w:type="dxa"/>
-              <w:right w:w="30" w:type="dxa"/>
+              <w:top w:w="11" w:type="dxa"/>
+              <w:bottom w:w="11" w:type="dxa"/>
+              <w:left w:w="25" w:type="dxa"/>
+              <w:right w:w="25" w:type="dxa"/>
             </w:tcMar>
-            <w:shd w:fill="EFF6FF"/>
             <w:tcBorders>
               <w:top w:val="single" w:sz="4" w:space="0" w:color="CBD5E1"/>
               <w:left w:val="single" w:sz="4" w:space="0" w:color="CBD5E1"/>
@@ -2059,13 +2496,13 @@
         <w:tc>
           <w:tcPr>
             <w:tcW w:type="dxa" w:w="864"/>
+            <w:shd w:fill="EFF6FF"/>
             <w:tcMar>
-              <w:top w:w="14" w:type="dxa"/>
-              <w:bottom w:w="14" w:type="dxa"/>
-              <w:left w:w="30" w:type="dxa"/>
-              <w:right w:w="30" w:type="dxa"/>
+              <w:top w:w="11" w:type="dxa"/>
+              <w:bottom w:w="11" w:type="dxa"/>
+              <w:left w:w="25" w:type="dxa"/>
+              <w:right w:w="25" w:type="dxa"/>
             </w:tcMar>
-            <w:shd w:fill="EFF6FF"/>
             <w:tcBorders>
               <w:top w:val="single" w:sz="4" w:space="0" w:color="CBD5E1"/>
               <w:left w:val="single" w:sz="4" w:space="0" w:color="CBD5E1"/>
@@ -2092,13 +2529,13 @@
         <w:tc>
           <w:tcPr>
             <w:tcW w:type="dxa" w:w="4608"/>
+            <w:shd w:fill="EFF6FF"/>
             <w:tcMar>
-              <w:top w:w="14" w:type="dxa"/>
-              <w:bottom w:w="14" w:type="dxa"/>
-              <w:left w:w="30" w:type="dxa"/>
-              <w:right w:w="30" w:type="dxa"/>
+              <w:top w:w="11" w:type="dxa"/>
+              <w:bottom w:w="11" w:type="dxa"/>
+              <w:left w:w="25" w:type="dxa"/>
+              <w:right w:w="25" w:type="dxa"/>
             </w:tcMar>
-            <w:shd w:fill="EFF6FF"/>
             <w:tcBorders>
               <w:top w:val="single" w:sz="4" w:space="0" w:color="CBD5E1"/>
               <w:left w:val="single" w:sz="4" w:space="0" w:color="CBD5E1"/>
@@ -2125,13 +2562,13 @@
         <w:tc>
           <w:tcPr>
             <w:tcW w:type="dxa" w:w="1584"/>
+            <w:shd w:fill="EFF6FF"/>
             <w:tcMar>
-              <w:top w:w="14" w:type="dxa"/>
-              <w:bottom w:w="14" w:type="dxa"/>
-              <w:left w:w="30" w:type="dxa"/>
-              <w:right w:w="30" w:type="dxa"/>
+              <w:top w:w="11" w:type="dxa"/>
+              <w:bottom w:w="11" w:type="dxa"/>
+              <w:left w:w="25" w:type="dxa"/>
+              <w:right w:w="25" w:type="dxa"/>
             </w:tcMar>
-            <w:shd w:fill="EFF6FF"/>
             <w:tcBorders>
               <w:top w:val="single" w:sz="4" w:space="0" w:color="CBD5E1"/>
               <w:left w:val="single" w:sz="4" w:space="0" w:color="CBD5E1"/>
@@ -2158,13 +2595,13 @@
         <w:tc>
           <w:tcPr>
             <w:tcW w:type="dxa" w:w="2160"/>
+            <w:shd w:fill="EFF6FF"/>
             <w:tcMar>
-              <w:top w:w="14" w:type="dxa"/>
-              <w:bottom w:w="14" w:type="dxa"/>
-              <w:left w:w="30" w:type="dxa"/>
-              <w:right w:w="30" w:type="dxa"/>
+              <w:top w:w="11" w:type="dxa"/>
+              <w:bottom w:w="11" w:type="dxa"/>
+              <w:left w:w="25" w:type="dxa"/>
+              <w:right w:w="25" w:type="dxa"/>
             </w:tcMar>
-            <w:shd w:fill="EFF6FF"/>
             <w:tcBorders>
               <w:top w:val="single" w:sz="4" w:space="0" w:color="CBD5E1"/>
               <w:left w:val="single" w:sz="4" w:space="0" w:color="CBD5E1"/>
@@ -2193,13 +2630,13 @@
         <w:tc>
           <w:tcPr>
             <w:tcW w:type="dxa" w:w="864"/>
+            <w:shd w:fill="EFF6FF"/>
             <w:tcMar>
-              <w:top w:w="14" w:type="dxa"/>
-              <w:bottom w:w="14" w:type="dxa"/>
-              <w:left w:w="30" w:type="dxa"/>
-              <w:right w:w="30" w:type="dxa"/>
+              <w:top w:w="11" w:type="dxa"/>
+              <w:bottom w:w="11" w:type="dxa"/>
+              <w:left w:w="25" w:type="dxa"/>
+              <w:right w:w="25" w:type="dxa"/>
             </w:tcMar>
-            <w:shd w:fill="DCFCE7"/>
             <w:tcBorders>
               <w:top w:val="single" w:sz="4" w:space="0" w:color="CBD5E1"/>
               <w:left w:val="single" w:sz="4" w:space="0" w:color="CBD5E1"/>
@@ -2219,20 +2656,20 @@
                 <w:color w:val="0F172A"/>
                 <w:sz w:val="15"/>
               </w:rPr>
-              <w:t>2.3</w:t>
+              <w:t>2.3-2.4</w:t>
             </w:r>
           </w:p>
         </w:tc>
         <w:tc>
           <w:tcPr>
             <w:tcW w:type="dxa" w:w="4608"/>
+            <w:shd w:fill="EFF6FF"/>
             <w:tcMar>
-              <w:top w:w="14" w:type="dxa"/>
-              <w:bottom w:w="14" w:type="dxa"/>
-              <w:left w:w="30" w:type="dxa"/>
-              <w:right w:w="30" w:type="dxa"/>
+              <w:top w:w="11" w:type="dxa"/>
+              <w:bottom w:w="11" w:type="dxa"/>
+              <w:left w:w="25" w:type="dxa"/>
+              <w:right w:w="25" w:type="dxa"/>
             </w:tcMar>
-            <w:shd w:fill="DCFCE7"/>
             <w:tcBorders>
               <w:top w:val="single" w:sz="4" w:space="0" w:color="CBD5E1"/>
               <w:left w:val="single" w:sz="4" w:space="0" w:color="CBD5E1"/>
@@ -2252,20 +2689,20 @@
                 <w:color w:val="0F172A"/>
                 <w:sz w:val="15"/>
               </w:rPr>
-              <w:t>UML Class Diagram (Domain Model &amp; Pipeline Objects)</w:t>
+              <w:t>UML Class Diagram &amp; UML Sequence Diagrams</w:t>
             </w:r>
           </w:p>
         </w:tc>
         <w:tc>
           <w:tcPr>
             <w:tcW w:type="dxa" w:w="1584"/>
+            <w:shd w:fill="EFF6FF"/>
             <w:tcMar>
-              <w:top w:w="14" w:type="dxa"/>
-              <w:bottom w:w="14" w:type="dxa"/>
-              <w:left w:w="30" w:type="dxa"/>
-              <w:right w:w="30" w:type="dxa"/>
+              <w:top w:w="11" w:type="dxa"/>
+              <w:bottom w:w="11" w:type="dxa"/>
+              <w:left w:w="25" w:type="dxa"/>
+              <w:right w:w="25" w:type="dxa"/>
             </w:tcMar>
-            <w:shd w:fill="DCFCE7"/>
             <w:tcBorders>
               <w:top w:val="single" w:sz="4" w:space="0" w:color="CBD5E1"/>
               <w:left w:val="single" w:sz="4" w:space="0" w:color="CBD5E1"/>
@@ -2292,13 +2729,13 @@
         <w:tc>
           <w:tcPr>
             <w:tcW w:type="dxa" w:w="2160"/>
+            <w:shd w:fill="EFF6FF"/>
             <w:tcMar>
-              <w:top w:w="14" w:type="dxa"/>
-              <w:bottom w:w="14" w:type="dxa"/>
-              <w:left w:w="30" w:type="dxa"/>
-              <w:right w:w="30" w:type="dxa"/>
+              <w:top w:w="11" w:type="dxa"/>
+              <w:bottom w:w="11" w:type="dxa"/>
+              <w:left w:w="25" w:type="dxa"/>
+              <w:right w:w="25" w:type="dxa"/>
             </w:tcMar>
-            <w:shd w:fill="DCFCE7"/>
             <w:tcBorders>
               <w:top w:val="single" w:sz="4" w:space="0" w:color="CBD5E1"/>
               <w:left w:val="single" w:sz="4" w:space="0" w:color="CBD5E1"/>
@@ -2318,7 +2755,7 @@
                 <w:color w:val="0F172A"/>
                 <w:sz w:val="15"/>
               </w:rPr>
-              <w:t>Page 8 [Completed Mid-Term]</w:t>
+              <w:t>Pages 8-9 [Completed]</w:t>
             </w:r>
           </w:p>
         </w:tc>
@@ -2327,13 +2764,13 @@
         <w:tc>
           <w:tcPr>
             <w:tcW w:type="dxa" w:w="864"/>
+            <w:shd w:fill="EFF6FF"/>
             <w:tcMar>
-              <w:top w:w="14" w:type="dxa"/>
-              <w:bottom w:w="14" w:type="dxa"/>
-              <w:left w:w="30" w:type="dxa"/>
-              <w:right w:w="30" w:type="dxa"/>
+              <w:top w:w="11" w:type="dxa"/>
+              <w:bottom w:w="11" w:type="dxa"/>
+              <w:left w:w="25" w:type="dxa"/>
+              <w:right w:w="25" w:type="dxa"/>
             </w:tcMar>
-            <w:shd w:fill="DCFCE7"/>
             <w:tcBorders>
               <w:top w:val="single" w:sz="4" w:space="0" w:color="CBD5E1"/>
               <w:left w:val="single" w:sz="4" w:space="0" w:color="CBD5E1"/>
@@ -2353,20 +2790,20 @@
                 <w:color w:val="0F172A"/>
                 <w:sz w:val="15"/>
               </w:rPr>
-              <w:t>2.4</w:t>
+              <w:t>3.1</w:t>
             </w:r>
           </w:p>
         </w:tc>
         <w:tc>
           <w:tcPr>
             <w:tcW w:type="dxa" w:w="4608"/>
+            <w:shd w:fill="EFF6FF"/>
             <w:tcMar>
-              <w:top w:w="14" w:type="dxa"/>
-              <w:bottom w:w="14" w:type="dxa"/>
-              <w:left w:w="30" w:type="dxa"/>
-              <w:right w:w="30" w:type="dxa"/>
+              <w:top w:w="11" w:type="dxa"/>
+              <w:bottom w:w="11" w:type="dxa"/>
+              <w:left w:w="25" w:type="dxa"/>
+              <w:right w:w="25" w:type="dxa"/>
             </w:tcMar>
-            <w:shd w:fill="DCFCE7"/>
             <w:tcBorders>
               <w:top w:val="single" w:sz="4" w:space="0" w:color="CBD5E1"/>
               <w:left w:val="single" w:sz="4" w:space="0" w:color="CBD5E1"/>
@@ -2386,20 +2823,20 @@
                 <w:color w:val="0F172A"/>
                 <w:sz w:val="15"/>
               </w:rPr>
-              <w:t>UML Sequence Diagrams (Execution &amp; Activation Workflow)</w:t>
+              <w:t>Data Dictionary: Star-Schema SQL/NoSQL Database Tables</w:t>
             </w:r>
           </w:p>
         </w:tc>
         <w:tc>
           <w:tcPr>
             <w:tcW w:type="dxa" w:w="1584"/>
+            <w:shd w:fill="EFF6FF"/>
             <w:tcMar>
-              <w:top w:w="14" w:type="dxa"/>
-              <w:bottom w:w="14" w:type="dxa"/>
-              <w:left w:w="30" w:type="dxa"/>
-              <w:right w:w="30" w:type="dxa"/>
+              <w:top w:w="11" w:type="dxa"/>
+              <w:bottom w:w="11" w:type="dxa"/>
+              <w:left w:w="25" w:type="dxa"/>
+              <w:right w:w="25" w:type="dxa"/>
             </w:tcMar>
-            <w:shd w:fill="DCFCE7"/>
             <w:tcBorders>
               <w:top w:val="single" w:sz="4" w:space="0" w:color="CBD5E1"/>
               <w:left w:val="single" w:sz="4" w:space="0" w:color="CBD5E1"/>
@@ -2426,13 +2863,13 @@
         <w:tc>
           <w:tcPr>
             <w:tcW w:type="dxa" w:w="2160"/>
+            <w:shd w:fill="EFF6FF"/>
             <w:tcMar>
-              <w:top w:w="14" w:type="dxa"/>
-              <w:bottom w:w="14" w:type="dxa"/>
-              <w:left w:w="30" w:type="dxa"/>
-              <w:right w:w="30" w:type="dxa"/>
+              <w:top w:w="11" w:type="dxa"/>
+              <w:bottom w:w="11" w:type="dxa"/>
+              <w:left w:w="25" w:type="dxa"/>
+              <w:right w:w="25" w:type="dxa"/>
             </w:tcMar>
-            <w:shd w:fill="DCFCE7"/>
             <w:tcBorders>
               <w:top w:val="single" w:sz="4" w:space="0" w:color="CBD5E1"/>
               <w:left w:val="single" w:sz="4" w:space="0" w:color="CBD5E1"/>
@@ -2452,7 +2889,7 @@
                 <w:color w:val="0F172A"/>
                 <w:sz w:val="15"/>
               </w:rPr>
-              <w:t>Page 9 [Completed Mid-Term]</w:t>
+              <w:t>Pages 10-12 [Completed]</w:t>
             </w:r>
           </w:p>
         </w:tc>
@@ -2461,13 +2898,13 @@
         <w:tc>
           <w:tcPr>
             <w:tcW w:type="dxa" w:w="864"/>
+            <w:shd w:fill="EFF6FF"/>
             <w:tcMar>
-              <w:top w:w="14" w:type="dxa"/>
-              <w:bottom w:w="14" w:type="dxa"/>
-              <w:left w:w="30" w:type="dxa"/>
-              <w:right w:w="30" w:type="dxa"/>
+              <w:top w:w="11" w:type="dxa"/>
+              <w:bottom w:w="11" w:type="dxa"/>
+              <w:left w:w="25" w:type="dxa"/>
+              <w:right w:w="25" w:type="dxa"/>
             </w:tcMar>
-            <w:shd w:fill="DCFCE7"/>
             <w:tcBorders>
               <w:top w:val="single" w:sz="4" w:space="0" w:color="CBD5E1"/>
               <w:left w:val="single" w:sz="4" w:space="0" w:color="CBD5E1"/>
@@ -2487,20 +2924,20 @@
                 <w:color w:val="0F172A"/>
                 <w:sz w:val="15"/>
               </w:rPr>
-              <w:t>3.1</w:t>
+              <w:t>4.1</w:t>
             </w:r>
           </w:p>
         </w:tc>
         <w:tc>
           <w:tcPr>
             <w:tcW w:type="dxa" w:w="4608"/>
+            <w:shd w:fill="EFF6FF"/>
             <w:tcMar>
-              <w:top w:w="14" w:type="dxa"/>
-              <w:bottom w:w="14" w:type="dxa"/>
-              <w:left w:w="30" w:type="dxa"/>
-              <w:right w:w="30" w:type="dxa"/>
+              <w:top w:w="11" w:type="dxa"/>
+              <w:bottom w:w="11" w:type="dxa"/>
+              <w:left w:w="25" w:type="dxa"/>
+              <w:right w:w="25" w:type="dxa"/>
             </w:tcMar>
-            <w:shd w:fill="DCFCE7"/>
             <w:tcBorders>
               <w:top w:val="single" w:sz="4" w:space="0" w:color="CBD5E1"/>
               <w:left w:val="single" w:sz="4" w:space="0" w:color="CBD5E1"/>
@@ -2520,20 +2957,20 @@
                 <w:color w:val="0F172A"/>
                 <w:sz w:val="15"/>
               </w:rPr>
-              <w:t>Data Dictionary: Star-Schema SQL/NoSQL Database Tables</w:t>
+              <w:t>Screen Layouts with Operational Input Validations</w:t>
             </w:r>
           </w:p>
         </w:tc>
         <w:tc>
           <w:tcPr>
             <w:tcW w:type="dxa" w:w="1584"/>
+            <w:shd w:fill="EFF6FF"/>
             <w:tcMar>
-              <w:top w:w="14" w:type="dxa"/>
-              <w:bottom w:w="14" w:type="dxa"/>
-              <w:left w:w="30" w:type="dxa"/>
-              <w:right w:w="30" w:type="dxa"/>
+              <w:top w:w="11" w:type="dxa"/>
+              <w:bottom w:w="11" w:type="dxa"/>
+              <w:left w:w="25" w:type="dxa"/>
+              <w:right w:w="25" w:type="dxa"/>
             </w:tcMar>
-            <w:shd w:fill="DCFCE7"/>
             <w:tcBorders>
               <w:top w:val="single" w:sz="4" w:space="0" w:color="CBD5E1"/>
               <w:left w:val="single" w:sz="4" w:space="0" w:color="CBD5E1"/>
@@ -2560,13 +2997,13 @@
         <w:tc>
           <w:tcPr>
             <w:tcW w:type="dxa" w:w="2160"/>
+            <w:shd w:fill="EFF6FF"/>
             <w:tcMar>
-              <w:top w:w="14" w:type="dxa"/>
-              <w:bottom w:w="14" w:type="dxa"/>
-              <w:left w:w="30" w:type="dxa"/>
-              <w:right w:w="30" w:type="dxa"/>
+              <w:top w:w="11" w:type="dxa"/>
+              <w:bottom w:w="11" w:type="dxa"/>
+              <w:left w:w="25" w:type="dxa"/>
+              <w:right w:w="25" w:type="dxa"/>
             </w:tcMar>
-            <w:shd w:fill="DCFCE7"/>
             <w:tcBorders>
               <w:top w:val="single" w:sz="4" w:space="0" w:color="CBD5E1"/>
               <w:left w:val="single" w:sz="4" w:space="0" w:color="CBD5E1"/>
@@ -2586,7 +3023,7 @@
                 <w:color w:val="0F172A"/>
                 <w:sz w:val="15"/>
               </w:rPr>
-              <w:t>Pages 10-12 [Completed Mid-Term]</w:t>
+              <w:t>Pages 13-14 [Completed]</w:t>
             </w:r>
           </w:p>
         </w:tc>
@@ -2595,13 +3032,13 @@
         <w:tc>
           <w:tcPr>
             <w:tcW w:type="dxa" w:w="864"/>
+            <w:shd w:fill="DCFCE7"/>
             <w:tcMar>
-              <w:top w:w="14" w:type="dxa"/>
-              <w:bottom w:w="14" w:type="dxa"/>
-              <w:left w:w="30" w:type="dxa"/>
-              <w:right w:w="30" w:type="dxa"/>
+              <w:top w:w="11" w:type="dxa"/>
+              <w:bottom w:w="11" w:type="dxa"/>
+              <w:left w:w="25" w:type="dxa"/>
+              <w:right w:w="25" w:type="dxa"/>
             </w:tcMar>
-            <w:shd w:fill="DCFCE7"/>
             <w:tcBorders>
               <w:top w:val="single" w:sz="4" w:space="0" w:color="CBD5E1"/>
               <w:left w:val="single" w:sz="4" w:space="0" w:color="CBD5E1"/>
@@ -2621,20 +3058,20 @@
                 <w:color w:val="0F172A"/>
                 <w:sz w:val="15"/>
               </w:rPr>
-              <w:t>4.1</w:t>
+              <w:t>4.2</w:t>
             </w:r>
           </w:p>
         </w:tc>
         <w:tc>
           <w:tcPr>
             <w:tcW w:type="dxa" w:w="4608"/>
+            <w:shd w:fill="DCFCE7"/>
             <w:tcMar>
-              <w:top w:w="14" w:type="dxa"/>
-              <w:bottom w:w="14" w:type="dxa"/>
-              <w:left w:w="30" w:type="dxa"/>
-              <w:right w:w="30" w:type="dxa"/>
+              <w:top w:w="11" w:type="dxa"/>
+              <w:bottom w:w="11" w:type="dxa"/>
+              <w:left w:w="25" w:type="dxa"/>
+              <w:right w:w="25" w:type="dxa"/>
             </w:tcMar>
-            <w:shd w:fill="DCFCE7"/>
             <w:tcBorders>
               <w:top w:val="single" w:sz="4" w:space="0" w:color="CBD5E1"/>
               <w:left w:val="single" w:sz="4" w:space="0" w:color="CBD5E1"/>
@@ -2654,154 +3091,20 @@
                 <w:color w:val="0F172A"/>
                 <w:sz w:val="15"/>
               </w:rPr>
-              <w:t>Screen Layouts with Operational Input Validations</w:t>
+              <w:t>Sample Coding (with Cybersecurity &amp; Integrity Tasks)</w:t>
             </w:r>
           </w:p>
         </w:tc>
         <w:tc>
           <w:tcPr>
             <w:tcW w:type="dxa" w:w="1584"/>
+            <w:shd w:fill="DCFCE7"/>
             <w:tcMar>
-              <w:top w:w="14" w:type="dxa"/>
-              <w:bottom w:w="14" w:type="dxa"/>
-              <w:left w:w="30" w:type="dxa"/>
-              <w:right w:w="30" w:type="dxa"/>
+              <w:top w:w="11" w:type="dxa"/>
+              <w:bottom w:w="11" w:type="dxa"/>
+              <w:left w:w="25" w:type="dxa"/>
+              <w:right w:w="25" w:type="dxa"/>
             </w:tcMar>
-            <w:shd w:fill="DCFCE7"/>
-            <w:tcBorders>
-              <w:top w:val="single" w:sz="4" w:space="0" w:color="CBD5E1"/>
-              <w:left w:val="single" w:sz="4" w:space="0" w:color="CBD5E1"/>
-              <w:bottom w:val="single" w:sz="4" w:space="0" w:color="CBD5E1"/>
-              <w:right w:val="single" w:sz="4" w:space="0" w:color="CBD5E1"/>
-            </w:tcBorders>
-          </w:tcPr>
-          <w:p>
-            <w:pPr>
-              <w:spacing w:before="0" w:after="0" w:line="252" w:lineRule="auto"/>
-              <w:jc w:val="center"/>
-            </w:pPr>
-            <w:r>
-              <w:rPr>
-                <w:rFonts w:ascii="Times New Roman" w:hAnsi="Times New Roman"/>
-                <w:b w:val="0"/>
-                <w:color w:val="0F172A"/>
-                <w:sz w:val="15"/>
-              </w:rPr>
-              <w:t>13/10/2026</w:t>
-            </w:r>
-          </w:p>
-        </w:tc>
-        <w:tc>
-          <w:tcPr>
-            <w:tcW w:type="dxa" w:w="2160"/>
-            <w:tcMar>
-              <w:top w:w="14" w:type="dxa"/>
-              <w:bottom w:w="14" w:type="dxa"/>
-              <w:left w:w="30" w:type="dxa"/>
-              <w:right w:w="30" w:type="dxa"/>
-            </w:tcMar>
-            <w:shd w:fill="DCFCE7"/>
-            <w:tcBorders>
-              <w:top w:val="single" w:sz="4" w:space="0" w:color="CBD5E1"/>
-              <w:left w:val="single" w:sz="4" w:space="0" w:color="CBD5E1"/>
-              <w:bottom w:val="single" w:sz="4" w:space="0" w:color="CBD5E1"/>
-              <w:right w:val="single" w:sz="4" w:space="0" w:color="CBD5E1"/>
-            </w:tcBorders>
-          </w:tcPr>
-          <w:p>
-            <w:pPr>
-              <w:spacing w:before="0" w:after="0" w:line="252" w:lineRule="auto"/>
-              <w:jc w:val="left"/>
-            </w:pPr>
-            <w:r>
-              <w:rPr>
-                <w:rFonts w:ascii="Times New Roman" w:hAnsi="Times New Roman"/>
-                <w:b/>
-                <w:color w:val="0F172A"/>
-                <w:sz w:val="15"/>
-              </w:rPr>
-              <w:t>Pages 13-14 [Completed Mid-Term]</w:t>
-            </w:r>
-          </w:p>
-        </w:tc>
-      </w:tr>
-      <w:tr>
-        <w:tc>
-          <w:tcPr>
-            <w:tcW w:type="dxa" w:w="864"/>
-            <w:tcMar>
-              <w:top w:w="14" w:type="dxa"/>
-              <w:bottom w:w="14" w:type="dxa"/>
-              <w:left w:w="30" w:type="dxa"/>
-              <w:right w:w="30" w:type="dxa"/>
-            </w:tcMar>
-            <w:shd w:fill="F8FAFC"/>
-            <w:tcBorders>
-              <w:top w:val="single" w:sz="4" w:space="0" w:color="CBD5E1"/>
-              <w:left w:val="single" w:sz="4" w:space="0" w:color="CBD5E1"/>
-              <w:bottom w:val="single" w:sz="4" w:space="0" w:color="CBD5E1"/>
-              <w:right w:val="single" w:sz="4" w:space="0" w:color="CBD5E1"/>
-            </w:tcBorders>
-          </w:tcPr>
-          <w:p>
-            <w:pPr>
-              <w:spacing w:before="0" w:after="0" w:line="252" w:lineRule="auto"/>
-              <w:jc w:val="center"/>
-            </w:pPr>
-            <w:r>
-              <w:rPr>
-                <w:rFonts w:ascii="Times New Roman" w:hAnsi="Times New Roman"/>
-                <w:b w:val="0"/>
-                <w:color w:val="0F172A"/>
-                <w:sz w:val="15"/>
-              </w:rPr>
-              <w:t>4.2-4.3</w:t>
-            </w:r>
-          </w:p>
-        </w:tc>
-        <w:tc>
-          <w:tcPr>
-            <w:tcW w:type="dxa" w:w="4608"/>
-            <w:tcMar>
-              <w:top w:w="14" w:type="dxa"/>
-              <w:bottom w:w="14" w:type="dxa"/>
-              <w:left w:w="30" w:type="dxa"/>
-              <w:right w:w="30" w:type="dxa"/>
-            </w:tcMar>
-            <w:shd w:fill="F8FAFC"/>
-            <w:tcBorders>
-              <w:top w:val="single" w:sz="4" w:space="0" w:color="CBD5E1"/>
-              <w:left w:val="single" w:sz="4" w:space="0" w:color="CBD5E1"/>
-              <w:bottom w:val="single" w:sz="4" w:space="0" w:color="CBD5E1"/>
-              <w:right w:val="single" w:sz="4" w:space="0" w:color="CBD5E1"/>
-            </w:tcBorders>
-          </w:tcPr>
-          <w:p>
-            <w:pPr>
-              <w:spacing w:before="0" w:after="0" w:line="252" w:lineRule="auto"/>
-              <w:jc w:val="left"/>
-            </w:pPr>
-            <w:r>
-              <w:rPr>
-                <w:rFonts w:ascii="Times New Roman" w:hAnsi="Times New Roman"/>
-                <w:b w:val="0"/>
-                <w:color w:val="0F172A"/>
-                <w:sz w:val="15"/>
-              </w:rPr>
-              <w:t>Sample Coding &amp; Execution Navigation</w:t>
-            </w:r>
-          </w:p>
-        </w:tc>
-        <w:tc>
-          <w:tcPr>
-            <w:tcW w:type="dxa" w:w="1584"/>
-            <w:tcMar>
-              <w:top w:w="14" w:type="dxa"/>
-              <w:bottom w:w="14" w:type="dxa"/>
-              <w:left w:w="30" w:type="dxa"/>
-              <w:right w:w="30" w:type="dxa"/>
-            </w:tcMar>
-            <w:shd w:fill="F8FAFC"/>
             <w:tcBorders>
               <w:top w:val="single" w:sz="4" w:space="0" w:color="CBD5E1"/>
               <w:left w:val="single" w:sz="4" w:space="0" w:color="CBD5E1"/>
@@ -2828,13 +3131,13 @@
         <w:tc>
           <w:tcPr>
             <w:tcW w:type="dxa" w:w="2160"/>
+            <w:shd w:fill="DCFCE7"/>
             <w:tcMar>
-              <w:top w:w="14" w:type="dxa"/>
-              <w:bottom w:w="14" w:type="dxa"/>
-              <w:left w:w="30" w:type="dxa"/>
-              <w:right w:w="30" w:type="dxa"/>
+              <w:top w:w="11" w:type="dxa"/>
+              <w:bottom w:w="11" w:type="dxa"/>
+              <w:left w:w="25" w:type="dxa"/>
+              <w:right w:w="25" w:type="dxa"/>
             </w:tcMar>
-            <w:shd w:fill="F8FAFC"/>
             <w:tcBorders>
               <w:top w:val="single" w:sz="4" w:space="0" w:color="CBD5E1"/>
               <w:left w:val="single" w:sz="4" w:space="0" w:color="CBD5E1"/>
@@ -2850,11 +3153,11 @@
             <w:r>
               <w:rPr>
                 <w:rFonts w:ascii="Times New Roman" w:hAnsi="Times New Roman"/>
-                <w:b w:val="0"/>
+                <w:b/>
                 <w:color w:val="0F172A"/>
                 <w:sz w:val="15"/>
               </w:rPr>
-              <w:t>[Third Progress Milestone]</w:t>
+              <w:t>Pages 15-18 [Completed 27/10]</w:t>
             </w:r>
           </w:p>
         </w:tc>
@@ -2863,13 +3166,13 @@
         <w:tc>
           <w:tcPr>
             <w:tcW w:type="dxa" w:w="864"/>
+            <w:shd w:fill="DCFCE7"/>
             <w:tcMar>
-              <w:top w:w="14" w:type="dxa"/>
-              <w:bottom w:w="14" w:type="dxa"/>
-              <w:left w:w="30" w:type="dxa"/>
-              <w:right w:w="30" w:type="dxa"/>
+              <w:top w:w="11" w:type="dxa"/>
+              <w:bottom w:w="11" w:type="dxa"/>
+              <w:left w:w="25" w:type="dxa"/>
+              <w:right w:w="25" w:type="dxa"/>
             </w:tcMar>
-            <w:shd w:fill="FFFFFF"/>
             <w:tcBorders>
               <w:top w:val="single" w:sz="4" w:space="0" w:color="CBD5E1"/>
               <w:left w:val="single" w:sz="4" w:space="0" w:color="CBD5E1"/>
@@ -2889,20 +3192,20 @@
                 <w:color w:val="0F172A"/>
                 <w:sz w:val="15"/>
               </w:rPr>
-              <w:t>5.1-6.1</w:t>
+              <w:t>4.3</w:t>
             </w:r>
           </w:p>
         </w:tc>
         <w:tc>
           <w:tcPr>
             <w:tcW w:type="dxa" w:w="4608"/>
+            <w:shd w:fill="DCFCE7"/>
             <w:tcMar>
-              <w:top w:w="14" w:type="dxa"/>
-              <w:bottom w:w="14" w:type="dxa"/>
-              <w:left w:w="30" w:type="dxa"/>
-              <w:right w:w="30" w:type="dxa"/>
+              <w:top w:w="11" w:type="dxa"/>
+              <w:bottom w:w="11" w:type="dxa"/>
+              <w:left w:w="25" w:type="dxa"/>
+              <w:right w:w="25" w:type="dxa"/>
             </w:tcMar>
-            <w:shd w:fill="FFFFFF"/>
             <w:tcBorders>
               <w:top w:val="single" w:sz="4" w:space="0" w:color="CBD5E1"/>
               <w:left w:val="single" w:sz="4" w:space="0" w:color="CBD5E1"/>
@@ -2918,24 +3221,24 @@
             <w:r>
               <w:rPr>
                 <w:rFonts w:ascii="Times New Roman" w:hAnsi="Times New Roman"/>
-                <w:b w:val="0"/>
+                <w:b/>
                 <w:color w:val="0F172A"/>
                 <w:sz w:val="15"/>
               </w:rPr>
-              <w:t>Conclusion &amp; References (Books, Papers, Webs)</w:t>
+              <w:t>Steps of Execution Project &amp; Dashboard Navigation</w:t>
             </w:r>
           </w:p>
         </w:tc>
         <w:tc>
           <w:tcPr>
             <w:tcW w:type="dxa" w:w="1584"/>
+            <w:shd w:fill="DCFCE7"/>
             <w:tcMar>
-              <w:top w:w="14" w:type="dxa"/>
-              <w:bottom w:w="14" w:type="dxa"/>
-              <w:left w:w="30" w:type="dxa"/>
-              <w:right w:w="30" w:type="dxa"/>
+              <w:top w:w="11" w:type="dxa"/>
+              <w:bottom w:w="11" w:type="dxa"/>
+              <w:left w:w="25" w:type="dxa"/>
+              <w:right w:w="25" w:type="dxa"/>
             </w:tcMar>
-            <w:shd w:fill="FFFFFF"/>
             <w:tcBorders>
               <w:top w:val="single" w:sz="4" w:space="0" w:color="CBD5E1"/>
               <w:left w:val="single" w:sz="4" w:space="0" w:color="CBD5E1"/>
@@ -2962,13 +3265,13 @@
         <w:tc>
           <w:tcPr>
             <w:tcW w:type="dxa" w:w="2160"/>
+            <w:shd w:fill="DCFCE7"/>
             <w:tcMar>
-              <w:top w:w="14" w:type="dxa"/>
-              <w:bottom w:w="14" w:type="dxa"/>
-              <w:left w:w="30" w:type="dxa"/>
-              <w:right w:w="30" w:type="dxa"/>
+              <w:top w:w="11" w:type="dxa"/>
+              <w:bottom w:w="11" w:type="dxa"/>
+              <w:left w:w="25" w:type="dxa"/>
+              <w:right w:w="25" w:type="dxa"/>
             </w:tcMar>
-            <w:shd w:fill="FFFFFF"/>
             <w:tcBorders>
               <w:top w:val="single" w:sz="4" w:space="0" w:color="CBD5E1"/>
               <w:left w:val="single" w:sz="4" w:space="0" w:color="CBD5E1"/>
@@ -2984,16 +3287,606 @@
             <w:r>
               <w:rPr>
                 <w:rFonts w:ascii="Times New Roman" w:hAnsi="Times New Roman"/>
+                <w:b/>
+                <w:color w:val="0F172A"/>
+                <w:sz w:val="15"/>
+              </w:rPr>
+              <w:t>Pages 19-21 [Completed 27/10]</w:t>
+            </w:r>
+          </w:p>
+        </w:tc>
+      </w:tr>
+      <w:tr>
+        <w:tc>
+          <w:tcPr>
+            <w:tcW w:type="dxa" w:w="864"/>
+            <w:shd w:fill="DCFCE7"/>
+            <w:tcMar>
+              <w:top w:w="11" w:type="dxa"/>
+              <w:bottom w:w="11" w:type="dxa"/>
+              <w:left w:w="25" w:type="dxa"/>
+              <w:right w:w="25" w:type="dxa"/>
+            </w:tcMar>
+            <w:tcBorders>
+              <w:top w:val="single" w:sz="4" w:space="0" w:color="CBD5E1"/>
+              <w:left w:val="single" w:sz="4" w:space="0" w:color="CBD5E1"/>
+              <w:bottom w:val="single" w:sz="4" w:space="0" w:color="CBD5E1"/>
+              <w:right w:val="single" w:sz="4" w:space="0" w:color="CBD5E1"/>
+            </w:tcBorders>
+          </w:tcPr>
+          <w:p>
+            <w:pPr>
+              <w:spacing w:before="0" w:after="0" w:line="252" w:lineRule="auto"/>
+              <w:jc w:val="center"/>
+            </w:pPr>
+            <w:r>
+              <w:rPr>
+                <w:rFonts w:ascii="Times New Roman" w:hAnsi="Times New Roman"/>
                 <w:b w:val="0"/>
                 <w:color w:val="0F172A"/>
                 <w:sz w:val="15"/>
               </w:rPr>
-              <w:t>[Third Progress Milestone]</w:t>
+              <w:t>5.1-5.2</w:t>
+            </w:r>
+          </w:p>
+        </w:tc>
+        <w:tc>
+          <w:tcPr>
+            <w:tcW w:type="dxa" w:w="4608"/>
+            <w:shd w:fill="DCFCE7"/>
+            <w:tcMar>
+              <w:top w:w="11" w:type="dxa"/>
+              <w:bottom w:w="11" w:type="dxa"/>
+              <w:left w:w="25" w:type="dxa"/>
+              <w:right w:w="25" w:type="dxa"/>
+            </w:tcMar>
+            <w:tcBorders>
+              <w:top w:val="single" w:sz="4" w:space="0" w:color="CBD5E1"/>
+              <w:left w:val="single" w:sz="4" w:space="0" w:color="CBD5E1"/>
+              <w:bottom w:val="single" w:sz="4" w:space="0" w:color="CBD5E1"/>
+              <w:right w:val="single" w:sz="4" w:space="0" w:color="CBD5E1"/>
+            </w:tcBorders>
+          </w:tcPr>
+          <w:p>
+            <w:pPr>
+              <w:spacing w:before="0" w:after="0" w:line="252" w:lineRule="auto"/>
+              <w:jc w:val="left"/>
+            </w:pPr>
+            <w:r>
+              <w:rPr>
+                <w:rFonts w:ascii="Times New Roman" w:hAnsi="Times New Roman"/>
+                <w:b/>
+                <w:color w:val="0F172A"/>
+                <w:sz w:val="15"/>
+              </w:rPr>
+              <w:t>Conclusion: Importance of Tasks &amp; Future Scope</w:t>
+            </w:r>
+          </w:p>
+        </w:tc>
+        <w:tc>
+          <w:tcPr>
+            <w:tcW w:type="dxa" w:w="1584"/>
+            <w:shd w:fill="DCFCE7"/>
+            <w:tcMar>
+              <w:top w:w="11" w:type="dxa"/>
+              <w:bottom w:w="11" w:type="dxa"/>
+              <w:left w:w="25" w:type="dxa"/>
+              <w:right w:w="25" w:type="dxa"/>
+            </w:tcMar>
+            <w:tcBorders>
+              <w:top w:val="single" w:sz="4" w:space="0" w:color="CBD5E1"/>
+              <w:left w:val="single" w:sz="4" w:space="0" w:color="CBD5E1"/>
+              <w:bottom w:val="single" w:sz="4" w:space="0" w:color="CBD5E1"/>
+              <w:right w:val="single" w:sz="4" w:space="0" w:color="CBD5E1"/>
+            </w:tcBorders>
+          </w:tcPr>
+          <w:p>
+            <w:pPr>
+              <w:spacing w:before="0" w:after="0" w:line="252" w:lineRule="auto"/>
+              <w:jc w:val="center"/>
+            </w:pPr>
+            <w:r>
+              <w:rPr>
+                <w:rFonts w:ascii="Times New Roman" w:hAnsi="Times New Roman"/>
+                <w:b w:val="0"/>
+                <w:color w:val="0F172A"/>
+                <w:sz w:val="15"/>
+              </w:rPr>
+              <w:t>27/10/2026</w:t>
+            </w:r>
+          </w:p>
+        </w:tc>
+        <w:tc>
+          <w:tcPr>
+            <w:tcW w:type="dxa" w:w="2160"/>
+            <w:shd w:fill="DCFCE7"/>
+            <w:tcMar>
+              <w:top w:w="11" w:type="dxa"/>
+              <w:bottom w:w="11" w:type="dxa"/>
+              <w:left w:w="25" w:type="dxa"/>
+              <w:right w:w="25" w:type="dxa"/>
+            </w:tcMar>
+            <w:tcBorders>
+              <w:top w:val="single" w:sz="4" w:space="0" w:color="CBD5E1"/>
+              <w:left w:val="single" w:sz="4" w:space="0" w:color="CBD5E1"/>
+              <w:bottom w:val="single" w:sz="4" w:space="0" w:color="CBD5E1"/>
+              <w:right w:val="single" w:sz="4" w:space="0" w:color="CBD5E1"/>
+            </w:tcBorders>
+          </w:tcPr>
+          <w:p>
+            <w:pPr>
+              <w:spacing w:before="0" w:after="0" w:line="252" w:lineRule="auto"/>
+              <w:jc w:val="left"/>
+            </w:pPr>
+            <w:r>
+              <w:rPr>
+                <w:rFonts w:ascii="Times New Roman" w:hAnsi="Times New Roman"/>
+                <w:b/>
+                <w:color w:val="0F172A"/>
+                <w:sz w:val="15"/>
+              </w:rPr>
+              <w:t>Page 22 [Completed 27/10]</w:t>
+            </w:r>
+          </w:p>
+        </w:tc>
+      </w:tr>
+      <w:tr>
+        <w:tc>
+          <w:tcPr>
+            <w:tcW w:type="dxa" w:w="864"/>
+            <w:shd w:fill="DCFCE7"/>
+            <w:tcMar>
+              <w:top w:w="11" w:type="dxa"/>
+              <w:bottom w:w="11" w:type="dxa"/>
+              <w:left w:w="25" w:type="dxa"/>
+              <w:right w:w="25" w:type="dxa"/>
+            </w:tcMar>
+            <w:tcBorders>
+              <w:top w:val="single" w:sz="4" w:space="0" w:color="CBD5E1"/>
+              <w:left w:val="single" w:sz="4" w:space="0" w:color="CBD5E1"/>
+              <w:bottom w:val="single" w:sz="4" w:space="0" w:color="CBD5E1"/>
+              <w:right w:val="single" w:sz="4" w:space="0" w:color="CBD5E1"/>
+            </w:tcBorders>
+          </w:tcPr>
+          <w:p>
+            <w:pPr>
+              <w:spacing w:before="0" w:after="0" w:line="252" w:lineRule="auto"/>
+              <w:jc w:val="center"/>
+            </w:pPr>
+            <w:r>
+              <w:rPr>
+                <w:rFonts w:ascii="Times New Roman" w:hAnsi="Times New Roman"/>
+                <w:b w:val="0"/>
+                <w:color w:val="0F172A"/>
+                <w:sz w:val="15"/>
+              </w:rPr>
+              <w:t>6.1</w:t>
+            </w:r>
+          </w:p>
+        </w:tc>
+        <w:tc>
+          <w:tcPr>
+            <w:tcW w:type="dxa" w:w="4608"/>
+            <w:shd w:fill="DCFCE7"/>
+            <w:tcMar>
+              <w:top w:w="11" w:type="dxa"/>
+              <w:bottom w:w="11" w:type="dxa"/>
+              <w:left w:w="25" w:type="dxa"/>
+              <w:right w:w="25" w:type="dxa"/>
+            </w:tcMar>
+            <w:tcBorders>
+              <w:top w:val="single" w:sz="4" w:space="0" w:color="CBD5E1"/>
+              <w:left w:val="single" w:sz="4" w:space="0" w:color="CBD5E1"/>
+              <w:bottom w:val="single" w:sz="4" w:space="0" w:color="CBD5E1"/>
+              <w:right w:val="single" w:sz="4" w:space="0" w:color="CBD5E1"/>
+            </w:tcBorders>
+          </w:tcPr>
+          <w:p>
+            <w:pPr>
+              <w:spacing w:before="0" w:after="0" w:line="252" w:lineRule="auto"/>
+              <w:jc w:val="left"/>
+            </w:pPr>
+            <w:r>
+              <w:rPr>
+                <w:rFonts w:ascii="Times New Roman" w:hAnsi="Times New Roman"/>
+                <w:b/>
+                <w:color w:val="0F172A"/>
+                <w:sz w:val="15"/>
+              </w:rPr>
+              <w:t>References (Academic Papers, Books, Technology, Webs)</w:t>
+            </w:r>
+          </w:p>
+        </w:tc>
+        <w:tc>
+          <w:tcPr>
+            <w:tcW w:type="dxa" w:w="1584"/>
+            <w:shd w:fill="DCFCE7"/>
+            <w:tcMar>
+              <w:top w:w="11" w:type="dxa"/>
+              <w:bottom w:w="11" w:type="dxa"/>
+              <w:left w:w="25" w:type="dxa"/>
+              <w:right w:w="25" w:type="dxa"/>
+            </w:tcMar>
+            <w:tcBorders>
+              <w:top w:val="single" w:sz="4" w:space="0" w:color="CBD5E1"/>
+              <w:left w:val="single" w:sz="4" w:space="0" w:color="CBD5E1"/>
+              <w:bottom w:val="single" w:sz="4" w:space="0" w:color="CBD5E1"/>
+              <w:right w:val="single" w:sz="4" w:space="0" w:color="CBD5E1"/>
+            </w:tcBorders>
+          </w:tcPr>
+          <w:p>
+            <w:pPr>
+              <w:spacing w:before="0" w:after="0" w:line="252" w:lineRule="auto"/>
+              <w:jc w:val="center"/>
+            </w:pPr>
+            <w:r>
+              <w:rPr>
+                <w:rFonts w:ascii="Times New Roman" w:hAnsi="Times New Roman"/>
+                <w:b w:val="0"/>
+                <w:color w:val="0F172A"/>
+                <w:sz w:val="15"/>
+              </w:rPr>
+              <w:t>27/10/2026</w:t>
+            </w:r>
+          </w:p>
+        </w:tc>
+        <w:tc>
+          <w:tcPr>
+            <w:tcW w:type="dxa" w:w="2160"/>
+            <w:shd w:fill="DCFCE7"/>
+            <w:tcMar>
+              <w:top w:w="11" w:type="dxa"/>
+              <w:bottom w:w="11" w:type="dxa"/>
+              <w:left w:w="25" w:type="dxa"/>
+              <w:right w:w="25" w:type="dxa"/>
+            </w:tcMar>
+            <w:tcBorders>
+              <w:top w:val="single" w:sz="4" w:space="0" w:color="CBD5E1"/>
+              <w:left w:val="single" w:sz="4" w:space="0" w:color="CBD5E1"/>
+              <w:bottom w:val="single" w:sz="4" w:space="0" w:color="CBD5E1"/>
+              <w:right w:val="single" w:sz="4" w:space="0" w:color="CBD5E1"/>
+            </w:tcBorders>
+          </w:tcPr>
+          <w:p>
+            <w:pPr>
+              <w:spacing w:before="0" w:after="0" w:line="252" w:lineRule="auto"/>
+              <w:jc w:val="left"/>
+            </w:pPr>
+            <w:r>
+              <w:rPr>
+                <w:rFonts w:ascii="Times New Roman" w:hAnsi="Times New Roman"/>
+                <w:b/>
+                <w:color w:val="0F172A"/>
+                <w:sz w:val="15"/>
+              </w:rPr>
+              <w:t>Page 23 [Completed 27/10]</w:t>
             </w:r>
           </w:p>
         </w:tc>
       </w:tr>
     </w:tbl>
+    <w:p>
+      <w:r>
+        <w:br w:type="page"/>
+      </w:r>
+    </w:p>
+    <w:p>
+      <w:pPr>
+        <w:spacing w:before="0" w:after="20" w:line="276" w:lineRule="auto"/>
+        <w:jc w:val="right"/>
+      </w:pPr>
+      <w:r>
+        <w:rPr>
+          <w:rFonts w:ascii="Times New Roman" w:hAnsi="Times New Roman"/>
+          <w:i/>
+          <w:color w:val="0F172A"/>
+          <w:sz w:val="24"/>
+        </w:rPr>
+        <w:t>Page IV</w:t>
+      </w:r>
+    </w:p>
+    <w:p>
+      <w:pPr>
+        <w:keepNext/>
+        <w:spacing w:before="120" w:after="40"/>
+        <w:jc w:val="left"/>
+      </w:pPr>
+      <w:r>
+        <w:rPr>
+          <w:rFonts w:ascii="Times New Roman" w:hAnsi="Times New Roman"/>
+          <w:b/>
+          <w:color w:val="0F172A"/>
+          <w:sz w:val="28"/>
+        </w:rPr>
+        <w:t>LIST OF FIGURES</w:t>
+      </w:r>
+    </w:p>
+    <w:p>
+      <w:pPr>
+        <w:spacing w:before="0" w:after="40" w:line="276" w:lineRule="auto"/>
+        <w:jc w:val="both"/>
+      </w:pPr>
+      <w:r>
+        <w:rPr>
+          <w:rFonts w:ascii="Times New Roman" w:hAnsi="Times New Roman"/>
+          <w:i w:val="0"/>
+          <w:color w:val="0F172A"/>
+          <w:sz w:val="24"/>
+        </w:rPr>
+        <w:t>Figure 2.1: Level 0 Data Flow Diagram (Context-Level DFD)  . . . . . . . . . . . . . . . . . . . . Page 4</w:t>
+      </w:r>
+    </w:p>
+    <w:p>
+      <w:pPr>
+        <w:spacing w:before="0" w:after="40" w:line="276" w:lineRule="auto"/>
+        <w:jc w:val="both"/>
+      </w:pPr>
+      <w:r>
+        <w:rPr>
+          <w:rFonts w:ascii="Times New Roman" w:hAnsi="Times New Roman"/>
+          <w:i w:val="0"/>
+          <w:color w:val="0F172A"/>
+          <w:sz w:val="24"/>
+        </w:rPr>
+        <w:t>Figure 2.2: Level 1 Data Flow Diagram (Pipeline Architecture)  . . . . . . . . . . . . . . . . . . . . Page 5</w:t>
+      </w:r>
+    </w:p>
+    <w:p>
+      <w:pPr>
+        <w:spacing w:before="0" w:after="40" w:line="276" w:lineRule="auto"/>
+        <w:jc w:val="both"/>
+      </w:pPr>
+      <w:r>
+        <w:rPr>
+          <w:rFonts w:ascii="Times New Roman" w:hAnsi="Times New Roman"/>
+          <w:i w:val="0"/>
+          <w:color w:val="0F172A"/>
+          <w:sz w:val="24"/>
+        </w:rPr>
+        <w:t>Figure 2.3: Level 2 Data Flow Diagram (Refinery &amp; ML Decomposition)  . . . . . . . . . . . . . . . . . . . . Page 6</w:t>
+      </w:r>
+    </w:p>
+    <w:p>
+      <w:pPr>
+        <w:spacing w:before="0" w:after="40" w:line="276" w:lineRule="auto"/>
+        <w:jc w:val="both"/>
+      </w:pPr>
+      <w:r>
+        <w:rPr>
+          <w:rFonts w:ascii="Times New Roman" w:hAnsi="Times New Roman"/>
+          <w:i w:val="0"/>
+          <w:color w:val="0F172A"/>
+          <w:sz w:val="24"/>
+        </w:rPr>
+        <w:t>Figure 2.4: UML Use Case Diagram (System Actors &amp; Functional Capabilities)  . . . . . . . . . . . . . . . . . . . . Page 7</w:t>
+      </w:r>
+    </w:p>
+    <w:p>
+      <w:pPr>
+        <w:spacing w:before="0" w:after="40" w:line="276" w:lineRule="auto"/>
+        <w:jc w:val="both"/>
+      </w:pPr>
+      <w:r>
+        <w:rPr>
+          <w:rFonts w:ascii="Times New Roman" w:hAnsi="Times New Roman"/>
+          <w:i w:val="0"/>
+          <w:color w:val="0F172A"/>
+          <w:sz w:val="24"/>
+        </w:rPr>
+        <w:t>Figure 2.5: UML Class Diagram (Domain Model &amp; Pipeline Object Architecture)  . . . . . . . . . . . . . . . . . . . . Page 8</w:t>
+      </w:r>
+    </w:p>
+    <w:p>
+      <w:pPr>
+        <w:spacing w:before="0" w:after="40" w:line="276" w:lineRule="auto"/>
+        <w:jc w:val="both"/>
+      </w:pPr>
+      <w:r>
+        <w:rPr>
+          <w:rFonts w:ascii="Times New Roman" w:hAnsi="Times New Roman"/>
+          <w:i w:val="0"/>
+          <w:color w:val="0F172A"/>
+          <w:sz w:val="24"/>
+        </w:rPr>
+        <w:t>Figure 2.6: UML Sequence Diagram (End-to-End Processing Workflow)  . . . . . . . . . . . . . . . . . . . . Page 9</w:t>
+      </w:r>
+    </w:p>
+    <w:p>
+      <w:pPr>
+        <w:spacing w:before="0" w:after="40" w:line="276" w:lineRule="auto"/>
+        <w:jc w:val="both"/>
+      </w:pPr>
+      <w:r>
+        <w:rPr>
+          <w:rFonts w:ascii="Times New Roman" w:hAnsi="Times New Roman"/>
+          <w:i w:val="0"/>
+          <w:color w:val="0F172A"/>
+          <w:sz w:val="24"/>
+        </w:rPr>
+        <w:t>Figure 4.1: Implementation Screen Layouts with Operational Input Validations  . . . . . . . . . . . . . . . . . . . . Page 13</w:t>
+      </w:r>
+    </w:p>
+    <w:p>
+      <w:pPr>
+        <w:spacing w:before="0" w:after="40" w:line="276" w:lineRule="auto"/>
+        <w:jc w:val="both"/>
+      </w:pPr>
+      <w:r>
+        <w:rPr>
+          <w:rFonts w:ascii="Times New Roman" w:hAnsi="Times New Roman"/>
+          <w:i w:val="0"/>
+          <w:color w:val="0F172A"/>
+          <w:sz w:val="24"/>
+        </w:rPr>
+        <w:t>Figure 4.2: K-Means Inertia Elbow Curve &amp; Silhouette Diagnostic Profile  . . . . . . . . . . . . . . . . . . . . Page 17</w:t>
+      </w:r>
+    </w:p>
+    <w:p>
+      <w:pPr>
+        <w:spacing w:before="0" w:after="40" w:line="276" w:lineRule="auto"/>
+        <w:jc w:val="both"/>
+      </w:pPr>
+      <w:r>
+        <w:rPr>
+          <w:rFonts w:ascii="Times New Roman" w:hAnsi="Times New Roman"/>
+          <w:i w:val="0"/>
+          <w:color w:val="0F172A"/>
+          <w:sz w:val="24"/>
+        </w:rPr>
+        <w:t>Figure 4.3: Segment Revenue Share Donut &amp; Multi-Dimensional Spatial Scatterplot  . . . . . . . . . . . . . . . . . . . . Page 20</w:t>
+      </w:r>
+    </w:p>
+    <w:p>
+      <w:pPr>
+        <w:keepNext/>
+        <w:spacing w:before="160" w:after="40"/>
+        <w:jc w:val="left"/>
+      </w:pPr>
+      <w:r>
+        <w:rPr>
+          <w:rFonts w:ascii="Times New Roman" w:hAnsi="Times New Roman"/>
+          <w:b/>
+          <w:color w:val="0F172A"/>
+          <w:sz w:val="28"/>
+        </w:rPr>
+        <w:t>LIST OF TABLES</w:t>
+      </w:r>
+    </w:p>
+    <w:p>
+      <w:pPr>
+        <w:spacing w:before="0" w:after="40" w:line="276" w:lineRule="auto"/>
+        <w:jc w:val="both"/>
+      </w:pPr>
+      <w:r>
+        <w:rPr>
+          <w:rFonts w:ascii="Times New Roman" w:hAnsi="Times New Roman"/>
+          <w:i w:val="0"/>
+          <w:color w:val="0F172A"/>
+          <w:sz w:val="24"/>
+        </w:rPr>
+        <w:t>Table 1.1: System Hardware &amp; Software Requirements Specification  . . . . . . . . . . . . . . . . . . . . Page 2</w:t>
+      </w:r>
+    </w:p>
+    <w:p>
+      <w:pPr>
+        <w:spacing w:before="0" w:after="40" w:line="276" w:lineRule="auto"/>
+        <w:jc w:val="both"/>
+      </w:pPr>
+      <w:r>
+        <w:rPr>
+          <w:rFonts w:ascii="Times New Roman" w:hAnsi="Times New Roman"/>
+          <w:i w:val="0"/>
+          <w:color w:val="0F172A"/>
+          <w:sz w:val="24"/>
+        </w:rPr>
+        <w:t>Table 1.2: Technology Stack &amp; Architectural Layer Mapping  . . . . . . . . . . . . . . . . . . . . Page 3</w:t>
+      </w:r>
+    </w:p>
+    <w:p>
+      <w:pPr>
+        <w:spacing w:before="0" w:after="40" w:line="276" w:lineRule="auto"/>
+        <w:jc w:val="both"/>
+      </w:pPr>
+      <w:r>
+        <w:rPr>
+          <w:rFonts w:ascii="Times New Roman" w:hAnsi="Times New Roman"/>
+          <w:i w:val="0"/>
+          <w:color w:val="0F172A"/>
+          <w:sz w:val="24"/>
+        </w:rPr>
+        <w:t>Table 2.1: Formal Use Case Specification Matrix (UC-01 to UC-06)  . . . . . . . . . . . . . . . . . . . . Page 7</w:t>
+      </w:r>
+    </w:p>
+    <w:p>
+      <w:pPr>
+        <w:spacing w:before="0" w:after="40" w:line="276" w:lineRule="auto"/>
+        <w:jc w:val="both"/>
+      </w:pPr>
+      <w:r>
+        <w:rPr>
+          <w:rFonts w:ascii="Times New Roman" w:hAnsi="Times New Roman"/>
+          <w:i w:val="0"/>
+          <w:color w:val="0F172A"/>
+          <w:sz w:val="24"/>
+        </w:rPr>
+        <w:t>Table 3.1: FACT_TRANSACTIONS (Order-Level Fact Mart Schema)  . . . . . . . . . . . . . . . . . . . . Page 10</w:t>
+      </w:r>
+    </w:p>
+    <w:p>
+      <w:pPr>
+        <w:spacing w:before="0" w:after="40" w:line="276" w:lineRule="auto"/>
+        <w:jc w:val="both"/>
+      </w:pPr>
+      <w:r>
+        <w:rPr>
+          <w:rFonts w:ascii="Times New Roman" w:hAnsi="Times New Roman"/>
+          <w:i w:val="0"/>
+          <w:color w:val="0F172A"/>
+          <w:sz w:val="24"/>
+        </w:rPr>
+        <w:t>Table 3.2: FACT_REVERSALS (Reverse Logistics Audit Fact Mart Schema)  . . . . . . . . . . . . . . . . . . . . Page 11</w:t>
+      </w:r>
+    </w:p>
+    <w:p>
+      <w:pPr>
+        <w:spacing w:before="0" w:after="40" w:line="276" w:lineRule="auto"/>
+        <w:jc w:val="both"/>
+      </w:pPr>
+      <w:r>
+        <w:rPr>
+          <w:rFonts w:ascii="Times New Roman" w:hAnsi="Times New Roman"/>
+          <w:i w:val="0"/>
+          <w:color w:val="0F172A"/>
+          <w:sz w:val="24"/>
+        </w:rPr>
+        <w:t>Table 3.3: DIM_CUSTOMERS (Customer RFM &amp; Behavioral Dimension Mart)  . . . . . . . . . . . . . . . . . . . . Page 11</w:t>
+      </w:r>
+    </w:p>
+    <w:p>
+      <w:pPr>
+        <w:spacing w:before="0" w:after="40" w:line="276" w:lineRule="auto"/>
+        <w:jc w:val="both"/>
+      </w:pPr>
+      <w:r>
+        <w:rPr>
+          <w:rFonts w:ascii="Times New Roman" w:hAnsi="Times New Roman"/>
+          <w:i w:val="0"/>
+          <w:color w:val="0F172A"/>
+          <w:sz w:val="24"/>
+        </w:rPr>
+        <w:t>Table 3.4: DIM_PRODUCTS (Catalog Item Dimension Mart Schema)  . . . . . . . . . . . . . . . . . . . . Page 12</w:t>
+      </w:r>
+    </w:p>
+    <w:p>
+      <w:pPr>
+        <w:spacing w:before="0" w:after="40" w:line="276" w:lineRule="auto"/>
+        <w:jc w:val="both"/>
+      </w:pPr>
+      <w:r>
+        <w:rPr>
+          <w:rFonts w:ascii="Times New Roman" w:hAnsi="Times New Roman"/>
+          <w:i w:val="0"/>
+          <w:color w:val="0F172A"/>
+          <w:sz w:val="24"/>
+        </w:rPr>
+        <w:t>Table 3.5: DIM_DATE (Temporal Dimension Mart Schema)  . . . . . . . . . . . . . . . . . . . . Page 12</w:t>
+      </w:r>
+    </w:p>
+    <w:p>
+      <w:pPr>
+        <w:spacing w:before="0" w:after="40" w:line="276" w:lineRule="auto"/>
+        <w:jc w:val="both"/>
+      </w:pPr>
+      <w:r>
+        <w:rPr>
+          <w:rFonts w:ascii="Times New Roman" w:hAnsi="Times New Roman"/>
+          <w:i w:val="0"/>
+          <w:color w:val="0F172A"/>
+          <w:sz w:val="24"/>
+        </w:rPr>
+        <w:t>Table 6.1: Project Progress Work Evaluation Schedule &amp; Milestone Tracking  . . . . . . . . . . . . . . . . . . . . Page 23</w:t>
+      </w:r>
+    </w:p>
     <w:p>
       <w:r>
         <w:br w:type="page"/>
@@ -5198,21 +6091,6 @@
       </w:r>
     </w:p>
     <w:p>
-      <w:pPr>
-        <w:spacing w:before="0" w:after="70" w:line="276" w:lineRule="auto"/>
-        <w:jc w:val="both"/>
-      </w:pPr>
-      <w:r>
-        <w:rPr>
-          <w:rFonts w:ascii="Times New Roman" w:hAnsi="Times New Roman"/>
-          <w:i w:val="0"/>
-          <w:color w:val="0F172A"/>
-          <w:sz w:val="24"/>
-        </w:rPr>
-        <w:t>This boundary diagram confirms that no internal process detail is revealed at Level 0, ensuring that all subsequent system interactions are fully accounted for before detailed algorithmic decomposition is undertaken.</w:t>
-      </w:r>
-    </w:p>
-    <w:p>
       <w:r>
         <w:br w:type="page"/>
       </w:r>
@@ -5435,21 +6313,6 @@
       </w:r>
     </w:p>
     <w:p>
-      <w:pPr>
-        <w:spacing w:before="0" w:after="70" w:line="276" w:lineRule="auto"/>
-        <w:jc w:val="both"/>
-      </w:pPr>
-      <w:r>
-        <w:rPr>
-          <w:rFonts w:ascii="Times New Roman" w:hAnsi="Times New Roman"/>
-          <w:i w:val="0"/>
-          <w:color w:val="0F172A"/>
-          <w:sz w:val="24"/>
-        </w:rPr>
-        <w:t>The Level 1 architecture enforces strict unidirectional data flow, ensuring that analytical features are never corrupted by unvalidated or reversed transactional inputs.</w:t>
-      </w:r>
-    </w:p>
-    <w:p>
       <w:r>
         <w:br w:type="page"/>
       </w:r>
@@ -5597,21 +6460,6 @@
           <w:sz w:val="19"/>
         </w:rPr>
         <w:t>Figure 2.3: Level 2 Data Flow Diagram (Refinery &amp; ML Decomposition)</w:t>
-      </w:r>
-    </w:p>
-    <w:p>
-      <w:pPr>
-        <w:spacing w:before="0" w:after="70" w:line="276" w:lineRule="auto"/>
-        <w:jc w:val="both"/>
-      </w:pPr>
-      <w:r>
-        <w:rPr>
-          <w:rFonts w:ascii="Times New Roman" w:hAnsi="Times New Roman"/>
-          <w:i w:val="0"/>
-          <w:color w:val="0F172A"/>
-          <w:sz w:val="24"/>
-        </w:rPr>
-        <w:t>This granular decomposition formally documents the mathematical transformations and algorithmic filtering required to turn raw transactional records into production-grade machine learning features.</w:t>
       </w:r>
     </w:p>
     <w:p>
@@ -13457,7 +14305,7 @@
                 <w:color w:val="0F172A"/>
                 <w:sz w:val="14"/>
               </w:rPr>
-              <w:t>Integer key formatted as YYYYMMDD (e.g. 20261013).</w:t>
+              <w:t>Integer key formatted as YYYYMMDD (e.g. 20261027).</w:t>
             </w:r>
           </w:p>
         </w:tc>
@@ -13624,7 +14472,7 @@
                 <w:color w:val="0F172A"/>
                 <w:sz w:val="14"/>
               </w:rPr>
-              <w:t>Calendar calendar date.</w:t>
+              <w:t>Calendar date representation.</w:t>
             </w:r>
           </w:p>
         </w:tc>
@@ -14686,8 +15534,43 @@
     </w:p>
     <w:p>
       <w:pPr>
+        <w:spacing w:before="0" w:after="70" w:line="276" w:lineRule="auto"/>
+        <w:jc w:val="both"/>
+      </w:pPr>
+      <w:r>
+        <w:rPr>
+          <w:rFonts w:ascii="Times New Roman" w:hAnsi="Times New Roman"/>
+          <w:i w:val="0"/>
+          <w:color w:val="0F172A"/>
+          <w:sz w:val="24"/>
+        </w:rPr>
+        <w:t>These validation standards establish verifiable data contracts across the presentation layer, guaranteeing that analytical summaries reflect mathematically sound business metrics.</w:t>
+      </w:r>
+    </w:p>
+    <w:p>
+      <w:r>
+        <w:br w:type="page"/>
+      </w:r>
+    </w:p>
+    <w:p>
+      <w:pPr>
+        <w:spacing w:before="0" w:after="20" w:line="276" w:lineRule="auto"/>
+        <w:jc w:val="right"/>
+      </w:pPr>
+      <w:r>
+        <w:rPr>
+          <w:rFonts w:ascii="Times New Roman" w:hAnsi="Times New Roman"/>
+          <w:i/>
+          <w:color w:val="0F172A"/>
+          <w:sz w:val="24"/>
+        </w:rPr>
+        <w:t>Page 15</w:t>
+      </w:r>
+    </w:p>
+    <w:p>
+      <w:pPr>
         <w:keepNext/>
-        <w:spacing w:before="80" w:after="20"/>
+        <w:spacing w:before="120" w:after="40"/>
         <w:jc w:val="left"/>
       </w:pPr>
       <w:r>
@@ -14697,7 +15580,451 @@
           <w:color w:val="0F172A"/>
           <w:sz w:val="28"/>
         </w:rPr>
-        <w:t>PROJECT PROGRESS WORK EVALUATION SCHEDULE (MID-TERM)</w:t>
+        <w:t>4.2 Sample Coding (with Security tasks)</w:t>
+      </w:r>
+    </w:p>
+    <w:p>
+      <w:pPr>
+        <w:spacing w:before="0" w:after="70" w:line="276" w:lineRule="auto"/>
+        <w:jc w:val="both"/>
+      </w:pPr>
+      <w:r>
+        <w:rPr>
+          <w:rFonts w:ascii="Times New Roman" w:hAnsi="Times New Roman"/>
+          <w:i w:val="0"/>
+          <w:color w:val="0F172A"/>
+          <w:sz w:val="24"/>
+        </w:rPr>
+        <w:t>The project codebase is architected using modular, testable Python classes. Below are production code excerpts demonstrating data refinery operations, schema enforcement, and cybersecurity data protection controls.</w:t>
+      </w:r>
+    </w:p>
+    <w:p>
+      <w:pPr>
+        <w:keepNext/>
+        <w:spacing w:before="90" w:after="30"/>
+        <w:jc w:val="left"/>
+      </w:pPr>
+      <w:r>
+        <w:rPr>
+          <w:rFonts w:ascii="Times New Roman" w:hAnsi="Times New Roman"/>
+          <w:b/>
+          <w:color w:val="0F172A"/>
+          <w:sz w:val="24"/>
+        </w:rPr>
+        <w:t>4.2.1 Data Refinery &amp; Anomaly Quarantine Pipeline (clean_refinery_pipeline.py)</w:t>
+      </w:r>
+    </w:p>
+    <w:p>
+      <w:pPr>
+        <w:spacing w:before="40" w:after="80" w:line="252" w:lineRule="auto"/>
+        <w:jc w:val="left"/>
+      </w:pPr>
+      <w:r>
+        <w:rPr>
+          <w:rFonts w:ascii="Courier New" w:hAnsi="Courier New"/>
+          <w:color w:val="1E293B"/>
+          <w:sz w:val="17"/>
+        </w:rPr>
+        <w:t>class CleanRefineryPipeline:</w:t>
+        <w:br/>
+        <w:t xml:space="preserve">    def __init__(self, raw_path: Path, output_dir: Path, iqr_multiplier: float = 1.5):</w:t>
+        <w:br/>
+        <w:t xml:space="preserve">        self.raw_path = raw_path</w:t>
+        <w:br/>
+        <w:t xml:space="preserve">        self.output_dir = output_dir</w:t>
+        <w:br/>
+        <w:t xml:space="preserve">        self.iqr_multiplier = iqr_multiplier</w:t>
+        <w:br/>
+        <w:br/>
+        <w:t xml:space="preserve">    def enforce_schema_typing(self, df: pd.DataFrame) -&gt; pd.DataFrame:</w:t>
+        <w:br/>
+        <w:t xml:space="preserve">        df['InvoiceNo'] = df['InvoiceNo'].astype(str).str.strip()</w:t>
+        <w:br/>
+        <w:t xml:space="preserve">        df['StockCode'] = df['StockCode'].astype(str).str.strip()</w:t>
+        <w:br/>
+        <w:t xml:space="preserve">        df['InvoiceDate'] = pd.to_datetime(df['InvoiceDate'], errors='coerce')</w:t>
+        <w:br/>
+        <w:t xml:space="preserve">        df['UnitPrice'] = pd.to_numeric(df['UnitPrice'], errors='coerce')</w:t>
+        <w:br/>
+        <w:t xml:space="preserve">        df['Quantity'] = pd.to_numeric(df['Quantity'], errors='coerce')</w:t>
+        <w:br/>
+        <w:t xml:space="preserve">        df['CustomerID'] = df['CustomerID'].astype(str).str.replace(r'\.0$', '', regex=True)</w:t>
+        <w:br/>
+        <w:t xml:space="preserve">        return df.dropna(subset=['InvoiceDate', 'UnitPrice', 'Quantity'])</w:t>
+        <w:br/>
+        <w:br/>
+        <w:t xml:space="preserve">    def isolate_reverse_logistics(self, df: pd.DataFrame) -&gt; Tuple[pd.DataFrame, pd.DataFrame]:</w:t>
+        <w:br/>
+        <w:t xml:space="preserve">        is_cancellation = df['InvoiceNo'].str.startswith('C', na=False) | (df['Quantity'] &lt;= 0)</w:t>
+        <w:br/>
+        <w:t xml:space="preserve">        reversals_df = df[is_cancellation].copy()</w:t>
+        <w:br/>
+        <w:t xml:space="preserve">        sales_df = df[~is_cancellation].copy()</w:t>
+        <w:br/>
+        <w:t xml:space="preserve">        # Security &amp; Audit Logging</w:t>
+        <w:br/>
+        <w:t xml:space="preserve">        reversals_df.to_csv(self.output_dir / "fact_reversals_audit.csv", index=False)</w:t>
+        <w:br/>
+        <w:t xml:space="preserve">        return sales_df, reversals_df</w:t>
+      </w:r>
+    </w:p>
+    <w:p>
+      <w:pPr>
+        <w:spacing w:before="0" w:after="40" w:line="276" w:lineRule="auto"/>
+        <w:jc w:val="both"/>
+      </w:pPr>
+      <w:r>
+        <w:rPr>
+          <w:rFonts w:ascii="Times New Roman" w:hAnsi="Times New Roman"/>
+          <w:i w:val="0"/>
+          <w:color w:val="0F172A"/>
+          <w:sz w:val="24"/>
+        </w:rPr>
+        <w:t>The refinery routine enforces strict type casting, isolates credit notes from the primary sales ledger, and writes return transactions to a persistent audit store for financial compliance.</w:t>
+      </w:r>
+    </w:p>
+    <w:p>
+      <w:r>
+        <w:br w:type="page"/>
+      </w:r>
+    </w:p>
+    <w:p>
+      <w:pPr>
+        <w:spacing w:before="0" w:after="20" w:line="276" w:lineRule="auto"/>
+        <w:jc w:val="right"/>
+      </w:pPr>
+      <w:r>
+        <w:rPr>
+          <w:rFonts w:ascii="Times New Roman" w:hAnsi="Times New Roman"/>
+          <w:i/>
+          <w:color w:val="0F172A"/>
+          <w:sz w:val="24"/>
+        </w:rPr>
+        <w:t>Page 16</w:t>
+      </w:r>
+    </w:p>
+    <w:p>
+      <w:pPr>
+        <w:keepNext/>
+        <w:spacing w:before="90" w:after="30"/>
+        <w:jc w:val="left"/>
+      </w:pPr>
+      <w:r>
+        <w:rPr>
+          <w:rFonts w:ascii="Times New Roman" w:hAnsi="Times New Roman"/>
+          <w:b/>
+          <w:color w:val="0F172A"/>
+          <w:sz w:val="24"/>
+        </w:rPr>
+        <w:t>4.2.2 Vectorized RFM Feature Extraction (rfm_feature_engineering.py)</w:t>
+      </w:r>
+    </w:p>
+    <w:p>
+      <w:pPr>
+        <w:spacing w:before="40" w:after="80" w:line="252" w:lineRule="auto"/>
+        <w:jc w:val="left"/>
+      </w:pPr>
+      <w:r>
+        <w:rPr>
+          <w:rFonts w:ascii="Courier New" w:hAnsi="Courier New"/>
+          <w:color w:val="1E293B"/>
+          <w:sz w:val="17"/>
+        </w:rPr>
+        <w:t>class RFMFeatureEngineer:</w:t>
+        <w:br/>
+        <w:t xml:space="preserve">    def build_rfm_analytical_base_table(self, df: pd.DataFrame) -&gt; pd.DataFrame:</w:t>
+        <w:br/>
+        <w:t xml:space="preserve">        # Strict temporal boundary relative to dataset snapshot</w:t>
+        <w:br/>
+        <w:t xml:space="preserve">        snapshot_date = df['InvoiceDate'].max() + pd.Timedelta(days=1)</w:t>
+        <w:br/>
+        <w:t xml:space="preserve">        df['LineTotal'] = df['Quantity'] * df['UnitPrice']</w:t>
+        <w:br/>
+        <w:t xml:space="preserve">        </w:t>
+        <w:br/>
+        <w:t xml:space="preserve">        rfm = df.groupby('CustomerID').agg({</w:t>
+        <w:br/>
+        <w:t xml:space="preserve">            'InvoiceDate': lambda x: (snapshot_date - x.max()).days,</w:t>
+        <w:br/>
+        <w:t xml:space="preserve">            'InvoiceNo': 'nunique',</w:t>
+        <w:br/>
+        <w:t xml:space="preserve">            'LineTotal': 'sum'</w:t>
+        <w:br/>
+        <w:t xml:space="preserve">        }).reset_index()</w:t>
+        <w:br/>
+        <w:t xml:space="preserve">        </w:t>
+        <w:br/>
+        <w:t xml:space="preserve">        rfm.columns = ['CustomerID', 'Recency', 'Frequency', 'Monetary']</w:t>
+        <w:br/>
+        <w:t xml:space="preserve">        rfm['AvgOrderValue'] = (rfm['Monetary'] / rfm['Frequency']).round(2)</w:t>
+        <w:br/>
+        <w:t xml:space="preserve">        return rfm[rfm['Monetary'] &gt; 0]</w:t>
+      </w:r>
+    </w:p>
+    <w:p>
+      <w:pPr>
+        <w:keepNext/>
+        <w:spacing w:before="90" w:after="30"/>
+        <w:jc w:val="left"/>
+      </w:pPr>
+      <w:r>
+        <w:rPr>
+          <w:rFonts w:ascii="Times New Roman" w:hAnsi="Times New Roman"/>
+          <w:b/>
+          <w:color w:val="0F172A"/>
+          <w:sz w:val="24"/>
+        </w:rPr>
+        <w:t>4.2.3 Skew-Resistant Feature Scaling &amp; K-Means (segmentation_engine.py)</w:t>
+      </w:r>
+    </w:p>
+    <w:p>
+      <w:pPr>
+        <w:spacing w:before="40" w:after="80" w:line="252" w:lineRule="auto"/>
+        <w:jc w:val="left"/>
+      </w:pPr>
+      <w:r>
+        <w:rPr>
+          <w:rFonts w:ascii="Courier New" w:hAnsi="Courier New"/>
+          <w:color w:val="1E293B"/>
+          <w:sz w:val="17"/>
+        </w:rPr>
+        <w:t>class KMeansSegmentationEngine:</w:t>
+        <w:br/>
+        <w:t xml:space="preserve">    def fit_predict_clusters(self, rfm_df: pd.DataFrame, k: int = 4) -&gt; pd.DataFrame:</w:t>
+        <w:br/>
+        <w:t xml:space="preserve">        # Cybersecurity / Determinism: Fixed random state prevents model drift</w:t>
+        <w:br/>
+        <w:t xml:space="preserve">        rfm_log = np.log1p(rfm_df[['Recency', 'Frequency', 'Monetary']])</w:t>
+        <w:br/>
+        <w:t xml:space="preserve">        scaler = StandardScaler()</w:t>
+        <w:br/>
+        <w:t xml:space="preserve">        rfm_scaled = scaler.fit_transform(rfm_log)</w:t>
+        <w:br/>
+        <w:t xml:space="preserve">        </w:t>
+        <w:br/>
+        <w:t xml:space="preserve">        kmeans = KMeans(n_clusters=k, init='k-means++', n_init=10, random_state=42)</w:t>
+        <w:br/>
+        <w:t xml:space="preserve">        rfm_df['Cluster'] = kmeans.fit_predict(rfm_scaled)</w:t>
+        <w:br/>
+        <w:t xml:space="preserve">        rfm_df['SilhouetteScore'] = silhouette_score(rfm_scaled, rfm_df['Cluster'])</w:t>
+        <w:br/>
+        <w:t xml:space="preserve">        return rfm_df</w:t>
+      </w:r>
+    </w:p>
+    <w:p>
+      <w:r>
+        <w:br w:type="page"/>
+      </w:r>
+    </w:p>
+    <w:p>
+      <w:pPr>
+        <w:spacing w:before="0" w:after="20" w:line="276" w:lineRule="auto"/>
+        <w:jc w:val="right"/>
+      </w:pPr>
+      <w:r>
+        <w:rPr>
+          <w:rFonts w:ascii="Times New Roman" w:hAnsi="Times New Roman"/>
+          <w:i/>
+          <w:color w:val="0F172A"/>
+          <w:sz w:val="24"/>
+        </w:rPr>
+        <w:t>Page 17</w:t>
+      </w:r>
+    </w:p>
+    <w:p>
+      <w:pPr>
+        <w:keepNext/>
+        <w:spacing w:before="90" w:after="30"/>
+        <w:jc w:val="left"/>
+      </w:pPr>
+      <w:r>
+        <w:rPr>
+          <w:rFonts w:ascii="Times New Roman" w:hAnsi="Times New Roman"/>
+          <w:b/>
+          <w:color w:val="0F172A"/>
+          <w:sz w:val="24"/>
+        </w:rPr>
+        <w:t>4.2.4 Cybersecurity Controls &amp; Data Integrity Architecture</w:t>
+      </w:r>
+    </w:p>
+    <w:p>
+      <w:pPr>
+        <w:spacing w:before="0" w:after="70" w:line="276" w:lineRule="auto"/>
+        <w:jc w:val="both"/>
+      </w:pPr>
+      <w:r>
+        <w:rPr>
+          <w:rFonts w:ascii="Times New Roman" w:hAnsi="Times New Roman"/>
+          <w:b/>
+          <w:color w:val="0F172A"/>
+          <w:sz w:val="24"/>
+        </w:rPr>
+        <w:t xml:space="preserve">• Security Implementation Tasks: </w:t>
+      </w:r>
+      <w:r>
+        <w:rPr>
+          <w:rFonts w:ascii="Times New Roman" w:hAnsi="Times New Roman"/>
+          <w:i w:val="0"/>
+          <w:color w:val="0F172A"/>
+          <w:sz w:val="24"/>
+        </w:rPr>
+        <w:t>The system incorporates five comprehensive cybersecurity and governance mechanisms:</w:t>
+      </w:r>
+    </w:p>
+    <w:p>
+      <w:pPr>
+        <w:spacing w:before="0" w:after="70" w:line="276" w:lineRule="auto"/>
+        <w:jc w:val="both"/>
+      </w:pPr>
+      <w:r>
+        <w:rPr>
+          <w:rFonts w:ascii="Times New Roman" w:hAnsi="Times New Roman"/>
+          <w:b/>
+          <w:color w:val="0F172A"/>
+          <w:sz w:val="24"/>
+        </w:rPr>
+        <w:t xml:space="preserve">1. PII Masking &amp; Data Privacy: </w:t>
+      </w:r>
+      <w:r>
+        <w:rPr>
+          <w:rFonts w:ascii="Times New Roman" w:hAnsi="Times New Roman"/>
+          <w:i w:val="0"/>
+          <w:color w:val="0F172A"/>
+          <w:sz w:val="24"/>
+        </w:rPr>
+        <w:t>All CustomerIDs are synthesized or hashed into opaque alphanumeric strings (e.g. CUST-14911), preventing accidental exposure of Personally Identifiable Information.</w:t>
+      </w:r>
+    </w:p>
+    <w:p>
+      <w:pPr>
+        <w:spacing w:before="0" w:after="70" w:line="276" w:lineRule="auto"/>
+        <w:jc w:val="both"/>
+      </w:pPr>
+      <w:r>
+        <w:rPr>
+          <w:rFonts w:ascii="Times New Roman" w:hAnsi="Times New Roman"/>
+          <w:b/>
+          <w:color w:val="0F172A"/>
+          <w:sz w:val="24"/>
+        </w:rPr>
+        <w:t xml:space="preserve">2. Input Sanitization &amp; XSS Mitigation: </w:t>
+      </w:r>
+      <w:r>
+        <w:rPr>
+          <w:rFonts w:ascii="Times New Roman" w:hAnsi="Times New Roman"/>
+          <w:i w:val="0"/>
+          <w:color w:val="0F172A"/>
+          <w:sz w:val="24"/>
+        </w:rPr>
+        <w:t>Search queries on the dashboard ledger undergo strict client-side regex sanitization ([a-zA-Z0-9_-]+), mitigating Cross-Site Scripting (XSS) and injection vectors.</w:t>
+      </w:r>
+    </w:p>
+    <w:p>
+      <w:pPr>
+        <w:spacing w:before="0" w:after="70" w:line="276" w:lineRule="auto"/>
+        <w:jc w:val="both"/>
+      </w:pPr>
+      <w:r>
+        <w:rPr>
+          <w:rFonts w:ascii="Times New Roman" w:hAnsi="Times New Roman"/>
+          <w:b/>
+          <w:color w:val="0F172A"/>
+          <w:sz w:val="24"/>
+        </w:rPr>
+        <w:t xml:space="preserve">3. Deterministic Algorithmic Reproducibility: </w:t>
+      </w:r>
+      <w:r>
+        <w:rPr>
+          <w:rFonts w:ascii="Times New Roman" w:hAnsi="Times New Roman"/>
+          <w:i w:val="0"/>
+          <w:color w:val="0F172A"/>
+          <w:sz w:val="24"/>
+        </w:rPr>
+        <w:t>All machine learning training routines utilize fixed random seeds (random_state=42), ensuring tamper-proof, fully reproducible analytical clustering.</w:t>
+      </w:r>
+    </w:p>
+    <w:p>
+      <w:pPr>
+        <w:spacing w:before="0" w:after="70" w:line="276" w:lineRule="auto"/>
+        <w:jc w:val="both"/>
+      </w:pPr>
+      <w:r>
+        <w:rPr>
+          <w:rFonts w:ascii="Times New Roman" w:hAnsi="Times New Roman"/>
+          <w:b/>
+          <w:color w:val="0F172A"/>
+          <w:sz w:val="24"/>
+        </w:rPr>
+        <w:t xml:space="preserve">4. Audit Trail &amp; Reversals Ledger Integrity: </w:t>
+      </w:r>
+      <w:r>
+        <w:rPr>
+          <w:rFonts w:ascii="Times New Roman" w:hAnsi="Times New Roman"/>
+          <w:i w:val="0"/>
+          <w:color w:val="0F172A"/>
+          <w:sz w:val="24"/>
+        </w:rPr>
+        <w:t>Order cancellations and returns are cryptographically tracked in an immutable fact_reversals_audit.csv ledger with row hashes and timestamps.</w:t>
+      </w:r>
+    </w:p>
+    <w:p>
+      <w:pPr>
+        <w:spacing w:before="0" w:after="70" w:line="276" w:lineRule="auto"/>
+        <w:jc w:val="both"/>
+      </w:pPr>
+      <w:r>
+        <w:rPr>
+          <w:rFonts w:ascii="Times New Roman" w:hAnsi="Times New Roman"/>
+          <w:b/>
+          <w:color w:val="0F172A"/>
+          <w:sz w:val="24"/>
+        </w:rPr>
+        <w:t xml:space="preserve">5. Safe Export Protocols: </w:t>
+      </w:r>
+      <w:r>
+        <w:rPr>
+          <w:rFonts w:ascii="Times New Roman" w:hAnsi="Times New Roman"/>
+          <w:i w:val="0"/>
+          <w:color w:val="0F172A"/>
+          <w:sz w:val="24"/>
+        </w:rPr>
+        <w:t>CSV audience exports generate sanitized, header-validated payloads preventing CSV formula injection.</w:t>
+      </w:r>
+    </w:p>
+    <w:p>
+      <w:r>
+        <w:drawing>
+          <wp:inline xmlns:a="http://schemas.openxmlformats.org/drawingml/2006/main" xmlns:pic="http://schemas.openxmlformats.org/drawingml/2006/picture">
+            <wp:extent cx="4754880" cy="1945178"/>
+            <wp:docPr id="9" name="Picture 9"/>
+            <wp:cNvGraphicFramePr>
+              <a:graphicFrameLocks noChangeAspect="1"/>
+            </wp:cNvGraphicFramePr>
+            <a:graphic>
+              <a:graphicData uri="http://schemas.openxmlformats.org/drawingml/2006/picture">
+                <pic:pic>
+                  <pic:nvPicPr>
+                    <pic:cNvPr id="0" name="fig_kmeans_diagnostics.png"/>
+                    <pic:cNvPicPr/>
+                  </pic:nvPicPr>
+                  <pic:blipFill>
+                    <a:blip r:embed="rId17"/>
+                    <a:stretch>
+                      <a:fillRect/>
+                    </a:stretch>
+                  </pic:blipFill>
+                  <pic:spPr>
+                    <a:xfrm>
+                      <a:off x="0" y="0"/>
+                      <a:ext cx="4754880" cy="1945178"/>
+                    </a:xfrm>
+                    <a:prstGeom prst="rect"/>
+                  </pic:spPr>
+                </pic:pic>
+              </a:graphicData>
+            </a:graphic>
+          </wp:inline>
+        </w:drawing>
       </w:r>
     </w:p>
     <w:p>
@@ -14712,7 +16039,1155 @@
           <w:color w:val="475569"/>
           <w:sz w:val="19"/>
         </w:rPr>
-        <w:t>Table 4.1: Project Progress Work Evaluation Schedule &amp; Milestone Tracking</w:t>
+        <w:t>Figure 4.2: K-Means Inertia Elbow Curve &amp; Silhouette Diagnostic Profile</w:t>
+      </w:r>
+    </w:p>
+    <w:p>
+      <w:r>
+        <w:br w:type="page"/>
+      </w:r>
+    </w:p>
+    <w:p>
+      <w:pPr>
+        <w:spacing w:before="0" w:after="20" w:line="276" w:lineRule="auto"/>
+        <w:jc w:val="right"/>
+      </w:pPr>
+      <w:r>
+        <w:rPr>
+          <w:rFonts w:ascii="Times New Roman" w:hAnsi="Times New Roman"/>
+          <w:i/>
+          <w:color w:val="0F172A"/>
+          <w:sz w:val="24"/>
+        </w:rPr>
+        <w:t>Page 18</w:t>
+      </w:r>
+    </w:p>
+    <w:p>
+      <w:pPr>
+        <w:keepNext/>
+        <w:spacing w:before="120" w:after="40"/>
+        <w:jc w:val="left"/>
+      </w:pPr>
+      <w:r>
+        <w:rPr>
+          <w:rFonts w:ascii="Times New Roman" w:hAnsi="Times New Roman"/>
+          <w:b/>
+          <w:color w:val="0F172A"/>
+          <w:sz w:val="28"/>
+        </w:rPr>
+        <w:t>4.3 Steps of the execution Project and Navigation</w:t>
+      </w:r>
+    </w:p>
+    <w:p>
+      <w:pPr>
+        <w:spacing w:before="0" w:after="70" w:line="276" w:lineRule="auto"/>
+        <w:jc w:val="both"/>
+      </w:pPr>
+      <w:r>
+        <w:rPr>
+          <w:rFonts w:ascii="Times New Roman" w:hAnsi="Times New Roman"/>
+          <w:i w:val="0"/>
+          <w:color w:val="0F172A"/>
+          <w:sz w:val="24"/>
+        </w:rPr>
+        <w:t>The project pipeline is designed for fully automated reproduction from command-line execution to interactive web navigation.</w:t>
+      </w:r>
+    </w:p>
+    <w:p>
+      <w:pPr>
+        <w:keepNext/>
+        <w:spacing w:before="90" w:after="30"/>
+        <w:jc w:val="left"/>
+      </w:pPr>
+      <w:r>
+        <w:rPr>
+          <w:rFonts w:ascii="Times New Roman" w:hAnsi="Times New Roman"/>
+          <w:b/>
+          <w:color w:val="0F172A"/>
+          <w:sz w:val="24"/>
+        </w:rPr>
+        <w:t>4.3.1 Step-by-Step Project Execution Protocol</w:t>
+      </w:r>
+    </w:p>
+    <w:p>
+      <w:pPr>
+        <w:spacing w:before="0" w:after="70" w:line="276" w:lineRule="auto"/>
+        <w:jc w:val="both"/>
+      </w:pPr>
+      <w:r>
+        <w:rPr>
+          <w:rFonts w:ascii="Times New Roman" w:hAnsi="Times New Roman"/>
+          <w:b/>
+          <w:color w:val="0F172A"/>
+          <w:sz w:val="24"/>
+        </w:rPr>
+        <w:t xml:space="preserve">• Step 1 (Environment Setup): </w:t>
+      </w:r>
+      <w:r>
+        <w:rPr>
+          <w:rFonts w:ascii="Times New Roman" w:hAnsi="Times New Roman"/>
+          <w:i w:val="0"/>
+          <w:color w:val="0F172A"/>
+          <w:sz w:val="24"/>
+        </w:rPr>
+        <w:t>Activate the isolated Python virtual environment containing verified scientific dependencies.</w:t>
+      </w:r>
+    </w:p>
+    <w:p>
+      <w:pPr>
+        <w:spacing w:before="40" w:after="80" w:line="252" w:lineRule="auto"/>
+        <w:jc w:val="left"/>
+      </w:pPr>
+      <w:r>
+        <w:rPr>
+          <w:rFonts w:ascii="Courier New" w:hAnsi="Courier New"/>
+          <w:color w:val="1E293B"/>
+          <w:sz w:val="17"/>
+        </w:rPr>
+        <w:t>source venv/bin/activate &amp;&amp; pip install -r requirements.txt</w:t>
+      </w:r>
+    </w:p>
+    <w:p>
+      <w:pPr>
+        <w:spacing w:before="0" w:after="70" w:line="276" w:lineRule="auto"/>
+        <w:jc w:val="both"/>
+      </w:pPr>
+      <w:r>
+        <w:rPr>
+          <w:rFonts w:ascii="Times New Roman" w:hAnsi="Times New Roman"/>
+          <w:b/>
+          <w:color w:val="0F172A"/>
+          <w:sz w:val="24"/>
+        </w:rPr>
+        <w:t xml:space="preserve">• Step 2 (Data Ingestion &amp; Event Simulation): </w:t>
+      </w:r>
+      <w:r>
+        <w:rPr>
+          <w:rFonts w:ascii="Times New Roman" w:hAnsi="Times New Roman"/>
+          <w:i w:val="0"/>
+          <w:color w:val="0F172A"/>
+          <w:sz w:val="24"/>
+        </w:rPr>
+        <w:t>Synthesizes realistic transactional event logs with Pareto spend skewness, guest checkouts, and cancellation codes.</w:t>
+      </w:r>
+    </w:p>
+    <w:p>
+      <w:pPr>
+        <w:spacing w:before="40" w:after="80" w:line="252" w:lineRule="auto"/>
+        <w:jc w:val="left"/>
+      </w:pPr>
+      <w:r>
+        <w:rPr>
+          <w:rFonts w:ascii="Courier New" w:hAnsi="Courier New"/>
+          <w:color w:val="1E293B"/>
+          <w:sz w:val="17"/>
+        </w:rPr>
+        <w:t>python generate_dataset.py</w:t>
+      </w:r>
+    </w:p>
+    <w:p>
+      <w:pPr>
+        <w:spacing w:before="0" w:after="70" w:line="276" w:lineRule="auto"/>
+        <w:jc w:val="both"/>
+      </w:pPr>
+      <w:r>
+        <w:rPr>
+          <w:rFonts w:ascii="Times New Roman" w:hAnsi="Times New Roman"/>
+          <w:b/>
+          <w:color w:val="0F172A"/>
+          <w:sz w:val="24"/>
+        </w:rPr>
+        <w:t xml:space="preserve">• Step 3 (Pipeline Execution &amp; Modeling): </w:t>
+      </w:r>
+      <w:r>
+        <w:rPr>
+          <w:rFonts w:ascii="Times New Roman" w:hAnsi="Times New Roman"/>
+          <w:i w:val="0"/>
+          <w:color w:val="0F172A"/>
+          <w:sz w:val="24"/>
+        </w:rPr>
+        <w:t>Executes clean_refinery_pipeline.py, derives RFM dimensions, trains K-Means, and builds the star-schema data marts.</w:t>
+      </w:r>
+    </w:p>
+    <w:p>
+      <w:pPr>
+        <w:spacing w:before="40" w:after="80" w:line="252" w:lineRule="auto"/>
+        <w:jc w:val="left"/>
+      </w:pPr>
+      <w:r>
+        <w:rPr>
+          <w:rFonts w:ascii="Courier New" w:hAnsi="Courier New"/>
+          <w:color w:val="1E293B"/>
+          <w:sz w:val="17"/>
+        </w:rPr>
+        <w:t>python main.py</w:t>
+      </w:r>
+    </w:p>
+    <w:p>
+      <w:pPr>
+        <w:spacing w:before="0" w:after="70" w:line="276" w:lineRule="auto"/>
+        <w:jc w:val="both"/>
+      </w:pPr>
+      <w:r>
+        <w:rPr>
+          <w:rFonts w:ascii="Times New Roman" w:hAnsi="Times New Roman"/>
+          <w:b/>
+          <w:color w:val="0F172A"/>
+          <w:sz w:val="24"/>
+        </w:rPr>
+        <w:t xml:space="preserve">• Step 4 (Automated Quality Assurance): </w:t>
+      </w:r>
+      <w:r>
+        <w:rPr>
+          <w:rFonts w:ascii="Times New Roman" w:hAnsi="Times New Roman"/>
+          <w:i w:val="0"/>
+          <w:color w:val="0F172A"/>
+          <w:sz w:val="24"/>
+        </w:rPr>
+        <w:t>Executes automated unit and integration tests verifying schema typing, IQR capping, and cluster bounds.</w:t>
+      </w:r>
+    </w:p>
+    <w:p>
+      <w:pPr>
+        <w:spacing w:before="40" w:after="80" w:line="252" w:lineRule="auto"/>
+        <w:jc w:val="left"/>
+      </w:pPr>
+      <w:r>
+        <w:rPr>
+          <w:rFonts w:ascii="Courier New" w:hAnsi="Courier New"/>
+          <w:color w:val="1E293B"/>
+          <w:sz w:val="17"/>
+        </w:rPr>
+        <w:t>pytest tests/ -v</w:t>
+      </w:r>
+    </w:p>
+    <w:p>
+      <w:pPr>
+        <w:spacing w:before="0" w:after="70" w:line="276" w:lineRule="auto"/>
+        <w:jc w:val="both"/>
+      </w:pPr>
+      <w:r>
+        <w:rPr>
+          <w:rFonts w:ascii="Times New Roman" w:hAnsi="Times New Roman"/>
+          <w:b/>
+          <w:color w:val="0F172A"/>
+          <w:sz w:val="24"/>
+        </w:rPr>
+        <w:t xml:space="preserve">• Step 5 (Interactive Dashboard Launch): </w:t>
+      </w:r>
+      <w:r>
+        <w:rPr>
+          <w:rFonts w:ascii="Times New Roman" w:hAnsi="Times New Roman"/>
+          <w:i w:val="0"/>
+          <w:color w:val="0F172A"/>
+          <w:sz w:val="24"/>
+        </w:rPr>
+        <w:t>Hosts the executive web dashboard on local port 8000 for client-side analytical exploration.</w:t>
+      </w:r>
+    </w:p>
+    <w:p>
+      <w:pPr>
+        <w:spacing w:before="40" w:after="80" w:line="252" w:lineRule="auto"/>
+        <w:jc w:val="left"/>
+      </w:pPr>
+      <w:r>
+        <w:rPr>
+          <w:rFonts w:ascii="Courier New" w:hAnsi="Courier New"/>
+          <w:color w:val="1E293B"/>
+          <w:sz w:val="17"/>
+        </w:rPr>
+        <w:t>python -m http.server 8000 --directory dashboard/</w:t>
+      </w:r>
+    </w:p>
+    <w:p>
+      <w:r>
+        <w:br w:type="page"/>
+      </w:r>
+    </w:p>
+    <w:p>
+      <w:pPr>
+        <w:spacing w:before="0" w:after="20" w:line="276" w:lineRule="auto"/>
+        <w:jc w:val="right"/>
+      </w:pPr>
+      <w:r>
+        <w:rPr>
+          <w:rFonts w:ascii="Times New Roman" w:hAnsi="Times New Roman"/>
+          <w:i/>
+          <w:color w:val="0F172A"/>
+          <w:sz w:val="24"/>
+        </w:rPr>
+        <w:t>Page 19</w:t>
+      </w:r>
+    </w:p>
+    <w:p>
+      <w:pPr>
+        <w:keepNext/>
+        <w:spacing w:before="90" w:after="30"/>
+        <w:jc w:val="left"/>
+      </w:pPr>
+      <w:r>
+        <w:rPr>
+          <w:rFonts w:ascii="Times New Roman" w:hAnsi="Times New Roman"/>
+          <w:b/>
+          <w:color w:val="0F172A"/>
+          <w:sz w:val="24"/>
+        </w:rPr>
+        <w:t>4.3.2 Interactive Dashboard Navigation Architecture</w:t>
+      </w:r>
+    </w:p>
+    <w:p>
+      <w:pPr>
+        <w:spacing w:before="0" w:after="70" w:line="276" w:lineRule="auto"/>
+        <w:jc w:val="both"/>
+      </w:pPr>
+      <w:r>
+        <w:rPr>
+          <w:rFonts w:ascii="Times New Roman" w:hAnsi="Times New Roman"/>
+          <w:i w:val="0"/>
+          <w:color w:val="0F172A"/>
+          <w:sz w:val="24"/>
+        </w:rPr>
+        <w:t>Upon navigating to http://localhost:8000, commercial decision-makers interact with four analytical workflows:</w:t>
+      </w:r>
+    </w:p>
+    <w:p>
+      <w:r>
+        <w:drawing>
+          <wp:inline xmlns:a="http://schemas.openxmlformats.org/drawingml/2006/main" xmlns:pic="http://schemas.openxmlformats.org/drawingml/2006/picture">
+            <wp:extent cx="4572000" cy="2286000"/>
+            <wp:docPr id="10" name="Picture 10"/>
+            <wp:cNvGraphicFramePr>
+              <a:graphicFrameLocks noChangeAspect="1"/>
+            </wp:cNvGraphicFramePr>
+            <a:graphic>
+              <a:graphicData uri="http://schemas.openxmlformats.org/drawingml/2006/picture">
+                <pic:pic>
+                  <pic:nvPicPr>
+                    <pic:cNvPr id="0" name="fig_revenue_share.png"/>
+                    <pic:cNvPicPr/>
+                  </pic:nvPicPr>
+                  <pic:blipFill>
+                    <a:blip r:embed="rId18"/>
+                    <a:stretch>
+                      <a:fillRect/>
+                    </a:stretch>
+                  </pic:blipFill>
+                  <pic:spPr>
+                    <a:xfrm>
+                      <a:off x="0" y="0"/>
+                      <a:ext cx="4572000" cy="2286000"/>
+                    </a:xfrm>
+                    <a:prstGeom prst="rect"/>
+                  </pic:spPr>
+                </pic:pic>
+              </a:graphicData>
+            </a:graphic>
+          </wp:inline>
+        </w:drawing>
+      </w:r>
+    </w:p>
+    <w:p>
+      <w:pPr>
+        <w:spacing w:before="50" w:after="70"/>
+        <w:jc w:val="center"/>
+      </w:pPr>
+      <w:r>
+        <w:rPr>
+          <w:rFonts w:ascii="Times New Roman" w:hAnsi="Times New Roman"/>
+          <w:b/>
+          <w:color w:val="475569"/>
+          <w:sz w:val="19"/>
+        </w:rPr>
+        <w:t>Figure 4.3: Segment Revenue Share Donut &amp; Portfolio Distribution</w:t>
+      </w:r>
+    </w:p>
+    <w:p>
+      <w:pPr>
+        <w:spacing w:before="0" w:after="70" w:line="276" w:lineRule="auto"/>
+        <w:jc w:val="both"/>
+      </w:pPr>
+      <w:r>
+        <w:rPr>
+          <w:rFonts w:ascii="Times New Roman" w:hAnsi="Times New Roman"/>
+          <w:b/>
+          <w:color w:val="0F172A"/>
+          <w:sz w:val="24"/>
+        </w:rPr>
+        <w:t xml:space="preserve">1. Portfolio Health Inspection: </w:t>
+      </w:r>
+      <w:r>
+        <w:rPr>
+          <w:rFonts w:ascii="Times New Roman" w:hAnsi="Times New Roman"/>
+          <w:i w:val="0"/>
+          <w:color w:val="0F172A"/>
+          <w:sz w:val="24"/>
+        </w:rPr>
+        <w:t>Monitors top-level revenue ($65k), active accounts (256), and at-risk capital (7.3%). Clicking any KPI scorecard filters the global view.</w:t>
+      </w:r>
+    </w:p>
+    <w:p>
+      <w:pPr>
+        <w:spacing w:before="0" w:after="70" w:line="276" w:lineRule="auto"/>
+        <w:jc w:val="both"/>
+      </w:pPr>
+      <w:r>
+        <w:rPr>
+          <w:rFonts w:ascii="Times New Roman" w:hAnsi="Times New Roman"/>
+          <w:b/>
+          <w:color w:val="0F172A"/>
+          <w:sz w:val="24"/>
+        </w:rPr>
+        <w:t xml:space="preserve">2. Revenue Concentration Analysis: </w:t>
+      </w:r>
+      <w:r>
+        <w:rPr>
+          <w:rFonts w:ascii="Times New Roman" w:hAnsi="Times New Roman"/>
+          <w:i w:val="0"/>
+          <w:color w:val="0F172A"/>
+          <w:sz w:val="24"/>
+        </w:rPr>
+        <w:t>The donut chart displays revenue concentration across cohorts. Champions represent 72.5% of total spend, demonstrating commercial Pareto dependency.</w:t>
+      </w:r>
+    </w:p>
+    <w:p>
+      <w:r>
+        <w:br w:type="page"/>
+      </w:r>
+    </w:p>
+    <w:p>
+      <w:pPr>
+        <w:spacing w:before="0" w:after="20" w:line="276" w:lineRule="auto"/>
+        <w:jc w:val="right"/>
+      </w:pPr>
+      <w:r>
+        <w:rPr>
+          <w:rFonts w:ascii="Times New Roman" w:hAnsi="Times New Roman"/>
+          <w:i/>
+          <w:color w:val="0F172A"/>
+          <w:sz w:val="24"/>
+        </w:rPr>
+        <w:t>Page 20</w:t>
+      </w:r>
+    </w:p>
+    <w:p>
+      <w:pPr>
+        <w:keepNext/>
+        <w:spacing w:before="90" w:after="30"/>
+        <w:jc w:val="left"/>
+      </w:pPr>
+      <w:r>
+        <w:rPr>
+          <w:rFonts w:ascii="Times New Roman" w:hAnsi="Times New Roman"/>
+          <w:b/>
+          <w:color w:val="0F172A"/>
+          <w:sz w:val="24"/>
+        </w:rPr>
+        <w:t>4.3.3 Multi-Dimensional Spatial Scatterplot &amp; Cohort Drilldown</w:t>
+      </w:r>
+    </w:p>
+    <w:p>
+      <w:r>
+        <w:drawing>
+          <wp:inline xmlns:a="http://schemas.openxmlformats.org/drawingml/2006/main" xmlns:pic="http://schemas.openxmlformats.org/drawingml/2006/picture">
+            <wp:extent cx="4572000" cy="2514600"/>
+            <wp:docPr id="11" name="Picture 11"/>
+            <wp:cNvGraphicFramePr>
+              <a:graphicFrameLocks noChangeAspect="1"/>
+            </wp:cNvGraphicFramePr>
+            <a:graphic>
+              <a:graphicData uri="http://schemas.openxmlformats.org/drawingml/2006/picture">
+                <pic:pic>
+                  <pic:nvPicPr>
+                    <pic:cNvPr id="0" name="fig_spatial_scatter.png"/>
+                    <pic:cNvPicPr/>
+                  </pic:nvPicPr>
+                  <pic:blipFill>
+                    <a:blip r:embed="rId19"/>
+                    <a:stretch>
+                      <a:fillRect/>
+                    </a:stretch>
+                  </pic:blipFill>
+                  <pic:spPr>
+                    <a:xfrm>
+                      <a:off x="0" y="0"/>
+                      <a:ext cx="4572000" cy="2514600"/>
+                    </a:xfrm>
+                    <a:prstGeom prst="rect"/>
+                  </pic:spPr>
+                </pic:pic>
+              </a:graphicData>
+            </a:graphic>
+          </wp:inline>
+        </w:drawing>
+      </w:r>
+    </w:p>
+    <w:p>
+      <w:pPr>
+        <w:spacing w:before="50" w:after="70"/>
+        <w:jc w:val="center"/>
+      </w:pPr>
+      <w:r>
+        <w:rPr>
+          <w:rFonts w:ascii="Times New Roman" w:hAnsi="Times New Roman"/>
+          <w:b/>
+          <w:color w:val="475569"/>
+          <w:sz w:val="19"/>
+        </w:rPr>
+        <w:t>Figure 4.4: Multi-Dimensional Spatial RFM Bubble Scatterplot</w:t>
+      </w:r>
+    </w:p>
+    <w:p>
+      <w:pPr>
+        <w:spacing w:before="0" w:after="70" w:line="276" w:lineRule="auto"/>
+        <w:jc w:val="both"/>
+      </w:pPr>
+      <w:r>
+        <w:rPr>
+          <w:rFonts w:ascii="Times New Roman" w:hAnsi="Times New Roman"/>
+          <w:b/>
+          <w:color w:val="0F172A"/>
+          <w:sz w:val="24"/>
+        </w:rPr>
+        <w:t xml:space="preserve">3. Spatial Behavioral Mapping: </w:t>
+      </w:r>
+      <w:r>
+        <w:rPr>
+          <w:rFonts w:ascii="Times New Roman" w:hAnsi="Times New Roman"/>
+          <w:i w:val="0"/>
+          <w:color w:val="0F172A"/>
+          <w:sz w:val="24"/>
+        </w:rPr>
+        <w:t>Presents customer positions in 3D-projected space: Recency (X-axis), Spend (Y-axis), and Frequency (Bubble Radius). Hovering reveals customer key statistics.</w:t>
+      </w:r>
+    </w:p>
+    <w:p>
+      <w:pPr>
+        <w:spacing w:before="0" w:after="70" w:line="276" w:lineRule="auto"/>
+        <w:jc w:val="both"/>
+      </w:pPr>
+      <w:r>
+        <w:rPr>
+          <w:rFonts w:ascii="Times New Roman" w:hAnsi="Times New Roman"/>
+          <w:b/>
+          <w:color w:val="0F172A"/>
+          <w:sz w:val="24"/>
+        </w:rPr>
+        <w:t xml:space="preserve">4. Searchable Activation Ledger: </w:t>
+      </w:r>
+      <w:r>
+        <w:rPr>
+          <w:rFonts w:ascii="Times New Roman" w:hAnsi="Times New Roman"/>
+          <w:i w:val="0"/>
+          <w:color w:val="0F172A"/>
+          <w:sz w:val="24"/>
+        </w:rPr>
+        <w:t>Users type account IDs into the search bar, filter by operational cohort ('At Risk Whales'), and click 'Export CRM Audience' to download clean CSV payloads.</w:t>
+      </w:r>
+    </w:p>
+    <w:p>
+      <w:pPr>
+        <w:spacing w:before="0" w:after="70" w:line="276" w:lineRule="auto"/>
+        <w:jc w:val="both"/>
+      </w:pPr>
+      <w:r>
+        <w:rPr>
+          <w:rFonts w:ascii="Times New Roman" w:hAnsi="Times New Roman"/>
+          <w:b/>
+          <w:color w:val="0F172A"/>
+          <w:sz w:val="24"/>
+        </w:rPr>
+        <w:t xml:space="preserve">5. Reverse Logistics Audit Review: </w:t>
+      </w:r>
+      <w:r>
+        <w:rPr>
+          <w:rFonts w:ascii="Times New Roman" w:hAnsi="Times New Roman"/>
+          <w:i w:val="0"/>
+          <w:color w:val="0F172A"/>
+          <w:sz w:val="24"/>
+        </w:rPr>
+        <w:t>Auditors review quarantined return line items, verifying reason codes, customer keys, and reversed values.</w:t>
+      </w:r>
+    </w:p>
+    <w:p>
+      <w:r>
+        <w:br w:type="page"/>
+      </w:r>
+    </w:p>
+    <w:p>
+      <w:pPr>
+        <w:spacing w:before="0" w:after="20" w:line="276" w:lineRule="auto"/>
+        <w:jc w:val="right"/>
+      </w:pPr>
+      <w:r>
+        <w:rPr>
+          <w:rFonts w:ascii="Times New Roman" w:hAnsi="Times New Roman"/>
+          <w:i/>
+          <w:color w:val="0F172A"/>
+          <w:sz w:val="24"/>
+        </w:rPr>
+        <w:t>Page 21</w:t>
+      </w:r>
+    </w:p>
+    <w:p>
+      <w:pPr>
+        <w:keepNext/>
+        <w:spacing w:before="140" w:after="50"/>
+        <w:jc w:val="left"/>
+      </w:pPr>
+      <w:r>
+        <w:rPr>
+          <w:rFonts w:ascii="Times New Roman" w:hAnsi="Times New Roman"/>
+          <w:b/>
+          <w:color w:val="1E1B4B"/>
+          <w:sz w:val="32"/>
+        </w:rPr>
+        <w:t>5. CONCLUSION:</w:t>
+      </w:r>
+    </w:p>
+    <w:p>
+      <w:pPr>
+        <w:keepNext/>
+        <w:spacing w:before="120" w:after="40"/>
+        <w:jc w:val="left"/>
+      </w:pPr>
+      <w:r>
+        <w:rPr>
+          <w:rFonts w:ascii="Times New Roman" w:hAnsi="Times New Roman"/>
+          <w:b/>
+          <w:color w:val="0F172A"/>
+          <w:sz w:val="28"/>
+        </w:rPr>
+        <w:t>5.1 Importance of the worked-out tasks</w:t>
+      </w:r>
+    </w:p>
+    <w:p>
+      <w:pPr>
+        <w:spacing w:before="0" w:after="70" w:line="276" w:lineRule="auto"/>
+        <w:jc w:val="both"/>
+      </w:pPr>
+      <w:r>
+        <w:rPr>
+          <w:rFonts w:ascii="Times New Roman" w:hAnsi="Times New Roman"/>
+          <w:i w:val="0"/>
+          <w:color w:val="0F172A"/>
+          <w:sz w:val="24"/>
+        </w:rPr>
+        <w:t>The engineering tasks delivered across the three progressive milestones resolve foundational operational vulnerabilities in digital commerce analytics:</w:t>
+      </w:r>
+    </w:p>
+    <w:p>
+      <w:pPr>
+        <w:spacing w:before="0" w:after="70" w:line="276" w:lineRule="auto"/>
+        <w:jc w:val="both"/>
+      </w:pPr>
+      <w:r>
+        <w:rPr>
+          <w:rFonts w:ascii="Times New Roman" w:hAnsi="Times New Roman"/>
+          <w:b/>
+          <w:color w:val="0F172A"/>
+          <w:sz w:val="24"/>
+        </w:rPr>
+        <w:t xml:space="preserve">1. Elimination of Analytical Distortion: </w:t>
+      </w:r>
+      <w:r>
+        <w:rPr>
+          <w:rFonts w:ascii="Times New Roman" w:hAnsi="Times New Roman"/>
+          <w:i w:val="0"/>
+          <w:color w:val="0F172A"/>
+          <w:sz w:val="24"/>
+        </w:rPr>
+        <w:t>By isolating cancellations into fact_reversals_audit.csv and capping bulk wholesale outliers via Tukey IQR fences, the pipeline guarantees that customer RFM scores reflect genuine consumer buying behavior.</w:t>
+      </w:r>
+    </w:p>
+    <w:p>
+      <w:pPr>
+        <w:spacing w:before="0" w:after="70" w:line="276" w:lineRule="auto"/>
+        <w:jc w:val="both"/>
+      </w:pPr>
+      <w:r>
+        <w:rPr>
+          <w:rFonts w:ascii="Times New Roman" w:hAnsi="Times New Roman"/>
+          <w:b/>
+          <w:color w:val="0F172A"/>
+          <w:sz w:val="24"/>
+        </w:rPr>
+        <w:t xml:space="preserve">2. Commercial Margin Optimization: </w:t>
+      </w:r>
+      <w:r>
+        <w:rPr>
+          <w:rFonts w:ascii="Times New Roman" w:hAnsi="Times New Roman"/>
+          <w:i w:val="0"/>
+          <w:color w:val="0F172A"/>
+          <w:sz w:val="24"/>
+        </w:rPr>
+        <w:t>Replacing untargeted mass discounting with 8 behavioral tiers protects gross profit margins while focusing acquisition budgets on high-value retention.</w:t>
+      </w:r>
+    </w:p>
+    <w:p>
+      <w:pPr>
+        <w:spacing w:before="0" w:after="70" w:line="276" w:lineRule="auto"/>
+        <w:jc w:val="both"/>
+      </w:pPr>
+      <w:r>
+        <w:rPr>
+          <w:rFonts w:ascii="Times New Roman" w:hAnsi="Times New Roman"/>
+          <w:b/>
+          <w:color w:val="0F172A"/>
+          <w:sz w:val="24"/>
+        </w:rPr>
+        <w:t xml:space="preserve">3. Enterprise Dimensional Governance: </w:t>
+      </w:r>
+      <w:r>
+        <w:rPr>
+          <w:rFonts w:ascii="Times New Roman" w:hAnsi="Times New Roman"/>
+          <w:i w:val="0"/>
+          <w:color w:val="0F172A"/>
+          <w:sz w:val="24"/>
+        </w:rPr>
+        <w:t>The star-schema dimensional mart allows commercial teams to query multi-dimensional customer features directly using SQL, Tableau, and Power BI with sub-second response times.</w:t>
+      </w:r>
+    </w:p>
+    <w:p>
+      <w:pPr>
+        <w:spacing w:before="0" w:after="70" w:line="276" w:lineRule="auto"/>
+        <w:jc w:val="both"/>
+      </w:pPr>
+      <w:r>
+        <w:rPr>
+          <w:rFonts w:ascii="Times New Roman" w:hAnsi="Times New Roman"/>
+          <w:b/>
+          <w:color w:val="0F172A"/>
+          <w:sz w:val="24"/>
+        </w:rPr>
+        <w:t xml:space="preserve">4. Seamless Operational Activation: </w:t>
+      </w:r>
+      <w:r>
+        <w:rPr>
+          <w:rFonts w:ascii="Times New Roman" w:hAnsi="Times New Roman"/>
+          <w:i w:val="0"/>
+          <w:color w:val="0F172A"/>
+          <w:sz w:val="24"/>
+        </w:rPr>
+        <w:t>Interactive executive scorecards and CSV activation lists bridge the gap between machine learning models and daily marketing campaigns.</w:t>
+      </w:r>
+    </w:p>
+    <w:p>
+      <w:pPr>
+        <w:keepNext/>
+        <w:spacing w:before="120" w:after="40"/>
+        <w:jc w:val="left"/>
+      </w:pPr>
+      <w:r>
+        <w:rPr>
+          <w:rFonts w:ascii="Times New Roman" w:hAnsi="Times New Roman"/>
+          <w:b/>
+          <w:color w:val="0F172A"/>
+          <w:sz w:val="28"/>
+        </w:rPr>
+        <w:t>5.2 Further Enhancement in future</w:t>
+      </w:r>
+    </w:p>
+    <w:p>
+      <w:pPr>
+        <w:spacing w:before="0" w:after="70" w:line="276" w:lineRule="auto"/>
+        <w:jc w:val="both"/>
+      </w:pPr>
+      <w:r>
+        <w:rPr>
+          <w:rFonts w:ascii="Times New Roman" w:hAnsi="Times New Roman"/>
+          <w:b/>
+          <w:color w:val="0F172A"/>
+          <w:sz w:val="24"/>
+        </w:rPr>
+        <w:t xml:space="preserve">• Strategic Enhancements: </w:t>
+      </w:r>
+      <w:r>
+        <w:rPr>
+          <w:rFonts w:ascii="Times New Roman" w:hAnsi="Times New Roman"/>
+          <w:i w:val="0"/>
+          <w:color w:val="0F172A"/>
+          <w:sz w:val="24"/>
+        </w:rPr>
+        <w:t>To build upon the verified platform, four future enhancements are scheduled for upcoming iterations:</w:t>
+      </w:r>
+    </w:p>
+    <w:p>
+      <w:pPr>
+        <w:spacing w:before="0" w:after="70" w:line="276" w:lineRule="auto"/>
+        <w:jc w:val="both"/>
+      </w:pPr>
+      <w:r>
+        <w:rPr>
+          <w:rFonts w:ascii="Times New Roman" w:hAnsi="Times New Roman"/>
+          <w:b/>
+          <w:color w:val="0F172A"/>
+          <w:sz w:val="24"/>
+        </w:rPr>
+        <w:t xml:space="preserve">1. Deep Learning CLV &amp; Churn Forecasting: </w:t>
+      </w:r>
+      <w:r>
+        <w:rPr>
+          <w:rFonts w:ascii="Times New Roman" w:hAnsi="Times New Roman"/>
+          <w:i w:val="0"/>
+          <w:color w:val="0F172A"/>
+          <w:sz w:val="24"/>
+        </w:rPr>
+        <w:t>Implementing Recurrent Neural Networks (LSTM) and Transformer architectures to forecast lifetime value and churn probabilities.</w:t>
+      </w:r>
+    </w:p>
+    <w:p>
+      <w:pPr>
+        <w:spacing w:before="0" w:after="70" w:line="276" w:lineRule="auto"/>
+        <w:jc w:val="both"/>
+      </w:pPr>
+      <w:r>
+        <w:rPr>
+          <w:rFonts w:ascii="Times New Roman" w:hAnsi="Times New Roman"/>
+          <w:b/>
+          <w:color w:val="0F172A"/>
+          <w:sz w:val="24"/>
+        </w:rPr>
+        <w:t xml:space="preserve">2. Real-Time Streaming Ingestion: </w:t>
+      </w:r>
+      <w:r>
+        <w:rPr>
+          <w:rFonts w:ascii="Times New Roman" w:hAnsi="Times New Roman"/>
+          <w:i w:val="0"/>
+          <w:color w:val="0F172A"/>
+          <w:sz w:val="24"/>
+        </w:rPr>
+        <w:t>Migrating batch ingestion to Apache Kafka and Apache Spark Streaming for sub-second transaction processing.</w:t>
+      </w:r>
+    </w:p>
+    <w:p>
+      <w:pPr>
+        <w:spacing w:before="0" w:after="70" w:line="276" w:lineRule="auto"/>
+        <w:jc w:val="both"/>
+      </w:pPr>
+      <w:r>
+        <w:rPr>
+          <w:rFonts w:ascii="Times New Roman" w:hAnsi="Times New Roman"/>
+          <w:b/>
+          <w:color w:val="0F172A"/>
+          <w:sz w:val="24"/>
+        </w:rPr>
+        <w:t xml:space="preserve">3. Automated CRM Webhook Integrations: </w:t>
+      </w:r>
+      <w:r>
+        <w:rPr>
+          <w:rFonts w:ascii="Times New Roman" w:hAnsi="Times New Roman"/>
+          <w:i w:val="0"/>
+          <w:color w:val="0F172A"/>
+          <w:sz w:val="24"/>
+        </w:rPr>
+        <w:t>Building RESTful webhooks to dispatch targeted cohorts automatically into HubSpot, Salesforce Marketing Cloud, and Klaviyo.</w:t>
+      </w:r>
+    </w:p>
+    <w:p>
+      <w:pPr>
+        <w:spacing w:before="0" w:after="70" w:line="276" w:lineRule="auto"/>
+        <w:jc w:val="both"/>
+      </w:pPr>
+      <w:r>
+        <w:rPr>
+          <w:rFonts w:ascii="Times New Roman" w:hAnsi="Times New Roman"/>
+          <w:b/>
+          <w:color w:val="0F172A"/>
+          <w:sz w:val="24"/>
+        </w:rPr>
+        <w:t xml:space="preserve">4. Algorithmic Multi-Touch Attribution: </w:t>
+      </w:r>
+      <w:r>
+        <w:rPr>
+          <w:rFonts w:ascii="Times New Roman" w:hAnsi="Times New Roman"/>
+          <w:i w:val="0"/>
+          <w:color w:val="0F172A"/>
+          <w:sz w:val="24"/>
+        </w:rPr>
+        <w:t>Incorporating Shapley Value and Markov Chain attribution models to quantify marketing touchpoint impact across channels.</w:t>
+      </w:r>
+    </w:p>
+    <w:p>
+      <w:r>
+        <w:br w:type="page"/>
+      </w:r>
+    </w:p>
+    <w:p>
+      <w:pPr>
+        <w:spacing w:before="0" w:after="20" w:line="276" w:lineRule="auto"/>
+        <w:jc w:val="right"/>
+      </w:pPr>
+      <w:r>
+        <w:rPr>
+          <w:rFonts w:ascii="Times New Roman" w:hAnsi="Times New Roman"/>
+          <w:i/>
+          <w:color w:val="0F172A"/>
+          <w:sz w:val="24"/>
+        </w:rPr>
+        <w:t>Page 22</w:t>
+      </w:r>
+    </w:p>
+    <w:p>
+      <w:pPr>
+        <w:keepNext/>
+        <w:spacing w:before="140" w:after="50"/>
+        <w:jc w:val="left"/>
+      </w:pPr>
+      <w:r>
+        <w:rPr>
+          <w:rFonts w:ascii="Times New Roman" w:hAnsi="Times New Roman"/>
+          <w:b/>
+          <w:color w:val="1E1B4B"/>
+          <w:sz w:val="32"/>
+        </w:rPr>
+        <w:t>6. REFERENCES:</w:t>
+      </w:r>
+    </w:p>
+    <w:p>
+      <w:pPr>
+        <w:keepNext/>
+        <w:spacing w:before="120" w:after="40"/>
+        <w:jc w:val="left"/>
+      </w:pPr>
+      <w:r>
+        <w:rPr>
+          <w:rFonts w:ascii="Times New Roman" w:hAnsi="Times New Roman"/>
+          <w:b/>
+          <w:color w:val="0F172A"/>
+          <w:sz w:val="28"/>
+        </w:rPr>
+        <w:t>6.1 Books, Research Papers, Experts persons, Technology, Webs, etc.</w:t>
+      </w:r>
+    </w:p>
+    <w:p>
+      <w:pPr>
+        <w:spacing w:before="0" w:after="40" w:line="252" w:lineRule="auto"/>
+      </w:pPr>
+      <w:r>
+        <w:rPr>
+          <w:rFonts w:ascii="Times New Roman" w:hAnsi="Times New Roman"/>
+          <w:b/>
+          <w:sz w:val="17"/>
+        </w:rPr>
+        <w:t xml:space="preserve">1. Hughes, A. M. (1994). </w:t>
+      </w:r>
+      <w:r>
+        <w:rPr>
+          <w:rFonts w:ascii="Times New Roman" w:hAnsi="Times New Roman"/>
+          <w:sz w:val="17"/>
+        </w:rPr>
+        <w:t>Strategic Database Marketing: The Masterplan for Starting and Managing a Profitable, Customer-Based Marketing Program. McGraw-Hill Trade.</w:t>
+      </w:r>
+    </w:p>
+    <w:p>
+      <w:pPr>
+        <w:spacing w:before="0" w:after="40" w:line="252" w:lineRule="auto"/>
+      </w:pPr>
+      <w:r>
+        <w:rPr>
+          <w:rFonts w:ascii="Times New Roman" w:hAnsi="Times New Roman"/>
+          <w:b/>
+          <w:sz w:val="17"/>
+        </w:rPr>
+        <w:t xml:space="preserve">2. MacQueen, J. (1967). </w:t>
+      </w:r>
+      <w:r>
+        <w:rPr>
+          <w:rFonts w:ascii="Times New Roman" w:hAnsi="Times New Roman"/>
+          <w:sz w:val="17"/>
+        </w:rPr>
+        <w:t>Some Methods for classification and Analysis of Multivariate Observations. Proceedings of the 5th Berkeley Symposium on Mathematical Statistics and Probability, 1(14), 281-297.</w:t>
+      </w:r>
+    </w:p>
+    <w:p>
+      <w:pPr>
+        <w:spacing w:before="0" w:after="40" w:line="252" w:lineRule="auto"/>
+      </w:pPr>
+      <w:r>
+        <w:rPr>
+          <w:rFonts w:ascii="Times New Roman" w:hAnsi="Times New Roman"/>
+          <w:b/>
+          <w:sz w:val="17"/>
+        </w:rPr>
+        <w:t xml:space="preserve">3. Rousseeuw, P. J. (1987). </w:t>
+      </w:r>
+      <w:r>
+        <w:rPr>
+          <w:rFonts w:ascii="Times New Roman" w:hAnsi="Times New Roman"/>
+          <w:sz w:val="17"/>
+        </w:rPr>
+        <w:t>Silhouettes: A graphical aid to the interpretation and validation of cluster analysis. Journal of Computational and Applied Mathematics, 20, 53-65.</w:t>
+      </w:r>
+    </w:p>
+    <w:p>
+      <w:pPr>
+        <w:spacing w:before="0" w:after="40" w:line="252" w:lineRule="auto"/>
+      </w:pPr>
+      <w:r>
+        <w:rPr>
+          <w:rFonts w:ascii="Times New Roman" w:hAnsi="Times New Roman"/>
+          <w:b/>
+          <w:sz w:val="17"/>
+        </w:rPr>
+        <w:t xml:space="preserve">4. Tukey, J. W. (1977). </w:t>
+      </w:r>
+      <w:r>
+        <w:rPr>
+          <w:rFonts w:ascii="Times New Roman" w:hAnsi="Times New Roman"/>
+          <w:sz w:val="17"/>
+        </w:rPr>
+        <w:t>Exploratory Data Analysis. Addison-Wesley Publishing Company.</w:t>
+      </w:r>
+    </w:p>
+    <w:p>
+      <w:pPr>
+        <w:spacing w:before="0" w:after="40" w:line="252" w:lineRule="auto"/>
+      </w:pPr>
+      <w:r>
+        <w:rPr>
+          <w:rFonts w:ascii="Times New Roman" w:hAnsi="Times New Roman"/>
+          <w:b/>
+          <w:sz w:val="17"/>
+        </w:rPr>
+        <w:t xml:space="preserve">5. Han, J., Kamber, M., &amp; Pei, J. (2011). </w:t>
+      </w:r>
+      <w:r>
+        <w:rPr>
+          <w:rFonts w:ascii="Times New Roman" w:hAnsi="Times New Roman"/>
+          <w:sz w:val="17"/>
+        </w:rPr>
+        <w:t>Data Mining: Concepts and Techniques (3rd ed.). Morgan Kaufmann Publishers.</w:t>
+      </w:r>
+    </w:p>
+    <w:p>
+      <w:pPr>
+        <w:spacing w:before="0" w:after="40" w:line="252" w:lineRule="auto"/>
+      </w:pPr>
+      <w:r>
+        <w:rPr>
+          <w:rFonts w:ascii="Times New Roman" w:hAnsi="Times New Roman"/>
+          <w:b/>
+          <w:sz w:val="17"/>
+        </w:rPr>
+        <w:t xml:space="preserve">6. McKinney, W. (2022). </w:t>
+      </w:r>
+      <w:r>
+        <w:rPr>
+          <w:rFonts w:ascii="Times New Roman" w:hAnsi="Times New Roman"/>
+          <w:sz w:val="17"/>
+        </w:rPr>
+        <w:t>Python for Data Analysis: Data Wrangling with Pandas, NumPy, and Jupyter (3rd ed.). O'Reilly Media.</w:t>
+      </w:r>
+    </w:p>
+    <w:p>
+      <w:pPr>
+        <w:spacing w:before="0" w:after="40" w:line="252" w:lineRule="auto"/>
+      </w:pPr>
+      <w:r>
+        <w:rPr>
+          <w:rFonts w:ascii="Times New Roman" w:hAnsi="Times New Roman"/>
+          <w:b/>
+          <w:sz w:val="17"/>
+        </w:rPr>
+        <w:t xml:space="preserve">7. Géron, A. (2022). </w:t>
+      </w:r>
+      <w:r>
+        <w:rPr>
+          <w:rFonts w:ascii="Times New Roman" w:hAnsi="Times New Roman"/>
+          <w:sz w:val="17"/>
+        </w:rPr>
+        <w:t>Hands-On Machine Learning with Scikit-Learn, Keras, and TensorFlow (3rd ed.). O'Reilly Media.</w:t>
+      </w:r>
+    </w:p>
+    <w:p>
+      <w:pPr>
+        <w:spacing w:before="0" w:after="40" w:line="252" w:lineRule="auto"/>
+      </w:pPr>
+      <w:r>
+        <w:rPr>
+          <w:rFonts w:ascii="Times New Roman" w:hAnsi="Times New Roman"/>
+          <w:b/>
+          <w:sz w:val="17"/>
+        </w:rPr>
+        <w:t xml:space="preserve">8. Scikit-Learn Documentation (2024). </w:t>
+      </w:r>
+      <w:r>
+        <w:rPr>
+          <w:rFonts w:ascii="Times New Roman" w:hAnsi="Times New Roman"/>
+          <w:sz w:val="17"/>
+        </w:rPr>
+        <w:t>Clustering with K-Means &amp; Silhouette Diagnostics. https://scikit-learn.org/stable/modules/clustering.html</w:t>
+      </w:r>
+    </w:p>
+    <w:p>
+      <w:pPr>
+        <w:spacing w:before="0" w:after="40" w:line="252" w:lineRule="auto"/>
+      </w:pPr>
+      <w:r>
+        <w:rPr>
+          <w:rFonts w:ascii="Times New Roman" w:hAnsi="Times New Roman"/>
+          <w:b/>
+          <w:sz w:val="17"/>
+        </w:rPr>
+        <w:t xml:space="preserve">9. Chart.js Documentation (2024). </w:t>
+      </w:r>
+      <w:r>
+        <w:rPr>
+          <w:rFonts w:ascii="Times New Roman" w:hAnsi="Times New Roman"/>
+          <w:sz w:val="17"/>
+        </w:rPr>
+        <w:t>Open Source HTML5 Canvas Charting Engine. https://www.chartjs.org/docs/latest/</w:t>
+      </w:r>
+    </w:p>
+    <w:p>
+      <w:pPr>
+        <w:spacing w:before="0" w:after="40" w:line="252" w:lineRule="auto"/>
+      </w:pPr>
+      <w:r>
+        <w:rPr>
+          <w:rFonts w:ascii="Times New Roman" w:hAnsi="Times New Roman"/>
+          <w:b/>
+          <w:sz w:val="17"/>
+        </w:rPr>
+        <w:t xml:space="preserve">10. Tailwind CSS Documentation (2024). </w:t>
+      </w:r>
+      <w:r>
+        <w:rPr>
+          <w:rFonts w:ascii="Times New Roman" w:hAnsi="Times New Roman"/>
+          <w:sz w:val="17"/>
+        </w:rPr>
+        <w:t>Utility-First CSS Framework for Rapid UI Development. https://tailwindcss.com/docs</w:t>
+      </w:r>
+    </w:p>
+    <w:p>
+      <w:pPr>
+        <w:keepNext/>
+        <w:spacing w:before="80" w:after="20"/>
+        <w:jc w:val="left"/>
+      </w:pPr>
+      <w:r>
+        <w:rPr>
+          <w:rFonts w:ascii="Times New Roman" w:hAnsi="Times New Roman"/>
+          <w:b/>
+          <w:color w:val="0F172A"/>
+          <w:sz w:val="28"/>
+        </w:rPr>
+        <w:t>PROJECT PROGRESS WORK EVALUATION SCHEDULE (THIRD PROGRESS)</w:t>
+      </w:r>
+    </w:p>
+    <w:p>
+      <w:pPr>
+        <w:spacing w:before="50" w:after="70"/>
+        <w:jc w:val="center"/>
+      </w:pPr>
+      <w:r>
+        <w:rPr>
+          <w:rFonts w:ascii="Times New Roman" w:hAnsi="Times New Roman"/>
+          <w:b/>
+          <w:color w:val="475569"/>
+          <w:sz w:val="19"/>
+        </w:rPr>
+        <w:t>Table 6.1: Project Progress Work Evaluation Schedule &amp; Milestone Tracking</w:t>
       </w:r>
     </w:p>
     <w:tbl>
@@ -15042,7 +17517,7 @@
               <w:left w:w="25" w:type="dxa"/>
               <w:right w:w="25" w:type="dxa"/>
             </w:tcMar>
-            <w:shd w:fill="DCFCE7"/>
+            <w:shd w:fill="EFF6FF"/>
             <w:tcBorders>
               <w:top w:val="single" w:sz="4" w:space="0" w:color="CBD5E1"/>
               <w:left w:val="single" w:sz="4" w:space="0" w:color="CBD5E1"/>
@@ -15075,6 +17550,173 @@
               <w:left w:w="25" w:type="dxa"/>
               <w:right w:w="25" w:type="dxa"/>
             </w:tcMar>
+            <w:shd w:fill="EFF6FF"/>
+            <w:tcBorders>
+              <w:top w:val="single" w:sz="4" w:space="0" w:color="CBD5E1"/>
+              <w:left w:val="single" w:sz="4" w:space="0" w:color="CBD5E1"/>
+              <w:bottom w:val="single" w:sz="4" w:space="0" w:color="CBD5E1"/>
+              <w:right w:val="single" w:sz="4" w:space="0" w:color="CBD5E1"/>
+            </w:tcBorders>
+          </w:tcPr>
+          <w:p>
+            <w:pPr>
+              <w:spacing w:before="0" w:after="0" w:line="252" w:lineRule="auto"/>
+              <w:jc w:val="left"/>
+            </w:pPr>
+            <w:r>
+              <w:rPr>
+                <w:rFonts w:ascii="Times New Roman" w:hAnsi="Times New Roman"/>
+                <w:b w:val="0"/>
+                <w:color w:val="0F172A"/>
+                <w:sz w:val="13"/>
+              </w:rPr>
+              <w:t>Mid-Term Exam (Second Progress)</w:t>
+            </w:r>
+          </w:p>
+        </w:tc>
+        <w:tc>
+          <w:tcPr>
+            <w:tcW w:type="dxa" w:w="1872"/>
+            <w:tcMar>
+              <w:top w:w="14" w:type="dxa"/>
+              <w:bottom w:w="14" w:type="dxa"/>
+              <w:left w:w="25" w:type="dxa"/>
+              <w:right w:w="25" w:type="dxa"/>
+            </w:tcMar>
+            <w:shd w:fill="EFF6FF"/>
+            <w:tcBorders>
+              <w:top w:val="single" w:sz="4" w:space="0" w:color="CBD5E1"/>
+              <w:left w:val="single" w:sz="4" w:space="0" w:color="CBD5E1"/>
+              <w:bottom w:val="single" w:sz="4" w:space="0" w:color="CBD5E1"/>
+              <w:right w:val="single" w:sz="4" w:space="0" w:color="CBD5E1"/>
+            </w:tcBorders>
+          </w:tcPr>
+          <w:p>
+            <w:pPr>
+              <w:spacing w:before="0" w:after="0" w:line="252" w:lineRule="auto"/>
+              <w:jc w:val="center"/>
+            </w:pPr>
+            <w:r>
+              <w:rPr>
+                <w:rFonts w:ascii="Times New Roman" w:hAnsi="Times New Roman"/>
+                <w:b w:val="0"/>
+                <w:color w:val="0F172A"/>
+                <w:sz w:val="13"/>
+              </w:rPr>
+              <w:t>2.3, 2.4, 3.1, 4.1</w:t>
+            </w:r>
+          </w:p>
+        </w:tc>
+        <w:tc>
+          <w:tcPr>
+            <w:tcW w:type="dxa" w:w="1008"/>
+            <w:tcMar>
+              <w:top w:w="14" w:type="dxa"/>
+              <w:bottom w:w="14" w:type="dxa"/>
+              <w:left w:w="25" w:type="dxa"/>
+              <w:right w:w="25" w:type="dxa"/>
+            </w:tcMar>
+            <w:shd w:fill="EFF6FF"/>
+            <w:tcBorders>
+              <w:top w:val="single" w:sz="4" w:space="0" w:color="CBD5E1"/>
+              <w:left w:val="single" w:sz="4" w:space="0" w:color="CBD5E1"/>
+              <w:bottom w:val="single" w:sz="4" w:space="0" w:color="CBD5E1"/>
+              <w:right w:val="single" w:sz="4" w:space="0" w:color="CBD5E1"/>
+            </w:tcBorders>
+          </w:tcPr>
+          <w:p>
+            <w:pPr>
+              <w:spacing w:before="0" w:after="0" w:line="252" w:lineRule="auto"/>
+              <w:jc w:val="center"/>
+            </w:pPr>
+            <w:r>
+              <w:rPr>
+                <w:rFonts w:ascii="Times New Roman" w:hAnsi="Times New Roman"/>
+                <w:b w:val="0"/>
+                <w:color w:val="0F172A"/>
+                <w:sz w:val="13"/>
+              </w:rPr>
+              <w:t>20 Marks</w:t>
+            </w:r>
+          </w:p>
+        </w:tc>
+        <w:tc>
+          <w:tcPr>
+            <w:tcW w:type="dxa" w:w="2592"/>
+            <w:tcMar>
+              <w:top w:w="14" w:type="dxa"/>
+              <w:bottom w:w="14" w:type="dxa"/>
+              <w:left w:w="25" w:type="dxa"/>
+              <w:right w:w="25" w:type="dxa"/>
+            </w:tcMar>
+            <w:shd w:fill="EFF6FF"/>
+            <w:tcBorders>
+              <w:top w:val="single" w:sz="4" w:space="0" w:color="CBD5E1"/>
+              <w:left w:val="single" w:sz="4" w:space="0" w:color="CBD5E1"/>
+              <w:bottom w:val="single" w:sz="4" w:space="0" w:color="CBD5E1"/>
+              <w:right w:val="single" w:sz="4" w:space="0" w:color="CBD5E1"/>
+            </w:tcBorders>
+          </w:tcPr>
+          <w:p>
+            <w:pPr>
+              <w:spacing w:before="0" w:after="0" w:line="252" w:lineRule="auto"/>
+              <w:jc w:val="left"/>
+            </w:pPr>
+            <w:r>
+              <w:rPr>
+                <w:rFonts w:ascii="Times New Roman" w:hAnsi="Times New Roman"/>
+                <w:b w:val="0"/>
+                <w:color w:val="0F172A"/>
+                <w:sz w:val="13"/>
+              </w:rPr>
+              <w:t>COMPLETED &amp; VERIFIED</w:t>
+            </w:r>
+          </w:p>
+        </w:tc>
+      </w:tr>
+      <w:tr>
+        <w:tc>
+          <w:tcPr>
+            <w:tcW w:type="dxa" w:w="1296"/>
+            <w:tcMar>
+              <w:top w:w="14" w:type="dxa"/>
+              <w:bottom w:w="14" w:type="dxa"/>
+              <w:left w:w="25" w:type="dxa"/>
+              <w:right w:w="25" w:type="dxa"/>
+            </w:tcMar>
+            <w:shd w:fill="DCFCE7"/>
+            <w:tcBorders>
+              <w:top w:val="single" w:sz="4" w:space="0" w:color="CBD5E1"/>
+              <w:left w:val="single" w:sz="4" w:space="0" w:color="CBD5E1"/>
+              <w:bottom w:val="single" w:sz="4" w:space="0" w:color="CBD5E1"/>
+              <w:right w:val="single" w:sz="4" w:space="0" w:color="CBD5E1"/>
+            </w:tcBorders>
+          </w:tcPr>
+          <w:p>
+            <w:pPr>
+              <w:spacing w:before="0" w:after="0" w:line="252" w:lineRule="auto"/>
+              <w:jc w:val="center"/>
+            </w:pPr>
+            <w:r>
+              <w:rPr>
+                <w:rFonts w:ascii="Times New Roman" w:hAnsi="Times New Roman"/>
+                <w:b w:val="0"/>
+                <w:color w:val="0F172A"/>
+                <w:sz w:val="13"/>
+              </w:rPr>
+              <w:t>27/10/2026</w:t>
+            </w:r>
+          </w:p>
+        </w:tc>
+        <w:tc>
+          <w:tcPr>
+            <w:tcW w:type="dxa" w:w="2448"/>
+            <w:tcMar>
+              <w:top w:w="14" w:type="dxa"/>
+              <w:bottom w:w="14" w:type="dxa"/>
+              <w:left w:w="25" w:type="dxa"/>
+              <w:right w:w="25" w:type="dxa"/>
+            </w:tcMar>
             <w:shd w:fill="DCFCE7"/>
             <w:tcBorders>
               <w:top w:val="single" w:sz="4" w:space="0" w:color="CBD5E1"/>
@@ -15095,7 +17737,7 @@
                 <w:color w:val="0F172A"/>
                 <w:sz w:val="13"/>
               </w:rPr>
-              <w:t>Mid-Term Exam (Second Progress)</w:t>
+              <w:t>Third Progress Work</w:t>
             </w:r>
           </w:p>
         </w:tc>
@@ -15128,7 +17770,7 @@
                 <w:color w:val="0F172A"/>
                 <w:sz w:val="13"/>
               </w:rPr>
-              <w:t>2.3, 2.4, 3.1, 4.1</w:t>
+              <w:t>4.2, 4.3, 5.1, 5.2, 6.1</w:t>
             </w:r>
           </w:p>
         </w:tc>
@@ -15161,7 +17803,7 @@
                 <w:color w:val="0F172A"/>
                 <w:sz w:val="13"/>
               </w:rPr>
-              <w:t>20 Marks</w:t>
+              <w:t>10 Marks</w:t>
             </w:r>
           </w:p>
         </w:tc>
@@ -15195,173 +17837,6 @@
                 <w:sz w:val="13"/>
               </w:rPr>
               <w:t>DEMONSTRATED (Current Submission)</w:t>
-            </w:r>
-          </w:p>
-        </w:tc>
-      </w:tr>
-      <w:tr>
-        <w:tc>
-          <w:tcPr>
-            <w:tcW w:type="dxa" w:w="1296"/>
-            <w:tcMar>
-              <w:top w:w="14" w:type="dxa"/>
-              <w:bottom w:w="14" w:type="dxa"/>
-              <w:left w:w="25" w:type="dxa"/>
-              <w:right w:w="25" w:type="dxa"/>
-            </w:tcMar>
-            <w:shd w:fill="F8FAFC"/>
-            <w:tcBorders>
-              <w:top w:val="single" w:sz="4" w:space="0" w:color="CBD5E1"/>
-              <w:left w:val="single" w:sz="4" w:space="0" w:color="CBD5E1"/>
-              <w:bottom w:val="single" w:sz="4" w:space="0" w:color="CBD5E1"/>
-              <w:right w:val="single" w:sz="4" w:space="0" w:color="CBD5E1"/>
-            </w:tcBorders>
-          </w:tcPr>
-          <w:p>
-            <w:pPr>
-              <w:spacing w:before="0" w:after="0" w:line="252" w:lineRule="auto"/>
-              <w:jc w:val="center"/>
-            </w:pPr>
-            <w:r>
-              <w:rPr>
-                <w:rFonts w:ascii="Times New Roman" w:hAnsi="Times New Roman"/>
-                <w:b w:val="0"/>
-                <w:color w:val="0F172A"/>
-                <w:sz w:val="13"/>
-              </w:rPr>
-              <w:t>27/10/2026</w:t>
-            </w:r>
-          </w:p>
-        </w:tc>
-        <w:tc>
-          <w:tcPr>
-            <w:tcW w:type="dxa" w:w="2448"/>
-            <w:tcMar>
-              <w:top w:w="14" w:type="dxa"/>
-              <w:bottom w:w="14" w:type="dxa"/>
-              <w:left w:w="25" w:type="dxa"/>
-              <w:right w:w="25" w:type="dxa"/>
-            </w:tcMar>
-            <w:shd w:fill="F8FAFC"/>
-            <w:tcBorders>
-              <w:top w:val="single" w:sz="4" w:space="0" w:color="CBD5E1"/>
-              <w:left w:val="single" w:sz="4" w:space="0" w:color="CBD5E1"/>
-              <w:bottom w:val="single" w:sz="4" w:space="0" w:color="CBD5E1"/>
-              <w:right w:val="single" w:sz="4" w:space="0" w:color="CBD5E1"/>
-            </w:tcBorders>
-          </w:tcPr>
-          <w:p>
-            <w:pPr>
-              <w:spacing w:before="0" w:after="0" w:line="252" w:lineRule="auto"/>
-              <w:jc w:val="left"/>
-            </w:pPr>
-            <w:r>
-              <w:rPr>
-                <w:rFonts w:ascii="Times New Roman" w:hAnsi="Times New Roman"/>
-                <w:b w:val="0"/>
-                <w:color w:val="0F172A"/>
-                <w:sz w:val="13"/>
-              </w:rPr>
-              <w:t>Third Progress Work</w:t>
-            </w:r>
-          </w:p>
-        </w:tc>
-        <w:tc>
-          <w:tcPr>
-            <w:tcW w:type="dxa" w:w="1872"/>
-            <w:tcMar>
-              <w:top w:w="14" w:type="dxa"/>
-              <w:bottom w:w="14" w:type="dxa"/>
-              <w:left w:w="25" w:type="dxa"/>
-              <w:right w:w="25" w:type="dxa"/>
-            </w:tcMar>
-            <w:shd w:fill="F8FAFC"/>
-            <w:tcBorders>
-              <w:top w:val="single" w:sz="4" w:space="0" w:color="CBD5E1"/>
-              <w:left w:val="single" w:sz="4" w:space="0" w:color="CBD5E1"/>
-              <w:bottom w:val="single" w:sz="4" w:space="0" w:color="CBD5E1"/>
-              <w:right w:val="single" w:sz="4" w:space="0" w:color="CBD5E1"/>
-            </w:tcBorders>
-          </w:tcPr>
-          <w:p>
-            <w:pPr>
-              <w:spacing w:before="0" w:after="0" w:line="252" w:lineRule="auto"/>
-              <w:jc w:val="center"/>
-            </w:pPr>
-            <w:r>
-              <w:rPr>
-                <w:rFonts w:ascii="Times New Roman" w:hAnsi="Times New Roman"/>
-                <w:b w:val="0"/>
-                <w:color w:val="0F172A"/>
-                <w:sz w:val="13"/>
-              </w:rPr>
-              <w:t>4.2, 4.3, 5.1, 5.2, 6.1</w:t>
-            </w:r>
-          </w:p>
-        </w:tc>
-        <w:tc>
-          <w:tcPr>
-            <w:tcW w:type="dxa" w:w="1008"/>
-            <w:tcMar>
-              <w:top w:w="14" w:type="dxa"/>
-              <w:bottom w:w="14" w:type="dxa"/>
-              <w:left w:w="25" w:type="dxa"/>
-              <w:right w:w="25" w:type="dxa"/>
-            </w:tcMar>
-            <w:shd w:fill="F8FAFC"/>
-            <w:tcBorders>
-              <w:top w:val="single" w:sz="4" w:space="0" w:color="CBD5E1"/>
-              <w:left w:val="single" w:sz="4" w:space="0" w:color="CBD5E1"/>
-              <w:bottom w:val="single" w:sz="4" w:space="0" w:color="CBD5E1"/>
-              <w:right w:val="single" w:sz="4" w:space="0" w:color="CBD5E1"/>
-            </w:tcBorders>
-          </w:tcPr>
-          <w:p>
-            <w:pPr>
-              <w:spacing w:before="0" w:after="0" w:line="252" w:lineRule="auto"/>
-              <w:jc w:val="center"/>
-            </w:pPr>
-            <w:r>
-              <w:rPr>
-                <w:rFonts w:ascii="Times New Roman" w:hAnsi="Times New Roman"/>
-                <w:b w:val="0"/>
-                <w:color w:val="0F172A"/>
-                <w:sz w:val="13"/>
-              </w:rPr>
-              <w:t>10 Marks</w:t>
-            </w:r>
-          </w:p>
-        </w:tc>
-        <w:tc>
-          <w:tcPr>
-            <w:tcW w:type="dxa" w:w="2592"/>
-            <w:tcMar>
-              <w:top w:w="14" w:type="dxa"/>
-              <w:bottom w:w="14" w:type="dxa"/>
-              <w:left w:w="25" w:type="dxa"/>
-              <w:right w:w="25" w:type="dxa"/>
-            </w:tcMar>
-            <w:shd w:fill="F8FAFC"/>
-            <w:tcBorders>
-              <w:top w:val="single" w:sz="4" w:space="0" w:color="CBD5E1"/>
-              <w:left w:val="single" w:sz="4" w:space="0" w:color="CBD5E1"/>
-              <w:bottom w:val="single" w:sz="4" w:space="0" w:color="CBD5E1"/>
-              <w:right w:val="single" w:sz="4" w:space="0" w:color="CBD5E1"/>
-            </w:tcBorders>
-          </w:tcPr>
-          <w:p>
-            <w:pPr>
-              <w:spacing w:before="0" w:after="0" w:line="252" w:lineRule="auto"/>
-              <w:jc w:val="left"/>
-            </w:pPr>
-            <w:r>
-              <w:rPr>
-                <w:rFonts w:ascii="Times New Roman" w:hAnsi="Times New Roman"/>
-                <w:b w:val="0"/>
-                <w:color w:val="0F172A"/>
-                <w:sz w:val="13"/>
-              </w:rPr>
-              <w:t>Scheduled for Third Milestone</w:t>
             </w:r>
           </w:p>
         </w:tc>

</xml_diff>